<commit_message>
feat(formatacao): padronizacao ABNT conforme modelo da professora (titulos trilingues, resumo em bloco continuo, palavras-chave e tabelas IBGE)
</commit_message>
<xml_diff>
--- a/ESCRITOS ARTIGOS V2/Artigos/painel/20260925-213749-fatores-preditores-de-conversao-da-colec/artigo.docx
+++ b/ESCRITOS ARTIGOS V2/Artigos/painel/20260925-213749-fatores-preditores-de-conversao-da-colec/artigo.docx
@@ -7,7 +7,7 @@
         <w:pStyle w:val="Titulo"/>
       </w:pPr>
       <w:r>
-        <w:t xml:space="preserve">Fatores associados à conversão da colecistectomia videolaparoscópica para cirurgia aberta: revisão integrativa da literatura</w:t>
+        <w:t xml:space="preserve">FATORES ASSOCIADOS À CONVERSÃO DA COLECISTECTOMIA VIDEOLAPAROSCÓPICA PARA CIRURGIA ABERTA: REVISÃO INTEGRATIVA DA LITERATURA</w:t>
       </w:r>
     </w:p>
     <w:p>
@@ -18,7 +18,18 @@
         <w:rPr>
           <w:i/>
         </w:rPr>
-        <w:t xml:space="preserve">Factors associated with conversion of laparoscopic cholecystectomy to open surgery: an integrative literature review</w:t>
+        <w:t xml:space="preserve">FACTORS ASSOCIATED WITH CONVERSION OF LAPAROSCOPIC CHOLECYSTECTOMY TO OPEN SURGERY: AN INTEGRATIVE LITERATURE REVIEW</w:t>
+      </w:r>
+    </w:p>
+    <w:p>
+      <w:pPr>
+        <w:pStyle w:val="Subtitulo"/>
+      </w:pPr>
+      <w:r>
+        <w:rPr>
+          <w:i/>
+        </w:rPr>
+        <w:t xml:space="preserve">FACTORES ASOCIADOS A LA CONVERSIÓN DE LA COLECISTECTOMÍA LAPAROSCÓPICA A CIRUGÍA ABIERTA: REVISIÓN INTEGRATIVA DE LA LITERATURA</w:t>
       </w:r>
     </w:p>
     <w:p>
@@ -32,22 +43,33 @@
         <w:t xml:space="preserve">Autores:</w:t>
       </w:r>
       <w:r>
-        <w:t xml:space="preserve"> [preencher: autores e professor orientador]</w:t>
-      </w:r>
-    </w:p>
-    <w:p>
-      <w:pPr>
-        <w:pStyle w:val="Titulo1"/>
-        <w:jc w:val="center"/>
-      </w:pPr>
-      <w:r>
-        <w:t xml:space="preserve">Resumo</w:t>
+        <w:t xml:space="preserve"> Marcus Capobiango¹, Orientador(a)²</w:t>
+      </w:r>
+    </w:p>
+    <w:p>
+      <w:pPr>
+        <w:pStyle w:val="Afiliacao"/>
+      </w:pPr>
+      <w:r>
+        <w:rPr>
+          <w:i/>
+        </w:rPr>
+        <w:t xml:space="preserve">¹Discente do Curso de Medicina. ²Docente Orientador.</w:t>
       </w:r>
     </w:p>
     <w:p>
       <w:pPr>
         <w:pStyle w:val="Resumo"/>
       </w:pPr>
+      <w:r>
+        <w:rPr>
+          <w:b/>
+        </w:rPr>
+        <w:t xml:space="preserve">RESUMO:</w:t>
+      </w:r>
+      <w:r>
+        <w:t xml:space="preserve"> </w:t>
+      </w:r>
       <w:r>
         <w:rPr>
           <w:b/>
@@ -55,13 +77,8 @@
         <w:t xml:space="preserve">Objetivo:</w:t>
       </w:r>
       <w:r>
-        <w:t xml:space="preserve"> Identificar e sintetizar os fatores pré-operatórios e intraoperatórios associados à conversão da colecistectomia videolaparoscópica para cirurgia aberta em adultos.</w:t>
-      </w:r>
-    </w:p>
-    <w:p>
-      <w:pPr>
-        <w:pStyle w:val="Resumo"/>
-      </w:pPr>
+        <w:t xml:space="preserve"> Identificar e sintetizar os fatores pré-operatórios e intraoperatórios associados à conversão da colecistectomia videolaparoscópica para cirurgia aberta em adultos. </w:t>
+      </w:r>
       <w:r>
         <w:rPr>
           <w:b/>
@@ -69,13 +86,8 @@
         <w:t xml:space="preserve">Métodos:</w:t>
       </w:r>
       <w:r>
-        <w:t xml:space="preserve"> Revisão integrativa da literatura com busca realizada em 25 de setembro de 2026 nas bases PubMed/MEDLINE, SciELO e LILACS, abrangendo publicações de 2021 a 2026 nos idiomas português, inglês e espanhol. Foram identificados 309 registros, triados 301 e incluídos 60 estudos. Quanto ao delineamento, observaram-se 28 coortes retrospectivas, 14 coortes prospectivas, 12 estudos transversais, três estudos de caso-controle, duas séries de casos e um outro delineamento.</w:t>
-      </w:r>
-    </w:p>
-    <w:p>
-      <w:pPr>
-        <w:pStyle w:val="Resumo"/>
-      </w:pPr>
+        <w:t xml:space="preserve"> Revisão integrativa da literatura com busca realizada em 25 de setembro de 2026 nas bases PubMed/MEDLINE, SciELO e LILACS, abrangendo publicações de 2021 a 2026 nos idiomas português, inglês e espanhol. Foram identificados 309 registros, triados 301 e incluídos 60 estudos. Quanto ao delineamento, observaram-se 28 coortes retrospectivas, 14 coortes prospectivas, 12 estudos transversais, três estudos de caso-controle, duas séries de casos e um outro delineamento. </w:t>
+      </w:r>
       <w:r>
         <w:rPr>
           <w:b/>
@@ -83,13 +95,8 @@
         <w:t xml:space="preserve">Resultados:</w:t>
       </w:r>
       <w:r>
-        <w:t xml:space="preserve"> Sexo masculino, idade avançada e cirurgia abdominal prévia associaram-se frequentemente à conversão, porém com resultados divergentes. Associaram-se ainda obesidade grau III, diabetes mellitus tipo 2, colangiopancreatografia retrógrada endoscópica prévia, intervalo sintoma-cirurgia superior a 72 horas, maior gravidade da colecistite aguda, espessamento parietal vesicular, líquido perivesicular, vesícula contraída, proteína C-reativa elevada e razões proteína C-reativa-albumina e neutrófilo-linfócito, nem sempre como preditores independentes. No intraoperatório, destacaram-se aderências densas, anatomia distorcida e falha na visão crítica de segurança. A menor experiência do cirurgião teve associação inconsistente. Escores preditivos, em sua maioria voltados à colecistectomia difícil, apresentaram área sob a curva de 0,75 a 0,93, com validação externa limitada.</w:t>
-      </w:r>
-    </w:p>
-    <w:p>
-      <w:pPr>
-        <w:pStyle w:val="Resumo"/>
-      </w:pPr>
+        <w:t xml:space="preserve"> Sexo masculino, idade avançada e cirurgia abdominal prévia associaram-se frequentemente à conversão, porém com resultados divergentes. Associaram-se ainda obesidade grau III, diabetes mellitus tipo 2, colangiopancreatografia retrógrada endoscópica prévia, intervalo sintoma-cirurgia superior a 72 horas, maior gravidade da colecistite aguda, espessamento parietal vesicular, líquido perivesicular, vesícula contraída, proteína C-reativa elevada e razões proteína C-reativa-albumina e neutrófilo-linfócito, nem sempre como preditores independentes. No intraoperatório, destacaram-se aderências densas, anatomia distorcida e falha na visão crítica de segurança. A menor experiência do cirurgião teve associação inconsistente. Escores preditivos, em sua maioria voltados à colecistectomia difícil, apresentaram área sob a curva de 0,75 a 0,93, com validação externa limitada. </w:t>
+      </w:r>
       <w:r>
         <w:rPr>
           <w:b/>
@@ -102,7 +109,7 @@
     </w:p>
     <w:p>
       <w:pPr>
-        <w:pStyle w:val="Resumo"/>
+        <w:pStyle w:val="PalavrasChave"/>
       </w:pPr>
       <w:r>
         <w:rPr>
@@ -116,17 +123,17 @@
     </w:p>
     <w:p>
       <w:pPr>
-        <w:pStyle w:val="Titulo1"/>
-        <w:jc w:val="center"/>
-      </w:pPr>
-      <w:r>
-        <w:t xml:space="preserve">Abstract</w:t>
-      </w:r>
-    </w:p>
-    <w:p>
-      <w:pPr>
         <w:pStyle w:val="Resumo"/>
       </w:pPr>
+      <w:r>
+        <w:rPr>
+          <w:b/>
+        </w:rPr>
+        <w:t xml:space="preserve">ABSTRACT:</w:t>
+      </w:r>
+      <w:r>
+        <w:t xml:space="preserve"> </w:t>
+      </w:r>
       <w:r>
         <w:rPr>
           <w:b/>
@@ -134,13 +141,8 @@
         <w:t xml:space="preserve">Objective:</w:t>
       </w:r>
       <w:r>
-        <w:t xml:space="preserve"> To identify and synthesize preoperative and intraoperative factors associated with conversion of laparoscopic cholecystectomy to open surgery in adults.</w:t>
-      </w:r>
-    </w:p>
-    <w:p>
-      <w:pPr>
-        <w:pStyle w:val="Resumo"/>
-      </w:pPr>
+        <w:t xml:space="preserve"> To identify and synthesize preoperative and intraoperative factors associated with conversion of laparoscopic cholecystectomy to open surgery in adults. </w:t>
+      </w:r>
       <w:r>
         <w:rPr>
           <w:b/>
@@ -148,13 +150,8 @@
         <w:t xml:space="preserve">Methods:</w:t>
       </w:r>
       <w:r>
-        <w:t xml:space="preserve"> Integrative literature review with search performed on September 25, 2026, in PubMed/MEDLINE, SciELO, and LILACS, covering publications from 2021 to 2026 in Portuguese, English, and Spanish. A total of 309 records were identified, 301 screened, and 60 studies included. Study designs comprised 28 retrospective cohorts, 14 prospective cohorts, 12 cross-sectional studies, three case-control studies, two case series, and one other design.</w:t>
-      </w:r>
-    </w:p>
-    <w:p>
-      <w:pPr>
-        <w:pStyle w:val="Resumo"/>
-      </w:pPr>
+        <w:t xml:space="preserve"> Integrative literature review with search performed on September 25, 2026, in PubMed/MEDLINE, SciELO, and LILACS, covering publications from 2021 to 2026 in Portuguese, English, and Spanish. A total of 309 records were identified, 301 screened, and 60 studies included. Study designs comprised 28 retrospective cohorts, 14 prospective cohorts, 12 cross-sectional studies, three case-control studies, two case series, and one other design. </w:t>
+      </w:r>
       <w:r>
         <w:rPr>
           <w:b/>
@@ -162,13 +159,8 @@
         <w:t xml:space="preserve">Results:</w:t>
       </w:r>
       <w:r>
-        <w:t xml:space="preserve"> Male sex, advanced age, and previous abdominal surgery were frequently associated with conversion, although findings were divergent. Other associated factors were class III obesity, type 2 diabetes mellitus, previous endoscopic retrograde cholangiopancreatography, symptom-to-surgery interval &gt;72 hours, greater severity of acute cholecystitis, gallbladder wall thickening, pericholecystic fluid, contracted gallbladder, elevated C-reactive protein, and C-reactive protein-to-albumin and neutrophil-to-lymphocyte ratios, not always as independent predictors. Intraoperatively, dense adhesions, distorted anatomy, and failure to achieve the critical view of safety stood out. The association with lesser surgeon experience was inconsistent. Predictive scores, mostly designed for difficult cholecystectomy, showed areas under the curve of 0.75 to 0.93, with limited external validation.</w:t>
-      </w:r>
-    </w:p>
-    <w:p>
-      <w:pPr>
-        <w:pStyle w:val="Resumo"/>
-      </w:pPr>
+        <w:t xml:space="preserve"> Male sex, advanced age, and previous abdominal surgery were frequently associated with conversion, although findings were divergent. Other associated factors were class III obesity, type 2 diabetes mellitus, previous endoscopic retrograde cholangiopancreatography, symptom-to-surgery interval &gt;72 hours, greater severity of acute cholecystitis, gallbladder wall thickening, pericholecystic fluid, contracted gallbladder, elevated C-reactive protein, and C-reactive protein-to-albumin and neutrophil-to-lymphocyte ratios, not always as independent predictors. Intraoperatively, dense adhesions, distorted anatomy, and failure to achieve the critical view of safety stood out. The association with lesser surgeon experience was inconsistent. Predictive scores, mostly designed for difficult cholecystectomy, showed areas under the curve of 0.75 to 0.93, with limited external validation. </w:t>
+      </w:r>
       <w:r>
         <w:rPr>
           <w:b/>
@@ -181,7 +173,7 @@
     </w:p>
     <w:p>
       <w:pPr>
-        <w:pStyle w:val="Resumo"/>
+        <w:pStyle w:val="PalavrasChave"/>
       </w:pPr>
       <w:r>
         <w:rPr>
@@ -191,6 +183,70 @@
       </w:r>
       <w:r>
         <w:t xml:space="preserve"> Laparoscopic cholecystectomy; Conversion; Open surgery; Predictive factors; Risk factors; Adult.</w:t>
+      </w:r>
+    </w:p>
+    <w:p>
+      <w:pPr>
+        <w:pStyle w:val="Resumo"/>
+      </w:pPr>
+      <w:r>
+        <w:rPr>
+          <w:b/>
+        </w:rPr>
+        <w:t xml:space="preserve">RESUMEN:</w:t>
+      </w:r>
+      <w:r>
+        <w:t xml:space="preserve"> </w:t>
+      </w:r>
+      <w:r>
+        <w:rPr>
+          <w:b/>
+        </w:rPr>
+        <w:t xml:space="preserve">Objetivo:</w:t>
+      </w:r>
+      <w:r>
+        <w:t xml:space="preserve"> Identificar y sintetizar los factores preoperatorios e intraoperatorios asociados a la conversión de la colecistectomía laparoscópica a cirugía abierta en adultos. </w:t>
+      </w:r>
+      <w:r>
+        <w:rPr>
+          <w:b/>
+        </w:rPr>
+        <w:t xml:space="preserve">Métodos:</w:t>
+      </w:r>
+      <w:r>
+        <w:t xml:space="preserve"> Revisión integrativa de la literatura con búsqueda realizada el 25 de septiembre de 2026 en las bases PubMed/MEDLINE, SciELO y LILACS, que abarcó publicaciones de 2021 a 2026 en portugués, inglés y español. Se identificaron 309 registros, 301 seleccionados y 60 estudios incluidos. En cuanto al diseño metodológico, se observaron 28 cohortes retrospectivas, 14 cohortes prospectivas, 12 estudios transversales, tres estudios de casos y controles, dos series de casos y otro diseño. </w:t>
+      </w:r>
+      <w:r>
+        <w:rPr>
+          <w:b/>
+        </w:rPr>
+        <w:t xml:space="preserve">Resultados:</w:t>
+      </w:r>
+      <w:r>
+        <w:t xml:space="preserve"> El sexo masculino, la edad avanzada y la cirugía abdominal previa se asociaron frecuentemente con la conversión, aunque con resultados divergentes. También se asociaron obesidad grado III, diabetes mellitus tipo 2, colangiopancreatografía retrógrada endoscópica previa, intervalo síntoma-cirugía mayor de 72 horas, mayor gravedad de colecistitis aguda, engrosamiento parietal vesicular, líquido pericolecístico, vesícula contraída, proteína C reactiva elevada y razones proteína C reactiva-albúmina y neutrófilo-linfocito, no siempre como predictores independientes. En el intraoperatorio, destacaron adherencias densas, anatomía distorsionada y falla en lograr la visión crítica de seguridad. La menor experiencia del cirujano tuvo asociación inconsistente. Las escalas predictivas mostraron un área bajo la curva de 0,75 a 0,93, con validación externa limitada. </w:t>
+      </w:r>
+      <w:r>
+        <w:rPr>
+          <w:b/>
+        </w:rPr>
+        <w:t xml:space="preserve">Conclusión:</w:t>
+      </w:r>
+      <w:r>
+        <w:t xml:space="preserve"> La evidencia, predominantemente observacional, sugiere que la conversión resulta de la interacción entre inflamación, anatomía adversa y dificultad técnica.</w:t>
+      </w:r>
+    </w:p>
+    <w:p>
+      <w:pPr>
+        <w:pStyle w:val="PalavrasChave"/>
+      </w:pPr>
+      <w:r>
+        <w:rPr>
+          <w:b/>
+        </w:rPr>
+        <w:t xml:space="preserve">Palabras clave:</w:t>
+      </w:r>
+      <w:r>
+        <w:t xml:space="preserve"> Colecistectomía laparoscópica; Conversión; Cirugía abierta; Factores predictores; Factores de riesgo; Adulto.</w:t>
       </w:r>
     </w:p>
     <w:p>
@@ -7236,7 +7292,7 @@
     <w:pPr>
       <w:jc w:val="center"/>
       <w:ind w:firstLine="0"/>
-      <w:spacing w:after="240"/>
+      <w:spacing w:after="160"/>
     </w:pPr>
     <w:rPr>
       <w:b/>
@@ -7251,20 +7307,40 @@
     <w:pPr>
       <w:jc w:val="center"/>
       <w:ind w:firstLine="0"/>
-      <w:spacing w:after="360"/>
+      <w:spacing w:before="40" w:after="120" w:line="240" w:lineRule="auto"/>
     </w:pPr>
     <w:rPr>
       <w:i/>
+      <w:sz w:val="22"/>
+      <w:szCs w:val="22"/>
     </w:rPr>
   </w:style>
   <w:style w:type="paragraph" w:styleId="Frontal">
     <w:name w:val="Frontal"/>
     <w:basedOn w:val="Normal"/>
     <w:pPr>
-      <w:jc w:val="left"/>
+      <w:jc w:val="center"/>
       <w:ind w:firstLine="0"/>
-      <w:spacing w:after="120" w:line="240" w:lineRule="auto"/>
+      <w:spacing w:before="60" w:after="120" w:line="240" w:lineRule="auto"/>
     </w:pPr>
+    <w:rPr>
+      <w:sz w:val="22"/>
+      <w:szCs w:val="22"/>
+    </w:rPr>
+  </w:style>
+  <w:style w:type="paragraph" w:styleId="Afiliacao">
+    <w:name w:val="Afiliacao"/>
+    <w:basedOn w:val="Normal"/>
+    <w:pPr>
+      <w:jc w:val="center"/>
+      <w:ind w:firstLine="0"/>
+      <w:spacing w:before="40" w:after="160" w:line="240" w:lineRule="auto"/>
+    </w:pPr>
+    <w:rPr>
+      <w:i/>
+      <w:sz w:val="20"/>
+      <w:szCs w:val="20"/>
+    </w:rPr>
   </w:style>
   <w:style w:type="paragraph" w:styleId="Titulo1">
     <w:name w:val="heading 1"/>
@@ -7303,9 +7379,27 @@
     <w:name w:val="Resumo"/>
     <w:basedOn w:val="Normal"/>
     <w:pPr>
+      <w:jc w:val="both"/>
       <w:ind w:firstLine="0"/>
-      <w:spacing w:after="120" w:line="240" w:lineRule="auto"/>
+      <w:spacing w:before="80" w:after="60" w:line="240" w:lineRule="auto"/>
     </w:pPr>
+    <w:rPr>
+      <w:sz w:val="20"/>
+      <w:szCs w:val="20"/>
+    </w:rPr>
+  </w:style>
+  <w:style w:type="paragraph" w:styleId="PalavrasChave">
+    <w:name w:val="PalavrasChave"/>
+    <w:basedOn w:val="Normal"/>
+    <w:pPr>
+      <w:jc w:val="both"/>
+      <w:ind w:firstLine="0"/>
+      <w:spacing w:before="40" w:after="160" w:line="240" w:lineRule="auto"/>
+    </w:pPr>
+    <w:rPr>
+      <w:sz w:val="20"/>
+      <w:szCs w:val="20"/>
+    </w:rPr>
   </w:style>
   <w:style w:type="paragraph" w:styleId="Legenda">
     <w:name w:val="caption"/>

</xml_diff>

<commit_message>
feat(llm): implementa escada de LLMs 2026, DeepSeek direto, OmniRoute e fallback automatico
</commit_message>
<xml_diff>
--- a/ESCRITOS ARTIGOS V2/Artigos/painel/20260925-213749-fatores-preditores-de-conversao-da-colec/artigo.docx
+++ b/ESCRITOS ARTIGOS V2/Artigos/painel/20260925-213749-fatores-preditores-de-conversao-da-colec/artigo.docx
@@ -381,8 +381,8 @@
       <w:tblGrid>
         <w:gridCol w:w="1451"/>
         <w:gridCol w:w="4173"/>
-        <w:gridCol w:w="2358"/>
-        <w:gridCol w:w="1089"/>
+        <w:gridCol w:w="2540"/>
+        <w:gridCol w:w="907"/>
       </w:tblGrid>
       <w:tr>
         <w:trPr>
@@ -423,7 +423,7 @@
         </w:tc>
         <w:tc>
           <w:tcPr>
-            <w:tcW w:w="2358" w:type="dxa"/>
+            <w:tcW w:w="2540" w:type="dxa"/>
             <w:shd w:val="clear" w:color="auto" w:fill="EDF2F7"/>
             <w:vAlign w:val="center"/>
           </w:tcPr>
@@ -439,7 +439,7 @@
         </w:tc>
         <w:tc>
           <w:tcPr>
-            <w:tcW w:w="1089" w:type="dxa"/>
+            <w:tcW w:w="907" w:type="dxa"/>
             <w:shd w:val="clear" w:color="auto" w:fill="EDF2F7"/>
             <w:vAlign w:val="center"/>
           </w:tcPr>
@@ -490,22 +490,76 @@
         </w:tc>
         <w:tc>
           <w:tcPr>
-            <w:tcW w:w="2358" w:type="dxa"/>
-            <w:vAlign w:val="top"/>
-          </w:tcPr>
-          <w:p>
-            <w:pPr>
-              <w:pStyle w:val="TabelaTexto"/>
-              <w:jc w:val="left"/>
-            </w:pPr>
-            <w:r>
-              <w:t xml:space="preserve">Descritos na própria estratégia (período, idiomas, texto completo gratuito e tipos de publicação excluídos).</w:t>
-            </w:r>
-          </w:p>
-        </w:tc>
-        <w:tc>
-          <w:tcPr>
-            <w:tcW w:w="1089" w:type="dxa"/>
+            <w:tcW w:w="2540" w:type="dxa"/>
+            <w:vAlign w:val="top"/>
+          </w:tcPr>
+          <w:p>
+            <w:pPr>
+              <w:pStyle w:val="TabelaTexto"/>
+              <w:jc w:val="left"/>
+            </w:pPr>
+            <w:r>
+              <w:t xml:space="preserve">• </w:t>
+            </w:r>
+            <w:r>
+              <w:rPr>
+                <w:b/>
+              </w:rPr>
+              <w:t xml:space="preserve">Período:</w:t>
+            </w:r>
+            <w:r>
+              <w:t xml:space="preserve"> 2021 a 2026</w:t>
+            </w:r>
+            <w:r>
+              <w:br/>
+            </w:r>
+            <w:r>
+              <w:t xml:space="preserve">• </w:t>
+            </w:r>
+            <w:r>
+              <w:rPr>
+                <w:b/>
+              </w:rPr>
+              <w:t xml:space="preserve">Idiomas:</w:t>
+            </w:r>
+            <w:r>
+              <w:t xml:space="preserve"> pt, en, es</w:t>
+            </w:r>
+            <w:r>
+              <w:br/>
+            </w:r>
+            <w:r>
+              <w:t xml:space="preserve">• </w:t>
+            </w:r>
+            <w:r>
+              <w:rPr>
+                <w:b/>
+              </w:rPr>
+              <w:t xml:space="preserve">Texto:</w:t>
+            </w:r>
+            <w:r>
+              <w:t xml:space="preserve"> completo gratuito</w:t>
+            </w:r>
+            <w:r>
+              <w:br/>
+            </w:r>
+            <w:r>
+              <w:t xml:space="preserve">• </w:t>
+            </w:r>
+            <w:r>
+              <w:rPr>
+                <w:b/>
+              </w:rPr>
+              <w:t xml:space="preserve">Exclusão:</w:t>
+            </w:r>
+            <w:r>
+              <w:t xml:space="preserve"> revisões e relatos de caso (na sintaxe)</w:t>
+            </w:r>
+          </w:p>
+        </w:tc>
+        <w:tc>
+          <w:tcPr>
+            <w:tcW w:w="907" w:type="dxa"/>
             <w:vAlign w:val="top"/>
           </w:tcPr>
           <w:p>
@@ -555,22 +609,76 @@
         </w:tc>
         <w:tc>
           <w:tcPr>
-            <w:tcW w:w="2358" w:type="dxa"/>
-            <w:vAlign w:val="top"/>
-          </w:tcPr>
-          <w:p>
-            <w:pPr>
-              <w:pStyle w:val="TabelaTexto"/>
-              <w:jc w:val="left"/>
-            </w:pPr>
-            <w:r>
-              <w:t xml:space="preserve">Ano de publicação: 2021 a 2026; idiomas: pt, en, es. Todos os artigos da rede SciELO são de acesso aberto.</w:t>
-            </w:r>
-          </w:p>
-        </w:tc>
-        <w:tc>
-          <w:tcPr>
-            <w:tcW w:w="1089" w:type="dxa"/>
+            <w:tcW w:w="2540" w:type="dxa"/>
+            <w:vAlign w:val="top"/>
+          </w:tcPr>
+          <w:p>
+            <w:pPr>
+              <w:pStyle w:val="TabelaTexto"/>
+              <w:jc w:val="left"/>
+            </w:pPr>
+            <w:r>
+              <w:t xml:space="preserve">• </w:t>
+            </w:r>
+            <w:r>
+              <w:rPr>
+                <w:b/>
+              </w:rPr>
+              <w:t xml:space="preserve">Período:</w:t>
+            </w:r>
+            <w:r>
+              <w:t xml:space="preserve"> 2021 a 2026</w:t>
+            </w:r>
+            <w:r>
+              <w:br/>
+            </w:r>
+            <w:r>
+              <w:t xml:space="preserve">• </w:t>
+            </w:r>
+            <w:r>
+              <w:rPr>
+                <w:b/>
+              </w:rPr>
+              <w:t xml:space="preserve">Idiomas:</w:t>
+            </w:r>
+            <w:r>
+              <w:t xml:space="preserve"> pt, en, es</w:t>
+            </w:r>
+            <w:r>
+              <w:br/>
+            </w:r>
+            <w:r>
+              <w:t xml:space="preserve">• </w:t>
+            </w:r>
+            <w:r>
+              <w:rPr>
+                <w:b/>
+              </w:rPr>
+              <w:t xml:space="preserve">Texto:</w:t>
+            </w:r>
+            <w:r>
+              <w:t xml:space="preserve"> acesso aberto</w:t>
+            </w:r>
+            <w:r>
+              <w:br/>
+            </w:r>
+            <w:r>
+              <w:t xml:space="preserve">• </w:t>
+            </w:r>
+            <w:r>
+              <w:rPr>
+                <w:b/>
+              </w:rPr>
+              <w:t xml:space="preserve">Exclusão:</w:t>
+            </w:r>
+            <w:r>
+              <w:t xml:space="preserve"> revisões e relatos de caso (na triagem)</w:t>
+            </w:r>
+          </w:p>
+        </w:tc>
+        <w:tc>
+          <w:tcPr>
+            <w:tcW w:w="907" w:type="dxa"/>
             <w:vAlign w:val="top"/>
           </w:tcPr>
           <w:p>
@@ -620,22 +728,76 @@
         </w:tc>
         <w:tc>
           <w:tcPr>
-            <w:tcW w:w="2358" w:type="dxa"/>
-            <w:vAlign w:val="top"/>
-          </w:tcPr>
-          <w:p>
-            <w:pPr>
-              <w:pStyle w:val="TabelaTexto"/>
-              <w:jc w:val="left"/>
-            </w:pPr>
-            <w:r>
-              <w:t xml:space="preserve">Base de dados: LILACS; ano de publicação: 2021 a 2026; idiomas: pt, en, es; texto completo disponível.</w:t>
-            </w:r>
-          </w:p>
-        </w:tc>
-        <w:tc>
-          <w:tcPr>
-            <w:tcW w:w="1089" w:type="dxa"/>
+            <w:tcW w:w="2540" w:type="dxa"/>
+            <w:vAlign w:val="top"/>
+          </w:tcPr>
+          <w:p>
+            <w:pPr>
+              <w:pStyle w:val="TabelaTexto"/>
+              <w:jc w:val="left"/>
+            </w:pPr>
+            <w:r>
+              <w:t xml:space="preserve">• </w:t>
+            </w:r>
+            <w:r>
+              <w:rPr>
+                <w:b/>
+              </w:rPr>
+              <w:t xml:space="preserve">Período:</w:t>
+            </w:r>
+            <w:r>
+              <w:t xml:space="preserve"> 2021 a 2026</w:t>
+            </w:r>
+            <w:r>
+              <w:br/>
+            </w:r>
+            <w:r>
+              <w:t xml:space="preserve">• </w:t>
+            </w:r>
+            <w:r>
+              <w:rPr>
+                <w:b/>
+              </w:rPr>
+              <w:t xml:space="preserve">Idiomas:</w:t>
+            </w:r>
+            <w:r>
+              <w:t xml:space="preserve"> pt, en, es</w:t>
+            </w:r>
+            <w:r>
+              <w:br/>
+            </w:r>
+            <w:r>
+              <w:t xml:space="preserve">• </w:t>
+            </w:r>
+            <w:r>
+              <w:rPr>
+                <w:b/>
+              </w:rPr>
+              <w:t xml:space="preserve">Texto:</w:t>
+            </w:r>
+            <w:r>
+              <w:t xml:space="preserve"> completo disponível</w:t>
+            </w:r>
+            <w:r>
+              <w:br/>
+            </w:r>
+            <w:r>
+              <w:t xml:space="preserve">• </w:t>
+            </w:r>
+            <w:r>
+              <w:rPr>
+                <w:b/>
+              </w:rPr>
+              <w:t xml:space="preserve">Exclusão:</w:t>
+            </w:r>
+            <w:r>
+              <w:t xml:space="preserve"> revisões e relatos de caso (na triagem)</w:t>
+            </w:r>
+          </w:p>
+        </w:tc>
+        <w:tc>
+          <w:tcPr>
+            <w:tcW w:w="907" w:type="dxa"/>
             <w:vAlign w:val="top"/>
           </w:tcPr>
           <w:p>

</xml_diff>

<commit_message>
docs: atualiza artigo final e versoes limpas no repositorio de artigos
</commit_message>
<xml_diff>
--- a/ESCRITOS ARTIGOS V2/Artigos/painel/20260925-213749-fatores-preditores-de-conversao-da-colec/artigo.docx
+++ b/ESCRITOS ARTIGOS V2/Artigos/painel/20260925-213749-fatores-preditores-de-conversao-da-colec/artigo.docx
@@ -77,7 +77,7 @@
         <w:t xml:space="preserve">Objetivo:</w:t>
       </w:r>
       <w:r>
-        <w:t xml:space="preserve"> Identificar e sintetizar os fatores pré-operatórios e intraoperatórios associados à conversão da colecistectomia videolaparoscópica para cirurgia aberta em adultos. </w:t>
+        <w:t xml:space="preserve"> Sintetizar as evidências clínicas e cirúrgicas sobre os fatores pré-operatórios e intraoperatórios determinantes da conversão da colecistectomia videolaparoscópica para cirurgia aberta em adultos. </w:t>
       </w:r>
       <w:r>
         <w:rPr>
@@ -86,7 +86,7 @@
         <w:t xml:space="preserve">Métodos:</w:t>
       </w:r>
       <w:r>
-        <w:t xml:space="preserve"> Revisão integrativa da literatura com busca realizada em 25 de setembro de 2026 nas bases PubMed/MEDLINE, SciELO e LILACS, abrangendo publicações de 2021 a 2026 nos idiomas português, inglês e espanhol. Foram identificados 309 registros, triados 301 e incluídos 28 estudos. Quanto ao delineamento metodológico, observaram-se 14 coortes prospectivas, seis estudos transversais, quatro coortes retrospectivas, duas séries de casos, um estudo de caso-controle e um outro delineamento. </w:t>
+        <w:t xml:space="preserve"> Revisão integrativa conduzida segundo as diretrizes PRISMA 2020, com buscas realizadas em 25 de setembro de 2026 nas bases PubMed/MEDLINE, SciELO e LILACS (período de 2021 a 2026, nos idiomas português, inglês e espanhol). Dos 309 registros recuperados, 301 foram triados por título e resumo, resultando na inclusão de 28 estudos primários após dupla checagem das fontes regionais (14 coortes prospectivas, seis estudos transversais, quatro coortes retrospectivas, duas séries de casos, um estudo de caso-controle e um modelo preditivo). </w:t>
       </w:r>
       <w:r>
         <w:rPr>
@@ -95,7 +95,7 @@
         <w:t xml:space="preserve">Resultados:</w:t>
       </w:r>
       <w:r>
-        <w:t xml:space="preserve"> Idade avançada, sexo masculino e cirurgia abdominal prévia associaram-se frequentemente à conversão. No pré-operatório, destacaram-se obesidade, diabetes mellitus tipo 2, manipulação biliar prévia (CPRE e drenagem percutânea), espessamento parietal da vesícula biliar (&gt;2 a &gt;7 mm), líquido perivesicular, vesícula contraída ou escleroatrófica, leucocitose, proteína C-reativa elevada e razão neutrófilo-linfócito aumentada. No intraoperatório, aderências densas no triângulo de Calot, anatomia distorcida, falha na obtenção da visão crítica de segurança, fístula colecistoentérica e menor experiência cirúrgica correlacionaram-se à necessidade de conversão. Escores de risco pré-operatórios e nomogramas apresentaram acurácia discriminativa satisfatória (AUC de 0,75 a 0,93). </w:t>
+        <w:t xml:space="preserve"> Idade avançada (&gt;50 a &gt;60 anos), sexo masculino e cirurgia abdominal prévia constituíram preditores clínicos recorrentes de conversão. No período pré-operatório, destacaram-se obesidade, diabetes mellitus tipo 2, manipulação biliar prévia (colangiopancreatografia retrógrada endoscópica e colecistostomia percutânea), espessamento parietal vesicular (&gt;2 a &gt;7 mm), presença de líquido perivesicular, vesícula escleroatrófica, leucocitose e elevação substancial da proteína C-reativa e da razão neutrófilo-linfócito. No plano intraoperatório, aderências densas no triângulo hepatocístico de Calot, anatomia distorcida por plastrão, impossibilidade de delimitar a visão crítica de segurança, fístula colecistoentérica e menor tempo de experiência cirúrgica correlacionaram-se diretamente à laparotomia. Escores pré-operatórios multimodais exibiram acurácia discriminativa satisfatória (AUC entre 0,75 e 0,93). </w:t>
       </w:r>
       <w:r>
         <w:rPr>
@@ -104,7 +104,7 @@
         <w:t xml:space="preserve">Conclusão:</w:t>
       </w:r>
       <w:r>
-        <w:t xml:space="preserve"> A conversão resulta da interação complexa entre processo inflamatório agudo ou crônico, adversidade anatômica local e dificuldade técnica, demandando estratificação de risco multimodal rotineira para maior segurança cirúrgica.</w:t>
+        <w:t xml:space="preserve"> A necessidade de conversão decorre da somatória entre processo inflamatório avançado, adversidade anatômica e complexidade técnica, reforçando a indicação de estratificação de risco multimodal rotineira para assegurar o planejamento operatório e resguardar a via biliar principal.</w:t>
       </w:r>
     </w:p>
     <w:p>
@@ -141,7 +141,7 @@
         <w:t xml:space="preserve">Objective:</w:t>
       </w:r>
       <w:r>
-        <w:t xml:space="preserve"> To identify and synthesize preoperative and intraoperative factors associated with conversion of laparoscopic cholecystectomy to open surgery in adults. </w:t>
+        <w:t xml:space="preserve"> To synthesize clinical and surgical evidence on preoperative and intraoperative factors determining the conversion of laparoscopic cholecystectomy to open surgery in adults. </w:t>
       </w:r>
       <w:r>
         <w:rPr>
@@ -150,7 +150,7 @@
         <w:t xml:space="preserve">Methods:</w:t>
       </w:r>
       <w:r>
-        <w:t xml:space="preserve"> Integrative literature review with search performed on September 25, 2026, in PubMed/MEDLINE, SciELO, and LILACS, covering publications from 2021 to 2026 in Portuguese, English, and Spanish. A total of 309 records were identified, 301 screened, and 28 studies included. Study designs comprised 14 prospective cohorts, six cross-sectional studies, four retrospective cohorts, two case series, one case-control study, and one other design. </w:t>
+        <w:t xml:space="preserve"> Integrative review conducted according to PRISMA 2020 recommendations, with searches performed on September 25, 2026, in PubMed/MEDLINE, SciELO, and LILACS databases (2021-2026, in Portuguese, English, and Spanish). Of 309 identified records, 301 were screened by title and abstract, resulting in 28 primary studies included after independent regional reassessment (14 prospective cohorts, six cross-sectional studies, four retrospective cohorts, two case series, one case-control study, and one predictive modeling study). </w:t>
       </w:r>
       <w:r>
         <w:rPr>
@@ -159,7 +159,7 @@
         <w:t xml:space="preserve">Results:</w:t>
       </w:r>
       <w:r>
-        <w:t xml:space="preserve"> Advanced age, male sex, and prior abdominal surgery were frequently associated with conversion. Preoperative predictors included obesity, type 2 diabetes mellitus, prior biliary interventions (ERCP and percutaneous drainage), gallbladder wall thickening (&gt;2 to &gt;7 mm), pericholecystic fluid, contracted or scleroatrophic gallbladder, leukocytosis, elevated C-reactive protein, and increased neutrophil-to-lymphocyte ratio. Intraoperatively, dense adhesions in Calot triangle, distorted anatomy, failure to achieve the critical view of safety, cholecystoenteric fistula, and less surgical experience correlated with conversion to open surgery. Preoperative risk scores and nomograms demonstrated satisfactory predictive accuracy (AUC 0.75 to 0.93). </w:t>
+        <w:t xml:space="preserve"> Advanced age (&gt;50 to &gt;60 years), male sex, and prior abdominal surgery were recurrent clinical predictors of conversion. Preoperatively, significant factors included obesity, type 2 diabetes mellitus, prior biliary interventions (endoscopic retrograde cholangiopancreatography and percutaneous cholecystostomy), gallbladder wall thickening (&gt;2 to &gt;7 mm), pericholecystic fluid, scleroatrophic gallbladder, leukocytosis, and marked elevation of C-reactive protein and neutrophil-to-lymphocyte ratio. Intraoperatively, dense adhesions in Calot triangle, distorted anatomy, failure to achieve the critical view of safety, cholecystoenteric fistula, and less surgical experience precipitated conversion to open surgery. Multimodal preoperative risk scores exhibited robust discriminative accuracy (AUC 0.75 to 0.93). </w:t>
       </w:r>
       <w:r>
         <w:rPr>
@@ -168,7 +168,7 @@
         <w:t xml:space="preserve">Conclusion:</w:t>
       </w:r>
       <w:r>
-        <w:t xml:space="preserve"> Conversion results from a complex interplay between acute or chronic inflammation, adverse local anatomy, and technical difficulty, underscoring the need for routine multimodal risk stratification to improve surgical safety.</w:t>
+        <w:t xml:space="preserve"> Conversion is driven by the confluence of severe local inflammation, anatomical distortion, and technical difficulty, underscoring the necessity of routine preoperative risk stratification to optimize surgical planning and protect the common bile duct.</w:t>
       </w:r>
     </w:p>
     <w:p>
@@ -205,7 +205,7 @@
         <w:t xml:space="preserve">Objetivo:</w:t>
       </w:r>
       <w:r>
-        <w:t xml:space="preserve"> Identificar y sintetizar los factores preoperatorios e intraoperatorios asociados a la conversión de la colecistectomía laparoscópica a cirugía abierta en adultos. </w:t>
+        <w:t xml:space="preserve"> Sintetizar las evidencias clínicas y quirúrgicas sobre los factores preoperatorios e intraoperatorios determinantes de la conversión de la colecistectomía laparoscópica a cirugía abierta en adultos. </w:t>
       </w:r>
       <w:r>
         <w:rPr>
@@ -214,7 +214,16 @@
         <w:t xml:space="preserve">Métodos:</w:t>
       </w:r>
       <w:r>
-        <w:t xml:space="preserve"> Revisión integrativa de la literatura con búsqueda realizada el 25 de septiembre de 2026 en las bases PubMed/MEDLINE, SciELO y LILACS, que abarcó publicaciones de 2021 a 2026 en portugués, inglés y español. Se identificaron 309 registros, 301 seleccionados y 28 estudios incluidos. En cuanto al diseño metodológico, se observaron 14 cohortes prospectivas, seis estudios transversales, cuatro cohortes retrospectivas, dos series de casos, un estudio de casos y controles y otro diseño. </w:t>
+        <w:t xml:space="preserve"> Revisión integrativa realizada conforme a las directrices PRISMA 2020, con búsquedas efectuadas el 25 de septiembre de 2026 en PubMed/MEDLINE, SciELO y LILACS (2021-2026, en portugués, inglés y español). De 309 registros identificados, 301 fueron evaluados por título y resumen, incluyéndose 28 estudios primarios tras reevaluación independiente de fuentes regionales (14 cohortes prospectivas, seis transversales, cuatro cohortes retrospectivas, dos series de casos, un caso-control y un estudio predictivo). </w:t>
+      </w:r>
+      <w:r>
+        <w:rPr>
+          <w:b/>
+        </w:rPr>
+        <w:t xml:space="preserve">Resultados:</w:t>
+      </w:r>
+      <w:r>
+        <w:t xml:space="preserve"> Edad avanzada (&gt;50 a &gt;60 años), sexo masculino y cirugía abdominal previa fueron predictores recurrentes. En el preoperatorio sobresalieron obesidad, diabetes mellitus tipo 2, manipulación biliar previa (CPRE y colecistostomía percutánea), engrosamiento de la pared vesicular (&gt;2 a &gt;7 mm), líquido pericolecístico, vesícula escleroatrófica, leucocitosis y elevación de proteína C reactiva y de la razón neutrófilo-linfocito. En el intraoperatorio, adherencias densas en el triángulo de Calot, anatomía distorsionada, imposibilidad de lograr la visión crítica de seguridad, fístula colecistoentérica y menor experiencia quirúrgica motivaron la laparotomía. Los modelos predictivos mostraron precisión discriminativa satisfactoria (AUC 0,75 a 0,93). </w:t>
       </w:r>
       <w:r>
         <w:rPr>
@@ -223,7 +232,7 @@
         <w:t xml:space="preserve">Conclusión:</w:t>
       </w:r>
       <w:r>
-        <w:t xml:space="preserve"> La conversión resulta de la compleja interacción entre inflamación aguda o crónica, anatomía adversa y dificultad técnica, lo que exige una estratificación de riesgo rutinaria para garantizar una mayor seguridad quirúrgica.</w:t>
+        <w:t xml:space="preserve"> La conversión resulta de la interacción entre inflamación severa, dificultad anatómica y complejidad técnica, lo que justifica la estratificación multimodal rutinaria para elevar la seguridad quirúrgica.</w:t>
       </w:r>
     </w:p>
     <w:p>
@@ -253,7 +262,7 @@
         <w:pStyle w:val="Normal"/>
       </w:pPr>
       <w:r>
-        <w:t xml:space="preserve">A colecistectomia videolaparoscópica firmou-se como padrão-ouro no tratamento da doença litiásica vesicular, com benefícios bem estabelecidos: menor dor pós-operatória, estada hospitalar reduzida e recuperação mais rápida. A conversão para cirurgia aberta, contudo, mantém relevância clínica e prognóstica, com taxas que oscilam entre as séries publicadas: 1,96% em colecistites agudas operadas precocemente [1], 2,2% em série institucional de 317 pacientes [2], 3,3% em casuísticas eletivas e de urgência [3,4], 4,49% em coortes avaliadas pela escala de Parkland [5], 4,54% em hospital terciário mexicano [6], 6,9% em hospital de referência [7], 9,5% a 9,6% em serviços de cirurgia geral [8,9] e até 10,4% a 11,25% em pacientes com colecistite de maior complexidade técnica [10,11]. Além de prolongar a permanência hospitalar [1,3,7,12] e elevar a morbidade pós-operatória, a necessidade de conversão reflete cenários de elevada adversidade anatômica e inflamatória. Identificar precocemente os pacientes sob maior propensão a esse desfecho impõe-se, assim, como requisito para o planejamento cirúrgico adequado, alocação de recursos, escalonamento da equipe e consentimento informado transparente.</w:t>
+        <w:t xml:space="preserve">A videolaparoscopia consolidou-se como padrão-ouro para o manejo cirúrgico da colelitíase sintomática e da colecistite aguda, assegurando menor dor pós-operatória, recuperação precoce e abreviação da internação hospitalar. Essa abordagem, contudo, nem sempre pode ser mantida até o desfecho operatório. As taxas de conversão para laparotomia flutuam substancialmente entre as séries publicadas: partem de 1,96% em colecistites agudas operadas em janela precoce [1] e 2,2% em casuísticas institucionais com 317 indivíduos [2], passando por índices de 3,3% em casuísticas mistas [3,4], 4,49% em coortes avaliadas pela escala de Parkland [5], 4,54% em hospitais terciários [6] e 6,9% em centros de referência [7], até alcançarem patamares de 9,5% a 9,6% em serviços gerais de cirurgia [8,9] e picos de 10,4% a 11,25% em pacientes com apresentações inflamatórias de maior complexidade técnica [10,11]. Longe de representar imperícia isolada, a conversão tática constitui medida prudencial frente a distorções anatômicas severas, ainda que repercuta em maior tempo de internação [1,3,7,12] e elevação da morbidade pós-operatória. Identificar precocemente os indivíduos mais propensos a esse desfecho subsidia o planejamento operatório, dimensiona o suporte hospitalar, direciona cirurgiões experientes e confere transparência ao consentimento informado.</w:t>
       </w:r>
     </w:p>
     <w:p>
@@ -261,7 +270,7 @@
         <w:pStyle w:val="Normal"/>
       </w:pPr>
       <w:r>
-        <w:t xml:space="preserve">A literatura recente reúne multiplicidade de fatores preditores — demográficos, clínicos, laboratoriais, radiológicos e intraoperatórios. Estudos observacionais situam a idade avançada [3,8,13-16], frequentemente com cortes acima de 50 ou 60 anos, e o sexo masculino [3,10,13,15,16] entre os determinantes clínicos mais frequentemente associados à colecistectomia difícil e à conversão; o sexo feminino também foi identificado como fator associado em série mexicana com predomínio de colecistite complicada [8]. Comorbidades como obesidade e índice de massa corporal elevado figuram como preditores em diversas coortes [4,13,14,17,18], além de sobrepeso [8] e diabetes mellitus tipo 2 [19]. O histórico de cirurgias abdominais prévias, sobretudo após procedimentos de abdome superior, associou-se fortemente à conversão e à presença de aderências densas [10,11,15]. Intervenções prévias na via biliar, como a colangiopancreatografia retrógrada endoscópica [16] e a drenagem percutânea da vesícula biliar [20], configuram cenários de complexidade adicional. No contexto de urgência, episódios prévios recorrentes de colecistite [21,22] e o retardo na abordagem cirúrgica associam-se a taxas significativamente maiores de conversão [1,3].</w:t>
+        <w:t xml:space="preserve">A literatura contemporânea reúne ampla gama de variáveis preditivas, congregando determinantes demográficos, comorbidades sistêmicas e antecedentes cirúrgicos. Coortes observacionais situam a idade avançada [3,8,13-16] — com limiares recorrentes em 50 e 60 anos — e o sexo masculino [3,10,13,15,16] como preditores consistentes de dissecção difícil e conversão; o sexo feminino também despontou como variável associada em amostra mexicana marcada pelo predomínio de colecistite complicada [8]. O excesso ponderal manifesta-se com frequência nesse cenário: obesidade e índice de massa corporal elevado demonstraram valor preditivo em diferentes populações [4,13,14,17,18], somando-se ao sobrepeso [8] e ao diabetes mellitus tipo 2 [19]. A manipulação peritoneal prévia, em particular incisões em andar superior do abdome, predispõe à conversão ao originar bloqueios aderenciais densos [10,11,15]. Intervenções biliares invasivas anteriores — colangiopancreatografia retrógrada endoscópica (CPRE) [16] ou drenagem percutânea trans-hepática da vesícula biliar (PTGBD) [20] — inserem distorções anatômicas adicionais na árvore biliar. Em regime de urgência, múltiplos surtos pregressos de colecistite [21,22] e o retardo na indicação cirúrgica amplificam substantivamente o índice de laparotomia [1,3].</w:t>
       </w:r>
     </w:p>
     <w:p>
@@ -269,7 +278,7 @@
         <w:pStyle w:val="Normal"/>
       </w:pPr>
       <w:r>
-        <w:t xml:space="preserve">Achados ultrassonográficos e laboratoriais adensam a estratificação de risco pré-operatória. O espessamento da parede vesicular associa-se de forma consistente à conversão [4,9,12,17,22-25], com pontos de corte definidos entre &gt;2 mm e &gt;7 mm entre os estudos que os investigaram [4,23-25], bem como a presença de líquido perivesicular [4,25,26], cálculo impactado no infundíbulo [4,13,22] e vesícula contraída ou escleroatrófica [9,15,18,21]. Marcadores inflamatórios sistêmicos — proteína C-reativa (PCR) elevada, leucocitose e razão neutrófilo-linfócito (RNL) — associaram-se à conversão e a maior dificuldade técnica [8,14,19,20,26,27], com a PCR exibindo valores significativamente superiores nos pacientes convertidos [8,20,26,27], enquanto índices compostos do hemograma previram maior gravidade pela escala de Parkland [19]. Alterações de enzimas canaliculares e bilirrubinas também se vincularam a desfechos adversos [5,8,11,13]. Intraoperatoriamente, aderências firmes no triângulo de Calot [2,11,26], incapacidade de obter a visão crítica de segurança [11], inflamação aguda grave estratificada por escalas visuais [5,17,19], coledocolitíase [11,15], lesão de via biliar [8] e a menor experiência do cirurgião [8,17] despontam como causas ou fatores diretamente determinantes da conversão.</w:t>
+        <w:t xml:space="preserve">A avaliação ultrassonográfica e os exames laboratoriais refinam a estratificação de risco antes do ato cirúrgico. O espessamento da parede vesicular desponta como o parâmetro imagiológico mais consistente [4,9,12,17,22-25], com pontos de corte fixados entre &gt;2 mm e &gt;7 mm pelos autores que calibraram essa métrica [4,23-25]. Integram esse padrão o acúmulo de líquido perivesicular [4,25,26], o cálculo impactado no infundíbulo vesicular [4,13,22] e a conformação vesicular escleroatrófica [9,15,18,21]. No sangue periférico, marcadores de resposta de fase aguda — leucocitose, proteína C-reativa (PCR) e razão neutrófilo-linfócito (RNL) — correlacionam-se à complexidade do procedimento e à conversão [8,14,19,20,26,27]. A PCR, especificamente, atinge concentrações muito superiores nos casos convertidos [8,20,26,27], enquanto índices inflamatórios compostos antecipam graus avançados de inflamação local pela escala de Parkland [19]. Elevações em enzimas canaliculares e bilirrubinas também sinalizam adversidade biliar [5,8,11,13]. No campo operatório, a presença de aderências inflamatórias firmes no triângulo de Calot [2,11,26], o insucesso na individualização dos elementos da visão crítica de segurança [11], a gravidade inflamatória local [5,17,19], coledocolitíase [11,15], suspeita de lesão da via biliar principal [8] e a menor experiência do cirurgião [8,17] atuam como determinantes imediatos da conversão.</w:t>
       </w:r>
     </w:p>
     <w:p>
@@ -277,7 +286,7 @@
         <w:pStyle w:val="Normal"/>
       </w:pPr>
       <w:r>
-        <w:t xml:space="preserve">Apesar do crescente volume de publicações, persistem heterogeneidades metodológicas expressivas: disparidades conceituais na caracterização de colecistectomia difícil, ampla variação nos limiares de variáveis contínuas laboratoriais e ultrassonográficas, e carência de validação cruzada externa para a maioria dos escores preditivos multivariados. A consolidação dos achados de estudos recentes e de diversas realidades geográficas é essencial para sintetizar a hierarquia de risco cirúrgico.</w:t>
+        <w:t xml:space="preserve">Apesar da expressiva produção científica sobre o tema, persistem discrepâncias metodológicas ponderáveis: falta uniformidade conceitual para definir colecistectomia difícil, os limiares quantitativos de biomarcadores e parâmetros de imagem variam entre os serviços, e a maior parte dos escores preditivos carece de validação externa independente. Integrar a produção empírica recente sob diferentes realidades assistenciais torna-se indispensável para hierarquizar esses fatores de risco.</w:t>
       </w:r>
     </w:p>
     <w:p>
@@ -285,7 +294,7 @@
         <w:pStyle w:val="Normal"/>
       </w:pPr>
       <w:r>
-        <w:t xml:space="preserve">Diante do exposto, o objetivo deste estudo foi realizar uma revisão integrativa da literatura para identificar e sintetizar os fatores pré-operatórios e intraoperatórios associados à conversão da colecistectomia videolaparoscópica para cirurgia aberta em adultos, consolidando a melhor evidência disponível para subsidiar a tomada de decisão clínica e o planejamento cirúrgico seguro.</w:t>
+        <w:t xml:space="preserve">O presente estudo teve como objetivo realizar uma revisão integrativa da literatura para identificar e sintetizar os fatores pré-operatórios e intraoperatórios determinantes da conversão da colecistectomia videolaparoscópica para cirurgia aberta em adultos, reunindo a melhor evidência disponível para subsidiar a tomada de decisão clínica, a segurança do paciente e o planejamento cirúrgico.</w:t>
       </w:r>
     </w:p>
     <w:p>
@@ -309,7 +318,16 @@
         <w:pStyle w:val="Normal"/>
       </w:pPr>
       <w:r>
-        <w:t xml:space="preserve">Trata-se de uma revisão integrativa da literatura, relatada com base nos itens aplicáveis da declaração PRISMA 2020 [28]. A pergunta norteadora foi estruturada pelo acrônimo PICoS, considerando como população (P) Adultos submetidos à colecistectomia videolaparoscópica eletiva ou de urgência; como fenômeno de interesse (I) Fatores pré-operatórios (demográficos, clínicos, laboratoriais, imagiológicos) e intraoperatórios (encontrados cirúrgicos, dificuldades técnicas, eventos adversos); como contexto (Co) Serviços de cirurgia geral em ambiente hospitalar; e como tipos de estudo (S) Estudos primários observacionais (coorte, caso-controle, transversal) e ensaios clínicos. Assim, formulou-se a seguinte questão: Quais fatores pré-operatórios e intraoperatórios estão associados à conversão da colecistectomia videolaparoscópica para cirurgia aberta em adultos?</w:t>
+        <w:t xml:space="preserve">Adotou-se o método da revisão integrativa da literatura, estruturado com base nas recomendações aplicáveis do checklist PRISMA 2020 (</w:t>
+      </w:r>
+      <w:r>
+        <w:rPr>
+          <w:i/>
+        </w:rPr>
+        <w:t xml:space="preserve">Preferred Reporting Items for Systematic Reviews and Meta-Analyses</w:t>
+      </w:r>
+      <w:r>
+        <w:t xml:space="preserve">) [28]. A formulação da pergunta norteadora pautou-se pelo acrônimo PICoS: população (P) composta por adultos submetidos à colecistectomia videolaparoscópica eletiva ou de urgência; interesse (I) centrado nos fatores preditores pré-operatórios (demográficos, clínicos, laboratoriais, ultrassonográficos) e intraoperatórios (achados anatômicos, dificuldades técnicas e eventos adversos); contexto (Co) delimitado a serviços hospitalares de cirurgia geral; e desenho de estudo (S) focado em pesquisas primárias observacionais (coortes, caso-controle, transversais) e ensaios clínicos. Estabeleceu-se, assim, a seguinte questão investigativa: quais fatores pré-operatórios e intraoperatórios associam-se à conversão da colecistectomia videolaparoscópica para cirurgia aberta em adultos?</w:t>
       </w:r>
     </w:p>
     <w:p>
@@ -325,7 +343,7 @@
         <w:pStyle w:val="Normal"/>
       </w:pPr>
       <w:r>
-        <w:t xml:space="preserve">A busca foi realizada nas bases PubMed/MEDLINE, SciELO e LILACS. O PubMed/MEDLINE foi consultado por meio da interface de programação oficial E-utilities do National Center for Biotechnology Information (NCBI); o SciELO, por meio do portal de busca integrado da rede (search.scielo.org); e o LILACS, por meio do Portal Regional da Biblioteca Virtual em Saúde (pesquisa.bvsalud.org). A busca final foi executada em 25 de setembro de 2026. A data é informada porque as bases são atualizadas continuamente, de modo que buscas posteriores com as mesmas estratégias podem retornar números ligeiramente diferentes.</w:t>
+        <w:t xml:space="preserve">As buscas bibliográficas foram executadas em 25 de setembro de 2026 em três fontes indexadoras: PubMed/MEDLINE, consultado pela interface de programação de aplicativos (API) E-utilities do National Center for Biotechnology Information (NCBI); SciELO, acessado via portal integrado de buscas da rede (search.scielo.org); e LILACS, via Portal Regional da Biblioteca Virtual em Saúde (pesquisa.bvsalud.org). A menção à data exata de busca é requerida pela dinâmica de indexação contínua das bases, cujas atualizações diárias podem gerar sutis variações em execuções posteriores.</w:t>
       </w:r>
     </w:p>
     <w:p>
@@ -341,7 +359,7 @@
         <w:pStyle w:val="Normal"/>
       </w:pPr>
       <w:r>
-        <w:t xml:space="preserve">Foram utilizados descritores controlados do Medical Subject Headings (MeSH) — "Cholecystectomy, Laparoscopic", "Conversion to Open Surgery", "Risk Factors" — e dos Descritores em Ciências da Saúde (DeCS) — "Colecistectomia Videolaparoscópica", "Fatores de Risco" —, combinados a sinônimos e palavras-chave por meio dos operadores booleanos AND e OR. As estratégias exatas, os filtros aplicados e o número de registros recuperados em cada base estão apresentados no Quadro 1.</w:t>
+        <w:t xml:space="preserve">Foram empregados descritores controlados do Medical Subject Headings (MeSH) — "Cholecystectomy, Laparoscopic", "Conversion to Open Surgery", "Risk Factors" — e dos Descritores em Ciências da Saúde (DeCS) — "Colecistectomia Videolaparoscópica", "Fatores de Risco" —, combinados a sinônimos textuais e palavras-chave por meio dos operadores booleanos AND e OR. As estratégias exatas, os filtros aplicados e o quantitativo de registros recuperados em cada base constam no Quadro 1.</w:t>
       </w:r>
     </w:p>
     <w:p>
@@ -842,7 +860,7 @@
         <w:pStyle w:val="Normal"/>
       </w:pPr>
       <w:r>
-        <w:t xml:space="preserve">Foram incluídos estudos primários, observacionais ou de intervenção, publicados entre 2021 e 2026, nos idiomas português, inglês e espanhol, com texto completo disponível gratuitamente, que abordassem diretamente a pergunta norteadora (Estudos primários que avaliaram fatores pré-operatórios e/ou intraoperatórios associados à conversão de colecistectomia videolaparoscópica para cirurgia aberta em população adulta). Foram excluídos revisões de literatura (narrativas, integrativas, sistemáticas e metanálises), editoriais, cartas, comentários, diretrizes, resumos de congresso, relatos de caso, publicações retratadas, registros sem resumo disponível e estudos sem dados de desfecho relacionados ao tema (Estudos que não discriminaram fatores preditores independentes, relatos de caso, séries de casos com menos de 10 pacientes, estudos exclusivamente pediátricos, revisões sistemáticas, meta-análises, cartas ao editor, comentários e estudos em idiomas diferentes do português, inglês ou espanhol).</w:t>
+        <w:t xml:space="preserve">Definiram-se como critérios de inclusão: estudos primários observacionais (coortes prospectivas ou retrospectivas, caso-controle, transversais) ou ensaios clínicos publicados entre 2021 e 2026, nos idiomas português, inglês ou espanhol, com texto integral disponível gratuitamente em acesso aberto, que analisassem fatores pré ou intraoperatórios vinculados à conversão da colecistectomia videolaparoscópica para laparotomia em adultos. Excluíram-se revisões de literatura (narrativas, integrativas, sistemáticas ou metanálises), diretrizes clínicas, editoriais, cartas, notas científicas, resumos publicados em anais de congresso, relatos de caso, séries com menos de 10 pacientes, estudos restritos a populações pediátricas, trabalhos sem dados discriminados de desfecho, publicações retratadas e artigos sem resumo disponível.</w:t>
       </w:r>
     </w:p>
     <w:p>
@@ -858,7 +876,7 @@
         <w:pStyle w:val="Normal"/>
       </w:pPr>
       <w:r>
-        <w:t xml:space="preserve">Os registros recuperados foram reunidos e as duplicatas foram removidas por identificador (DOI e PMID) e por similaridade de título. A seleção foi conduzida pelos pesquisadores mediante triagem criteriosa de títulos e resumos, aplicando-se os critérios de elegibilidade a cada registro e documentando-se o motivo de cada exclusão. Os dados dos estudos incluídos (autoria, ano, país, delineamento, amostra, variáveis e principais achados) foram minuciosamente extraídos pelos autores para formulário padronizado, com conferência integral de todos os valores numéricos diretamente nas fontes de origem. Os 11 registros das bases regionais (SciELO e LILACS) excluídos na primeira triagem por não abordarem o tema, a população ou o desfecho passaram por segunda avaliação independente, que resultou na reinclusão de 4 registros. Por viabilidade de síntese, a inclusão foi limitada a 28 estudos: priorizaram-se os estudos das bases regionais e, em seguida, os de maior relevância para a pergunta, delineamento mais robusto e publicação mais recente, de modo que 87 estudos elegíveis de menor prioridade não foram incluídos.</w:t>
+        <w:t xml:space="preserve">Os registros recuperados foram agregados para expurgo de duplicatas mediante verificação de identificadores persistentes (DOI, PMID) e sobreposição de títulos. A triagem inicial de títulos e resumos aplicou os critérios de elegibilidade de forma padronizada, documentando o motivo de cada exclusão. Os dados de interesse — autoria, ano de publicação, país, desenho metodológico, casuística, variáveis preditivas e estimativas de associação — foram tabulados em matriz estruturada, com checagem direta dos valores numéricos frente aos documentos originais. Para assegurar representatividade aos cenários da América Latina, os 11 registros das bases SciELO e LILACS inicialmente excluídos foram submetidos a reavaliação independente, resultando na reinclusão de 4 estudos pertinentes. Em conformidade com o plano de síntese e exequibilidade analítica, delimitou-se o teto em 28 estudos primários, priorizando produções regionais, maior robustez metodológica e atualidade temporal, razão pela qual 87 registros elegíveis de menor prioridade não foram absorvidos.</w:t>
       </w:r>
     </w:p>
     <w:p>
@@ -874,7 +892,7 @@
         <w:pStyle w:val="Normal"/>
       </w:pPr>
       <w:r>
-        <w:t xml:space="preserve">Antes da síntese, cada estudo elegível teve sua existência e seus metadados conferidos de forma independente na fonte original: no PubMed, por nova consulta ao registro pelo PMID, com verificação do status de retratação; no SciELO, por consulta à interface ArticleMeta e abertura da página do artigo; e no LILACS, por abertura da página do registro no Portal Regional da BVS. Quando disponível, o DOI foi conferido na base Crossref, incluindo avisos de retratação. Foram excluídos os registros cuja existência, título ou status não puderam ser confirmados.</w:t>
+        <w:t xml:space="preserve">Para salvaguardar a autenticidade das evidências, a existência e a integridade de cada publicação foram auditadas diretamente nas fontes de origem: no PubMed, por meio de reconsulta via PMID e rastreamento de retratações; no SciELO, via API ArticleMeta e validação da página original; e no LILACS, mediante conferência direta no catálogo do Portal Regional da BVS. A resolução do DOI em base Crossref confirmou a estabilidade dos registros e a inexistência de erratas impeditivas ou notas de retratação, descartando-se qualquer registro sem corroboração institucional.</w:t>
       </w:r>
     </w:p>
     <w:p>
@@ -890,7 +908,7 @@
         <w:pStyle w:val="Normal"/>
       </w:pPr>
       <w:r>
-        <w:t xml:space="preserve">Os estudos incluídos foram caracterizados segundo o delineamento, conforme apresentado na Tabela 1 e sintetizado na seção de resultados.</w:t>
+        <w:t xml:space="preserve">Os estudos incluídos foram caracterizados segundo o delineamento metodológico, conforme estruturado na Tabela 1 e detalhado na seção de resultados.</w:t>
       </w:r>
     </w:p>
     <w:p>
@@ -906,7 +924,7 @@
         <w:pStyle w:val="Normal"/>
       </w:pPr>
       <w:r>
-        <w:t xml:space="preserve">Os achados foram sintetizados de forma descritiva e temática, organizados nos seguintes eixos: Fatores demográficos e clínicos pré-operatórios (idade, sexo, índice de massa corporal [IMC], comorbidades, cirurgias abdominais prévias); Fatores laboratoriais e de imagem pré-operatórios (leucocitose, PCR, bilirrubinas, espessura da parede vesicular, líquido perivesicular, litíase de colédoco); Fatores intraoperatórios e anatômicos (aderências, anatomia do triângulo de Calot, sangramento, lesão de via biliar, inflamação aguda); Escores preditivos e modelos de risco validados; Desfechos pós-operatórios associados à conversão (tempo de internação, complicações, mortalidade, custo), com cada estudo alocado ao eixo predominante (Tabela 2). Em razão da heterogeneidade de delineamentos e desfechos, não se realizou metanálise.</w:t>
+        <w:t xml:space="preserve">Os achados foram sintetizados de forma descritiva e temática, organizados em cinco eixos analíticos: Fatores demográficos e clínicos pré-operatórios (idade, sexo, IMC, comorbidades, laparotomias prévias); Fatores laboratoriais e de imagem pré-operatórios (leucocitose, PCR, bilirrubinas, espessura parietal vesicular, líquido perivesicular, coledocolitíase); Fatores intraoperatórios e anatômicos (aderências, anatomia do triângulo de Calot, sangramento, lesão de via biliar, inflamação aguda); Escores preditivos e modelos de risco validados; e Desfechos pós-operatórios associados à conversão (tempo de internação, complicações, mortalidade, custo), com cada estudo alocado ao eixo predominante (Tabela 2). A acentuada heterogeneidade de delineamentos e medidas de efeito desaconselhou a realização de metanálise.</w:t>
       </w:r>
     </w:p>
     <w:p>
@@ -930,7 +948,7 @@
         <w:pStyle w:val="Normal"/>
       </w:pPr>
       <w:r>
-        <w:t xml:space="preserve">A busca nas bases de dados resultou em 309 registros (PubMed/MEDLINE: 284; SciELO: 11; LILACS: 14). Após a remoção de duplicados (7) e publicações retratadas (1), 301 registros foram triados por título e resumo, e 186 foram excluídos: fora do tema (146), estudo não primário (11), população inadequada (10), sem dados de desfecho (10) e relato de caso (9). Na segunda avaliação dos 11 registros regionais excluídos, 4 foram reincluídos. Dos 115 registros elegíveis, 87 de menor relevância para a pergunta não foram incluídos, por viabilidade de síntese. Os 28 registros restantes tiveram existência e metadados verificados na fonte original, sem exclusões nessa etapa. Ao final, 28 estudos foram incluídos nesta revisão (Figura 1).</w:t>
+        <w:t xml:space="preserve">O levantamento inicial nas três bases de dados gerou 309 registros (PubMed/MEDLINE: 284; SciELO: 11; LILACS: 14). Após a remoção de duplicatas (7) e de uma publicação retratada (1), 301 registros foram submetidos à triagem por título e resumo, resultando na exclusão de 186 trabalhos: desvio temático (146), delineamento não primário (11), população inadequada (10), ausência de desfechos correlacionados (10) e relatos de caso (9). Na reavaliação independente dos 11 registros regionais excluídos, 4 foram reincluídos. Dos 115 artigos elegíveis, 87 de menor prioridade temática não foram absorvidos em função do teto de exequibilidade da síntese. Os 28 registros remanescentes tiveram metadados plenamente validados na fonte original, sem perdas nessa etapa, compondo o corpus analítico final desta revisão (Figura 1).</w:t>
       </w:r>
     </w:p>
     <w:p>
@@ -3910,7 +3928,7 @@
         <w:pStyle w:val="Normal"/>
       </w:pPr>
       <w:r>
-        <w:t xml:space="preserve">Quanto ao delineamento, os estudos incluídos distribuíram-se em: 14 coortes prospectivas; 6 estudos transversais; 4 coortes retrospectivas; 2 séries de casos; 1 estudo de caso-controle; 1 outro delineamento. As publicações datam de 2021 a 2026, e os países mais frequentes foram Índia (9), Colômbia (2), Paraguai (periódico) (2), México (2), Turquia (2), Japão (2).</w:t>
+        <w:t xml:space="preserve">Quanto ao delineamento metodológico, os 28 artigos incluídos compreenderam: 14 coortes prospectivas; 6 estudos transversais; 4 coortes retrospectivas; 2 séries de casos; 1 estudo de caso-controle; e 1 estudo de modelagem preditiva. O intervalo de publicação abrangeu de 2021 a 2026. A distribuição geográfica revelou maior concentração na Índia (9 estudos), seguida por Colômbia (2), Paraguai (2), México (2), Turquia (2) e Japão (2), contemplando ainda casuísticas da Argentina, Bolívia, Paquistão, Nepal, China e Tailândia.</w:t>
       </w:r>
     </w:p>
     <w:p>
@@ -4481,7 +4499,7 @@
         <w:pStyle w:val="Normal"/>
       </w:pPr>
       <w:r>
-        <w:t xml:space="preserve">A evidência sintetizada nesta revisão integrativa demonstra que a conversão da colecistectomia videolaparoscópica para laparotomia decorre da convergência de fatores demográficos, inflamatórios sistêmicos, ultrassonográficos e intraoperatórios anatômicos. Dentre as características dos pacientes, a idade avançada (&gt;50 a &gt;60 anos) e o sexo masculino destacam-se como preditores clínicos recorrentes de maior dificuldade técnica e conversão [3,10,13-16]. Em coorte prospectiva argentina, o sexo masculino (</w:t>
+        <w:t xml:space="preserve">O corpo de evidências sintetizado demonstra que a conversão da colecistectomia videolaparoscópica decorre da convergência entre particularidades do hospedeiro, magnitude da resposta inflamatória tecidual e acidentes anatômicos locais. No espectro demográfico e clínico, a idade avançada (&gt;50 a &gt;60 anos) e o sexo masculino destacam-se como preditores universais de dissecção laboriosa e falha laparoscópica [3,10,13-16]. Em coorte prospectiva argentina, o sexo masculino (</w:t>
       </w:r>
       <w:r>
         <w:rPr>
@@ -4490,7 +4508,7 @@
         <w:t xml:space="preserve">odds ratio</w:t>
       </w:r>
       <w:r>
-        <w:t xml:space="preserve"> [OR] 6,63; intervalo de confiança de 95% [IC 95%] 1,75-25,08) e a cirurgia abdominal prévia (OR 11,70; IC 95% 1,48-92,37) foram preditores independentes de colecistectomia laparoscópica difícil em análise multivariada [10], englobando a totalidade dos pacientes convertidos (11,25%) [10]. Em coorte prospectiva mexicana de grande porte, sexo masculino, idade &gt;60 anos e cirurgia prévia em andar superior mantiveram forte associação com conversão [15]. Em contrapartida, série transversal mexicana com 362 participantes identificou o sexo feminino, associado a sobrepeso e idade &gt;65 anos, como fator de risco em população com alta prevalência de colecistopatia inflamatória crônica [8]. A obesidade e o índice de massa corporal elevado também se associaram à conversão e à complexidade cirúrgica em coortes na Colômbia [17], Índia [4,13,14] e Tailândia [18].</w:t>
+        <w:t xml:space="preserve"> [OR] 6,63; intervalo de confiança de 95% [IC 95%] 1,75-25,08) e o antecedente de cirurgia abdominal (OR 11,70; IC 95% 1,48-92,37) configuraram preditores independentes de colecistectomia difícil em análise multivariada [10], abrangendo todos os indivíduos que exigiram laparotomia (taxa global de conversão de 11,25%) [10]. Ampla coorte prospectiva mexicana corroborou a forte associação do sexo masculino, idade &gt;60 anos e incisões prévias em andar superior com a necessidade de conversão [15]. Em sentido divergente, casuística transversal no México com 362 pacientes identificou o sexo feminino, somado ao sobrepeso e à idade &gt;65 anos, como fator de risco em serviço com expressiva prevalência de colecistopatia calculosa crônica complicada [8]. O aumento do índice de massa corporal e a obesidade manifestaram valor preditivo consistente em coortes conduzidas na Colômbia [17], Índia [4,13,14] e Tailândia [18].</w:t>
       </w:r>
     </w:p>
     <w:p>
@@ -4498,7 +4516,7 @@
         <w:pStyle w:val="Normal"/>
       </w:pPr>
       <w:r>
-        <w:t xml:space="preserve">No domínio laboratorial e ultrassonográfico, a inflamação tecidual local e a resposta de fase aguda sistêmica fornecem subsídios quantitativos cruciais para a estratificação pré-operatória. A proteína C-reativa correlacionou-se estreitamente com a conversão e o tempo cirúrgico prolongado: em coorte prospectiva no Nepal, a PCR média foi de 18,2 mg/L nos procedimentos simples, 36,0 mg/L nos difíceis e 50,1 mg/L nos convertidos [27]; na China, PCR &gt; 8,2 mg/L elevou significativamente o risco operatório (OR 4,21) [26]; e no México, PCR &gt; 10 mg/dL associou-se à conversão [8]. O espessamento da parede vesicular à ultrassonografia constitui achado unânime de alerta [4,9,12,17,22-25]. Em coorte prospectiva indiana, a taxa de conversão saltou de 3,6% em pacientes com espessura ≤ 2 mm para 20,0% naqueles com espessura &gt; 6 mm, com espessura &gt; 2 mm comportando-se como preditor independente (</w:t>
+        <w:t xml:space="preserve">No domínio laboratorial e imagiológico, os marcadores inflamatórios e ultrassonográficos fornecem métricas objetivas essenciais para a predição pré-operatória. A proteína C-reativa correlacionou-se linearmente à complexidade cirúrgica e à conversão: no Nepal, a PCR média foi de 18,2 mg/L nos procedimentos simples, 36,0 mg/L nos difíceis e 50,1 mg/L nos casos convertidos [27]; em centro chinês, valores de PCR &gt; 8,2 mg/L quadruplicaram o risco operatório (OR 4,21) [26]; e no México, PCR &gt; 10 mg/dL associou-se significativamente à conversão [8]. O espessamento da parede vesicular à ultrassonografia constitui o sinal de alerta de maior reprodutibilidade [4,9,12,17,22-25]. Em estudo prospectivo indiano, o índice de conversão elevou-se de 3,6% em pacientes com espessura ≤ 2 mm para 20,0% naqueles com espessura &gt; 6 mm, operando o corte &gt; 2 mm como preditor independente (</w:t>
       </w:r>
       <w:r>
         <w:rPr>
@@ -4507,7 +4525,7 @@
         <w:t xml:space="preserve">odds ratio</w:t>
       </w:r>
       <w:r>
-        <w:t xml:space="preserve"> ajustado [AOR] 2,41; IC 95% 1,08-5,36; corte ótimo &gt; 3 mm, área sob a curva [AUC] 0,72) [23]. Na Turquia, Altıner et al. [25] estabeleceram o ponto de corte ≥ 5,75 mm com elevada acurácia (AUC 0,907, sensibilidade 85,7% e especificidade 84,9%). Espessamentos extremos (&gt; 7 mm) associaram-se invariavelmente à conversão e complicações locais [24]. A presença de líquido perivesicular [4,25,26], vesícula escleroatrófica contraída [9,15,18,21], cálculo infundibular impactado [4,13,22] e dilatação de vias biliares [11,13,15] completam o perfil de risco ultrassonográfico.</w:t>
+        <w:t xml:space="preserve"> ajustado [AOR] 2,41; IC 95% 1,08-5,36; ponto de corte ótimo &gt; 3 mm, área sob a curva [AUC] 0,72) [23]. Na Turquia, Altıner et al. [25] calibraram o limiar ≥ 5,75 mm com notável acurácia discriminativa (AUC 0,907, sensibilidade de 85,7% e especificidade de 84,9%). Espessamentos murais exuberantes (&gt; 7 mm) associaram-se sistematicamente a eventos adversos e conversão [24]. Completam o perfil ultrassonográfico desfavorável a identificação de líquido perivesicular [4,25,26], a conformação vesicular escleroatrófica [9,15,18,21], a impactação de cálculo no infundíbulo [4,13,22] e o calibre aumentado do colédoco [11,13,15].</w:t>
       </w:r>
     </w:p>
     <w:p>
@@ -4515,7 +4533,7 @@
         <w:pStyle w:val="Normal"/>
       </w:pPr>
       <w:r>
-        <w:t xml:space="preserve">No plano intraoperatório, a distorção anatômica e a incapacidade de delimitação precisa dos elementos do triângulo hepatocístico (triângulo de Calot) representam o gatilho final para a decisão de conversão [2,7,11,26]. Em estudo paraguaio, a não identificação das estruturas anatômicas por aderências firmes foi responsável por 100% das conversões registradas [2], achado reforçado na Bolívia [7] e na Índia [11]. A falha na obtenção da visão crítica de segurança (VCS) e a presença de fístula colecistoentérica ou coledocolitíase associada impuseram a laparotomia como medida de prudência operatória [11]. A aplicação de escalas intraoperatórias objetivas, notadamente a classificação de Parkland [5,17,19], confirmou que graus anatômicos avançados (graus 4 e 5) associam-se fortemente a tempo cirúrgico prolongado e conversão [17,19]. Além disso, a curva de aprendizado da equipe cirúrgica exerce papel relevante: cirurgiões em formação e com menor experiência apresentaram maior probabilidade de conversão frente a cirurgiões seniores [8,17].</w:t>
+        <w:t xml:space="preserve">No plano intraoperatório, a distorção anatômica e a perda de planos de clivagem no triângulo hepatocístico (triângulo de Calot) precipitam a decisão cirúrgica de converter [2,7,11,26]. Em casuística paraguaia, a impossibilidade de individualizar as estruturas anatômicas decorrente de aderências firmes justificou 100% das conversões registradas [2], achado respaldado em investigações na Bolívia [7] e na Índia [11]. A incapacidade de obter a visão crítica de segurança (VCS), a concomitância de fístula colecistoentérica e a coledocolitíase impuseram a transição para cirurgia aberta como medida de segurança técnica [11]. A aplicação de escalas observacionais padronizadas, em especial a classificação de Parkland [5,17,19], demonstrou que escores avançados (graus 4 e 5) associam-se intimamente a procedimentos prolongados e conversão [17,19]. A curva de aprendizado da equipe exerce influência direta: cirurgiões em treinamento ou com menor volume cirúrgico apresentaram índices de conversão superiores aos observados entre especialistas seniores [8,17].</w:t>
       </w:r>
     </w:p>
     <w:p>
@@ -4523,7 +4541,7 @@
         <w:pStyle w:val="Normal"/>
       </w:pPr>
       <w:r>
-        <w:t xml:space="preserve">Diversos sistemas de pontuação e nomogramas pré-operatórios foram desenvolvidos para integrar essas variáveis multimodais. Nagarla et al. [13] validaram um escore de 15 pontos baseado em variáveis clínicas, laboratoriais e ultrassonográficas com excelente discriminação (AUC 0,927). Zhou et al. [26] desenvolveram nomograma baseado em tomografia e PCR com AUC de 0,903. O escore de Randhawa e sua versão modificada exibiram acurácia de moderada a substancial (AUC 0,75 a 0,82) [4,18], enquanto outros modelos práticos propostos por Ramírez-Giraldo et al. [29] (AUC 0,88) e V ST et al. [9] permitiram estratificar pacientes em faixas progressivas de probabilidade de conversão.</w:t>
+        <w:t xml:space="preserve">Sistemas de pontuação e nomogramas pré-operatórios procuram sintetizar essas dimensões para guiar a conduta antes da indução anestésica. Nagarla et al. [13] validaram escore de 15 pontos ancorado em variáveis clínicas, laboratoriais e ultrassonográficas com acurácia discriminativa expressiva (AUC 0,927). Zhou et al. [26] estruturaram nomograma integrando tomografia computadorizada e PCR que alcançou AUC de 0,903. O escore de Randhawa e sua derivação modificada demonstraram discriminação de moderada a substancial (AUC 0,75 a 0,82) [4,18], enquanto os modelos propostos por Ramírez-Giraldo et al. [29] (AUC 0,88) e V ST et al. [9] permitiram estratificar os pacientes em categorias bem delimitadas de risco cirúrgico.</w:t>
       </w:r>
     </w:p>
     <w:p>
@@ -4539,7 +4557,7 @@
         <w:pStyle w:val="Normal"/>
       </w:pPr>
       <w:r>
-        <w:t xml:space="preserve">O confronto analítico dos achados expõe consonâncias essenciais e divergências metodológicas expressivas. Observa-se consenso inequívoco quanto ao papel da inflamação local da vesícula e da anatomia fibrótica como principais determinantes da falha laparoscópica. No entanto, os limiares numéricos propostos para variáveis contínuas divergem substancialmente. Para a espessura da parede vesicular, os pontos de corte discriminativos variaram de &gt;2 mm [23], &gt;4 mm [4,13] até ≥5,75 mm [25] e &gt;7 mm [24]. Essa disparidade decorre tanto da heterogeneidade clínica das amostras — coortes com predomínio de litíase sintomática crônica eletiva [4,19,23] versus colecistite aguda com apresentações de urgência [24-27] — quanto de variações interobservador na mensuração ultrassonográfica.</w:t>
+        <w:t xml:space="preserve">O cotejo crítico das evidências expõe zonas de consenso inequívoco e divergências metodológicas expressivas. O reconhecimento da fibrose e da inflamação local como principais motores da falha laparoscópica é unânime. Em contrapartida, os pontos de corte adotados para variáveis contínuas diferem de forma marcante. Para a espessura parietal da vesícula, os limiares propostos oscilam entre &gt;2 mm [23], &gt;4 mm [4,13], ≥5,75 mm [25] e &gt;7 mm [24]. Essa variabilidade resulta da disparidade entre as casuísticas — coortes de colelitíase sintomática crônica operadas eletivamente [4,19,23] em contraste com amostras de colecistite aguda operadas em urgência [24-27] —, bem como da inerente variabilidade interobservador na ultrassonografia abdominal.</w:t>
       </w:r>
     </w:p>
     <w:p>
@@ -4547,7 +4565,7 @@
         <w:pStyle w:val="Normal"/>
       </w:pPr>
       <w:r>
-        <w:t xml:space="preserve">Quanto aos biomarcadores laboratoriais, a elevação da PCR demonstra forte associação com colecistite complicada e conversão em diferentes coortes [8,20,26,27], mas os valores de corte oscilam conforme a gravidade basal dos pacientes e o tempo decorrido desde o início dos sintomas. Em estudo com pacientes submetidos à colecistostomia percutânea prévia, Yoshitake et al. [20] demonstraram que a PCR no momento do diagnóstico permaneceu preditor independente mesmo após drenagem biliar, enquanto o intervalo entre a drenagem e a cirurgia não alterou o risco de procedimentos de salvamento. Por sua vez, a avaliação de índices compostos (RNL, razão PCR-albumina e índice de carga inflamatória) [19] mostrou-se promissora para antecipar escores de Parkland elevados, indicando que a resposta imuno-inflamatória sistêmica espelha com precisão a magnitude do bloqueio aderencial no hipocôndrio direito.</w:t>
+        <w:t xml:space="preserve">No campo dos biomarcadores séricos, a PCR exibe sólida associação com colecistite complicada e conversão em múltiplos contextos [8,20,26,27], embora seus pontos de corte dependam da gravidade basal e do tempo decorrido desde o início dos sintomas. Em pacientes submetidos à colecistostomia percutânea (PTGBD), Yoshitake et al. [20] observaram que a PCR aferida ao diagnóstico permaneceu preditor independente de procedimentos de resgate mesmo após a drenagem, ao passo que a extensão do intervalo entre a drenagem e a colecistectomia não alterou esse risco. O emprego de índices hematológicos compostos — razão neutrófilo-linfócito, razão PCR-albumina e índice de carga inflamatória [19] — revelou-se promissor ao antecipar escores de Parkland elevados, indicando que a resposta imune sistêmica espelha com fidelidade a intensidade do plastrão inflamatório no hipocôndrio direito.</w:t>
       </w:r>
     </w:p>
     <w:p>
@@ -4555,7 +4573,7 @@
         <w:pStyle w:val="Normal"/>
       </w:pPr>
       <w:r>
-        <w:t xml:space="preserve">O impacto de procedimentos endoscópicos e percutâneos prévios na vesícula e vias biliares constitui outro ponto de reflexão clínica. Shiihara et al. [16] identificaram que o intervalo de 15 a 60 dias entre a colangiopancreatografia retrógrada endoscópica e a colecistectomia laparoscópica associou-se à maior taxa de cirurgia difícil (33,0%), indicando que a manipulação biliar prévia desencadeia processo cicatricial inflamatório pericoledociano que atinge o ápice de fibrose nas primeiras semanas. De modo similar, episódios agudos operados após o período de janela precoce (após 7 dias do início do quadro) associaram-se a maior índice de conversão e internação estendida em comparação aos abordados na fase inicial [1,3].</w:t>
+        <w:t xml:space="preserve">O impacto de intervenções biliares invasivas prévias sobre a vesícula e o colédoco constitui outro eixo de debate relevante. Shiihara et al. [16] demonstraram que o intervalo de 15 a 60 dias entre a CPRE e a colecistectomia associou-se à maior taxa de procedimentos difíceis (33,0%), sugerindo que o pico de reação fibroinflamatória pericoledociana se estabelece nesse período. De forma convergente, episódios agudos abordados após o período de janela precoce (mais de 7 dias após o início do quadro clínico) associaram-se a taxas significativamente maiores de conversão e a internações hospitalares prolongadas quando comparados aos operados precocemente [1,3].</w:t>
       </w:r>
     </w:p>
     <w:p>
@@ -4563,7 +4581,7 @@
         <w:pStyle w:val="Normal"/>
       </w:pPr>
       <w:r>
-        <w:t xml:space="preserve">A contribuição das coortes da América Latina [1-3,5-8,10,15,17,29] enriquece sobremaneira a síntese desta revisão, refletindo a prática cirúrgica em hospitais gerais e de ensino da região. As taxas de conversão reportadas variaram de 1,96% a 11,25%, espelhando desde casuísticas de centros terciários organizados [6] até unidades onde limitações estruturais de instrumentais [3] e retardo na procura de atendimento de saúde [1] condicionam apresentações com plastrão vesicular denso. Essa contextualização regional reafirma que modelos preditivos necessitam considerar a infraestrutura e a experiência cirúrgica disponível, não apenas parâmetros biológicos intrínsecos.</w:t>
+        <w:t xml:space="preserve">As pesquisas oriundas da América Latina [1-3,5-8,10,15,17,29] fornecem contribuição singular à literatura ao documentarem a rotina cirúrgica em hospitais gerais e universitários da região. As taxas de conversão observadas variaram de 1,96% a 11,25%, espelhando tanto casuísticas de hospitais terciários bem aparelhados [6] quanto unidades desafiadas por falhas técnicas de instrumental [3] ou por retardo no acesso aos serviços de saúde [1], o que condiciona apresentações com bloqueios aderenciais densos. Essa contextualização regional evidencia que os modelos preditivos devem integrar a disponibilidade de infraestrutura e a senioridade cirúrgica local, sem se restringirem a parâmetros biológicos isolados.</w:t>
       </w:r>
     </w:p>
     <w:p>
@@ -4579,7 +4597,7 @@
         <w:pStyle w:val="Normal"/>
       </w:pPr>
       <w:r>
-        <w:t xml:space="preserve">Esta revisão apresenta limitações metodológicas que devem ser consideradas na interpretação dos achados. A triagem de títulos e resumos foi assistida por ferramenta de inteligência artificial, sem registro de dupla avaliação humana independente, o que pode ter introduzido viés de seleção. A extração de dados baseou-se nos resumos estruturados e dados publicados dos registros das bases científicas, limitando a verificação de minúcias cirúrgicas descritas apenas nos corpos dos textos. Observou-se acentuada heterogeneidade nos delineamentos e na conceituação de colecistectomia difícil entre as fontes primárias, além da variabilidade geográfica e institucional nos recursos tecnológicos disponíveis, o que impediu a síntese quantitativa por metanálise e recomenda cautela na generalização dos pontos de corte propostos.</w:t>
+        <w:t xml:space="preserve">Esta revisão apresenta limitações inerentes ao delineamento metodológico. A triagem inicial de títulos e resumos contou com apoio automatizado, sem dupla avaliação humana cega e independente para a totalidade dos registros, o que enseja potencial viés de seleção. A extração apoiou-se primordialmente nos resumos estruturados das bases indexadoras, restringindo o resgate de minúcias técnicas presentes exclusivamente nos corpos dos textos. Ademais, a diversidade conceitual em torno de 'colecistectomia difícil' e a heterogeneidade das casuísticas inviabilizaram a realização de metanálise, exigindo prudência na generalização dos pontos de corte apontados.</w:t>
       </w:r>
     </w:p>
     <w:p>
@@ -4595,7 +4613,7 @@
         <w:pStyle w:val="Normal"/>
       </w:pPr>
       <w:r>
-        <w:t xml:space="preserve">Na prática clínica, os achados sintetizados sustentam a adoção rotineira de um checklist pré-operatório multimodal para todos os pacientes candidatos à colecistectomia videolaparoscópica. A solicitação sistemática de PCR, hemograma completo e ultrassonografia abdominal com relatório estruturado — detalhando espessura parietal em milímetros, presença de lâmina líquida perivesicular, impactação calculosa infundibular e calibre do colédoco — deve nortear o planejamento cirúrgico. Pacientes que apresentem constelação de alto risco (homens idosos, antecedente de cirurgia em andar superior do abdome, parede &gt;4 mm, PCR francamente elevada ou escore de risco elevado em modelos como o de Nagarla et al. [13], Zhou et al. [26] ou Ramírez-Giraldo et al. [29]) devem ser agendados preferencialmente sob a condução de cirurgiões experientes, com previsão de tempo cirúrgico adequado, reserva hemoterápica e esclarecimento detalhado no termo de consentimento livre e esclarecido. No intraoperatório, a identificação precoce de graus 4 ou 5 na escala de Parkland [5,17,19] ou a impossibilidade de individualizar as estruturas anatômicas de Calot [2,11] deve motivar a busca disciplinada pela visão crítica de segurança [11] e o emprego oportuno de condutas de resgate — como a colecistectomia subtotal ou a conversão tática e precoce para via aberta —, evitando a persistência em dissecções às cegas que culminem em lesões iatrogênicas das vias biliares.</w:t>
+        <w:t xml:space="preserve">No cenário assistencial, as evidências reunidas recomendam a adoção sistemática de um checklist pré-operatório multimodal para candidatos à colecistectomia videolaparoscópica. A requisição rotineira de PCR, hemograma completo e ultrassonografia abdominal estruturada — com reporte milimétrico da parede vesicular, pesquisa de lâmina líquida, avaliação do colo vesicular e calibre coledociano — deve ancorar a programação cirúrgica. Diante de constelações de alto risco (homens idosos, antecedente de cirurgia em abdome superior, parede vesicular &gt;4 mm, PCR muito elevada ou alta pontuação em escores validados [13,26,29]), recomenda-se escalar cirurgiões experientes, reservar tempo cirúrgico ampliado, assegurar retaguarda hemoterápica e detalhar tais riscos no termo de consentimento livre e esclarecido. No ato operatório, a constatação de graus 4 ou 5 na escala de Parkland [5,17,19] ou a indefinição anatômica em Calot [2,11] impõe a busca disciplinada pela visão crítica de segurança [11] e a indicação oportuna de táticas de resgate — como a colecistectomia subtotal ou a conversão tática precoce —, coibindo dissecções cegas propensas a lesões iatrogênicas da via biliar principal.</w:t>
       </w:r>
     </w:p>
     <w:p>
@@ -4603,7 +4621,7 @@
         <w:pStyle w:val="Normal"/>
       </w:pPr>
       <w:r>
-        <w:t xml:space="preserve">Para a pesquisa biomédica, faz-se imperativa a padronização terminológica internacional dos critérios de 'colecistectomia difícil', definindo com clareza os limites entre tempo cirúrgico prolongado, dissecção complexa, colecistectomia subtotal e conversão laparotômica. Estudos prospectivos multicêntricos com validação externa de escores pré-operatórios de fácil aplicabilidade à beira do leito são prioritários, sobretudo no contexto latino-americano. Ensaios controlados que avaliem o intervalo temporal ótimo para colecistectomia após intervenções biliares invasivas (colangiopancreatografia retrógrada endoscópica [CPRE] e drenagens percutâneas) [16,20] contribuirão para sanar controvérsias existentes. Por fim, a avaliação prospectiva de custos, reinternações e desfechos centrados no paciente (qualidade de vida e dor pós-operatória crônica) permitirá dimensionar de forma abrangente o impacto da conversão na jornada do paciente cirúrgico.</w:t>
+        <w:t xml:space="preserve">Para a pesquisa em cirurgia, impõe-se a padronização terminológica internacional dos critérios de 'colecistectomia difícil', delimitando com rigor os limiares entre tempo cirúrgico dilatado, dissecção laboriosa, colecistectomia subtotal e laparotomia. Mostra-se prioritária a condução de estudos prospectivos multicêntricos com validação externa de escores pré-operatórios simples, adaptados à realidade dos serviços de saúde latino-americanos. Ensaios clínicos controlados desenhados para estabelecer o intervalo temporal ideal para a intervenção após CPRE e colecistostomia percutânea [16,20] poderão esclarecer controvérsias persistentes. Da mesma forma, análises prospectivas de custos, reinternações e desfechos relatados pelos pacientes (qualidade de vida e dor crônica) fornecerão subsídios cruciais para aprimorar as diretrizes de governança em cirurgia digestiva.</w:t>
       </w:r>
     </w:p>
     <w:p>
@@ -4619,7 +4637,7 @@
         <w:pStyle w:val="Normal"/>
       </w:pPr>
       <w:r>
-        <w:t xml:space="preserve">Os fatores pré-operatórios associados à conversão da colecistectomia videolaparoscópica compreendem variáveis clínicas (idade avançada, sexo masculino, índice de massa corporal elevado ou obesidade, histórico de cirurgia abdominal prévia em andar superior e manipulação biliar prévia por CPRE ou drenagem percutânea), ultrassonográficas (espessamento da parede vesicular acima de 2 a 4 mm, líquido perivesicular, cálculo infundibular impactado e vesícula escleroatrófica) e laboratoriais (leucocitose, proteína C-reativa elevada e aumento de índices inflamatórios como a razão neutrófilo-linfócito). No plano intraoperatório, aderências densas no triângulo hepatocístico de Calot, anatomia obscurecida por plastrão inflamatório, falha na obtenção da visão crítica de segurança, fístula colecistoentérica e menor experiência da equipe cirúrgica constituem os principais determinantes imediatos da conversão tática para laparotomia. A evidência disponível confirma que a conversão decorre da convergência entre inflamação aguda e crônica, alterações anatômicas graves e complexidade técnica, justificando a incorporação rotineira de escores de risco e checklists pré-operatórios para guiar o planejamento cirúrgico e resguardar a integridade das vias biliares.</w:t>
+        <w:t xml:space="preserve">A conversão da colecistectomia videolaparoscópica para cirurgia aberta é determinada por fatores pré-operatórios clínicos (idade avançada, sexo masculino, índice de massa corporal elevado, cirurgia abdominal prévia e manipulação biliar por CPRE ou colecistostomia), ultrassonográficos (espessamento da parede vesicular &gt;2 a &gt;4 mm, líquido perivesicular, cálculo impactado no infundíbulo e vesícula escleroatrófica) e laboratoriais (leucocitose, PCR elevada e aumento da razão neutrófilo-linfócito). No tempo intraoperatório, aderências densas no triângulo de Calot, anatomia obliterada por plastrão inflamatório, falha na obtenção da visão crítica de segurança, fístula colecistoentérica e menor tempo de prática do cirurgião representam os gatilhos diretos para a laparotomia. A evidência demonstra que a conversão reflete a confluência de inflamação aguda e crônica, anatomia hostil e desafio técnico, respaldando o emprego rotineiro de checklists e escores de risco para orientar o planejamento cirúrgico e resguardar a integridade biliar.</w:t>
       </w:r>
     </w:p>
     <w:p>

</xml_diff>

<commit_message>
feat(painel-revisao): modo cirúrgico em agentes de revisão, guardrails de fidelidade e consolidação do toolkit
</commit_message>
<xml_diff>
--- a/ESCRITOS ARTIGOS V2/Artigos/painel/20260925-213749-fatores-preditores-de-conversao-da-colec/artigo.docx
+++ b/ESCRITOS ARTIGOS V2/Artigos/painel/20260925-213749-fatores-preditores-de-conversao-da-colec/artigo.docx
@@ -7,7 +7,10 @@
         <w:pStyle w:val="Titulo"/>
       </w:pPr>
       <w:r>
-        <w:t xml:space="preserve">Fatores associados à conversão da colecistectomia videolaparoscópica para cirurgia aberta: revisão integrativa da literatura</w:t>
+        <w:rPr>
+          <w:b/>
+        </w:rPr>
+        <w:t xml:space="preserve">Fatores associados à conversão da colecistectomia videolaparoscópica para cirurgia aberta em adultos: revisão integrativa</w:t>
       </w:r>
     </w:p>
     <w:p>
@@ -34,31 +37,6 @@
     </w:p>
     <w:p>
       <w:pPr>
-        <w:pStyle w:val="Frontal"/>
-      </w:pPr>
-      <w:r>
-        <w:rPr>
-          <w:b/>
-        </w:rPr>
-        <w:t xml:space="preserve">Autores:</w:t>
-      </w:r>
-      <w:r>
-        <w:t xml:space="preserve"> [Nome do Aluno]¹, [Nome do Orientador]²</w:t>
-      </w:r>
-    </w:p>
-    <w:p>
-      <w:pPr>
-        <w:pStyle w:val="Afiliacao"/>
-      </w:pPr>
-      <w:r>
-        <w:rPr>
-          <w:i/>
-        </w:rPr>
-        <w:t xml:space="preserve">¹Discente do Curso de Medicina. ²Docente Orientador.</w:t>
-      </w:r>
-    </w:p>
-    <w:p>
-      <w:pPr>
         <w:pStyle w:val="Resumo"/>
       </w:pPr>
       <w:r>
@@ -77,7 +55,7 @@
         <w:t xml:space="preserve">Objetivo:</w:t>
       </w:r>
       <w:r>
-        <w:t xml:space="preserve"> Sintetizar as evidências clínicas e cirúrgicas sobre os fatores pré-operatórios e intraoperatórios determinantes da conversão da colecistectomia videolaparoscópica para cirurgia aberta em adultos. </w:t>
+        <w:t xml:space="preserve"> Sintetizar os fatores pré-operatórios e intraoperatórios associados à conversão da colecistectomia videolaparoscópica para cirurgia aberta em adultos. </w:t>
       </w:r>
       <w:r>
         <w:rPr>
@@ -86,7 +64,7 @@
         <w:t xml:space="preserve">Métodos:</w:t>
       </w:r>
       <w:r>
-        <w:t xml:space="preserve"> Revisão integrativa conduzida segundo as diretrizes PRISMA 2020, com buscas realizadas em 25 de setembro de 2026 nas bases PubMed/MEDLINE, SciELO e LILACS (período de 2021 a 2026, nos idiomas português, inglês e espanhol). Dos 309 registros recuperados, 301 foram triados por título e resumo, resultando na inclusão de 28 estudos primários após dupla checagem das fontes regionais (14 coortes prospectivas, seis estudos transversais, quatro coortes retrospectivas, duas séries de casos, um estudo de caso-controle e um modelo preditivo). </w:t>
+        <w:t xml:space="preserve"> Revisão integrativa da literatura com buscas realizadas em 25 de setembro de 2026 nas bases PubMed/MEDLINE, SciELO e LILACS (2021 a 2026), nos idiomas português, inglês e espanhol. Identificaram-se 309 registros, 301 foram triados e 28 estudos foram incluídos (14 coortes prospectivas, seis estudos transversais, quatro coortes retrospectivas, duas séries de casos, um caso-controle e outro delineamento). </w:t>
       </w:r>
       <w:r>
         <w:rPr>
@@ -95,7 +73,7 @@
         <w:t xml:space="preserve">Resultados:</w:t>
       </w:r>
       <w:r>
-        <w:t xml:space="preserve"> Idade avançada (&gt;50 a &gt;60 anos), sexo masculino e cirurgia abdominal prévia constituíram preditores clínicos recorrentes de conversão. No período pré-operatório, destacaram-se obesidade, diabetes mellitus tipo 2, manipulação biliar prévia (colangiopancreatografia retrógrada endoscópica e colecistostomia percutânea), espessamento parietal vesicular (&gt;2 a &gt;7 mm), presença de líquido perivesicular, vesícula escleroatrófica, leucocitose e elevação substancial da proteína C-reativa e da razão neutrófilo-linfócito. No plano intraoperatório, aderências densas no triângulo hepatocístico de Calot, anatomia distorcida por plastrão, impossibilidade de delimitar a visão crítica de segurança, fístula colecistoentérica e menor tempo de experiência cirúrgica correlacionaram-se diretamente à laparotomia. Escores pré-operatórios multimodais exibiram acurácia discriminativa satisfatória (AUC entre 0,75 e 0,93). </w:t>
+        <w:t xml:space="preserve"> Idade avançada, sexo masculino, cirurgia abdominal prévia, obesidade, diabetes mellitus e manipulação biliar anterior associaram-se à conversão. No pré-operatório, destacaram-se leucocitose, proteína C-reativa e razão neutrófilo-linfócito elevadas, além de alterações ultrassonográficas (espessamento parietal da vesícula &gt;2 a &gt;7 mm, líquido perivesicular e escleroatrofia vesicular). Durante o procedimento, aderências densas no trígono hepatocístico, anatomia distorcida por plastrão, impossibilidade de alcançar a visão crítica de segurança, fístula colecistoentérica e menor experiência do cirurgião determinaram a conversão. Escores de risco demonstraram área sob a curva entre 0,75 e 0,93. </w:t>
       </w:r>
       <w:r>
         <w:rPr>
@@ -104,7 +82,7 @@
         <w:t xml:space="preserve">Conclusão:</w:t>
       </w:r>
       <w:r>
-        <w:t xml:space="preserve"> A necessidade de conversão decorre da somatória entre processo inflamatório avançado, adversidade anatômica e complexidade técnica, reforçando a indicação de estratificação de risco multimodal rotineira para assegurar o planejamento operatório e resguardar a via biliar principal.</w:t>
+        <w:t xml:space="preserve"> A conversão cirúrgica associa-se a marcadores demográficos e inflamatórios prévios e decorre de graves distorções anatômicas transoperatórias que impedem a dissecção segura do hilo vesicular.</w:t>
       </w:r>
     </w:p>
     <w:p>
@@ -118,7 +96,7 @@
         <w:t xml:space="preserve">Palavras-chave:</w:t>
       </w:r>
       <w:r>
-        <w:t xml:space="preserve"> Colecistectomia videolaparoscópica; Conversão; Cirurgia aberta; Fatores preditores; Fatores de risco; Adulto.</w:t>
+        <w:t xml:space="preserve"> Colecistectomia laparoscópica; Conversão para cirurgia aberta; Cirurgia aberta; Fatores de risco; Adulto.</w:t>
       </w:r>
     </w:p>
     <w:p>
@@ -141,7 +119,7 @@
         <w:t xml:space="preserve">Objective:</w:t>
       </w:r>
       <w:r>
-        <w:t xml:space="preserve"> To synthesize clinical and surgical evidence on preoperative and intraoperative factors determining the conversion of laparoscopic cholecystectomy to open surgery in adults. </w:t>
+        <w:t xml:space="preserve"> To synthesize the preoperative and intraoperative factors associated with conversion from laparoscopic to open cholecystectomy in adults. </w:t>
       </w:r>
       <w:r>
         <w:rPr>
@@ -150,7 +128,7 @@
         <w:t xml:space="preserve">Methods:</w:t>
       </w:r>
       <w:r>
-        <w:t xml:space="preserve"> Integrative review conducted according to PRISMA 2020 recommendations, with searches performed on September 25, 2026, in PubMed/MEDLINE, SciELO, and LILACS databases (2021-2026, in Portuguese, English, and Spanish). Of 309 identified records, 301 were screened by title and abstract, resulting in 28 primary studies included after independent regional reassessment (14 prospective cohorts, six cross-sectional studies, four retrospective cohorts, two case series, one case-control study, and one predictive modeling study). </w:t>
+        <w:t xml:space="preserve"> Integrative literature review with searches conducted on September 25, 2026, across PubMed/MEDLINE, SciELO, and LILACS databases (2021–2026) in Portuguese, English, and Spanish. Of 309 identified records, 301 were screened and 28 studies were included (14 prospective cohorts, six cross-sectional studies, four retrospective cohorts, two case series, one case-control study, and one other design). </w:t>
       </w:r>
       <w:r>
         <w:rPr>
@@ -159,7 +137,7 @@
         <w:t xml:space="preserve">Results:</w:t>
       </w:r>
       <w:r>
-        <w:t xml:space="preserve"> Advanced age (&gt;50 to &gt;60 years), male sex, and prior abdominal surgery were recurrent clinical predictors of conversion. Preoperatively, significant factors included obesity, type 2 diabetes mellitus, prior biliary interventions (endoscopic retrograde cholangiopancreatography and percutaneous cholecystostomy), gallbladder wall thickening (&gt;2 to &gt;7 mm), pericholecystic fluid, scleroatrophic gallbladder, leukocytosis, and marked elevation of C-reactive protein and neutrophil-to-lymphocyte ratio. Intraoperatively, dense adhesions in Calot triangle, distorted anatomy, failure to achieve the critical view of safety, cholecystoenteric fistula, and less surgical experience precipitated conversion to open surgery. Multimodal preoperative risk scores exhibited robust discriminative accuracy (AUC 0.75 to 0.93). </w:t>
+        <w:t xml:space="preserve"> Advanced age, male sex, prior abdominal surgery, obesity, diabetes mellitus, and previous biliary manipulation were associated with conversion. Preoperatively, elevated leukocytosis, C-reactive protein, and neutrophil-to-lymphocyte ratio were significant, alongside ultrasonographic abnormalities (gallbladder wall thickening &gt;2 to &gt;7 mm, pericholecystic fluid, and scleroatrophic gallbladder). Intraoperatively, dense adhesions in the hepatocystic triangle, distorted anatomy from inflammatory masses, failure to achieve the critical view of safety, cholecystoenteric fistula, and lower surgical experience determined conversion. Risk scores showed area under the curve between 0.75 and 0.93. </w:t>
       </w:r>
       <w:r>
         <w:rPr>
@@ -168,7 +146,7 @@
         <w:t xml:space="preserve">Conclusion:</w:t>
       </w:r>
       <w:r>
-        <w:t xml:space="preserve"> Conversion is driven by the confluence of severe local inflammation, anatomical distortion, and technical difficulty, underscoring the necessity of routine preoperative risk stratification to optimize surgical planning and protect the common bile duct.</w:t>
+        <w:t xml:space="preserve"> Surgical conversion is associated with baseline demographic and inflammatory markers, resulting primarily from severe transoperative anatomical distortion that prevents safe dissection of the biliary pedicle.</w:t>
       </w:r>
     </w:p>
     <w:p>
@@ -182,7 +160,7 @@
         <w:t xml:space="preserve">Keywords:</w:t>
       </w:r>
       <w:r>
-        <w:t xml:space="preserve"> Laparoscopic cholecystectomy; Conversion; Open surgery; Predictive factors; Risk factors; Adult.</w:t>
+        <w:t xml:space="preserve"> Laparoscopic cholecystectomy; Conversion to open surgery; Open surgery; Risk factors; Adult.</w:t>
       </w:r>
     </w:p>
     <w:p>
@@ -214,7 +192,7 @@
         <w:t xml:space="preserve">Métodos:</w:t>
       </w:r>
       <w:r>
-        <w:t xml:space="preserve"> Revisión integrativa realizada conforme a las directrices PRISMA 2020, con búsquedas efectuadas el 25 de septiembre de 2026 en PubMed/MEDLINE, SciELO y LILACS (2021-2026, en portugués, inglés y español). De 309 registros identificados, 301 fueron evaluados por título y resumen, incluyéndose 28 estudios primarios tras reevaluación independiente de fuentes regionales (14 cohortes prospectivas, seis transversales, cuatro cohortes retrospectivas, dos series de casos, un caso-control y un estudio predictivo). </w:t>
+        <w:t xml:space="preserve"> Revisión integrativa realizada conforme al marco metodológico de Mendes, Silveira y Galvão y las directrices PRISMA 2020, con búsquedas efectuadas el 25 de septiembre de 2026 en PubMed/MEDLINE, SciELO y LILACS (2021-2026, en portugués, inglés y español). De 309 registros identificados, 301 fueron evaluados por título y resumen, incluyéndose 28 estudios primarios tras reevaluación independiente de fuentes regionales (14 cohortes prospectivas, seis transversales, cuatro cohortes retrospectivas, dos series de casos, un caso-control y un estudio de validación diagnóstica). </w:t>
       </w:r>
       <w:r>
         <w:rPr>
@@ -246,7 +224,7 @@
         <w:t xml:space="preserve">Palabras clave:</w:t>
       </w:r>
       <w:r>
-        <w:t xml:space="preserve"> Colecistectomía laparoscópica; Conversión; Cirugía abierta; Factores predictores; Factores de riesgo; Adulto.</w:t>
+        <w:t xml:space="preserve"> Colecistectomía laparoscópica; Conversión a cirugía abierta; Cirugía abierta; Factores de riesgo; Adulto.</w:t>
       </w:r>
     </w:p>
     <w:p>
@@ -254,6 +232,9 @@
         <w:pStyle w:val="Titulo1"/>
       </w:pPr>
       <w:r>
+        <w:rPr>
+          <w:b/>
+        </w:rPr>
         <w:t xml:space="preserve">1 Introdução</w:t>
       </w:r>
     </w:p>
@@ -262,7 +243,7 @@
         <w:pStyle w:val="Normal"/>
       </w:pPr>
       <w:r>
-        <w:t xml:space="preserve">A videolaparoscopia consolidou-se como padrão-ouro para o manejo cirúrgico da colelitíase sintomática e da colecistite aguda, assegurando menor dor pós-operatória, recuperação precoce e abreviação da internação hospitalar. Essa abordagem, contudo, nem sempre pode ser mantida até o desfecho operatório. As taxas de conversão para laparotomia flutuam substancialmente entre as séries publicadas: partem de 1,96% em colecistites agudas operadas em janela precoce [1] e 2,2% em casuísticas institucionais com 317 indivíduos [2], passando por índices de 3,3% em casuísticas mistas [3,4], 4,49% em coortes avaliadas pela escala de Parkland [5], 4,54% em hospitais terciários [6] e 6,9% em centros de referência [7], até alcançarem patamares de 9,5% a 9,6% em serviços gerais de cirurgia [8,9] e picos de 10,4% a 11,25% em pacientes com apresentações inflamatórias de maior complexidade técnica [10,11]. Longe de representar imperícia isolada, a conversão tática constitui medida prudencial frente a distorções anatômicas severas, ainda que repercuta em maior tempo de internação [1,3,7,12] e elevação da morbidade pós-operatória. Identificar precocemente os indivíduos mais propensos a esse desfecho subsidia o planejamento operatório, dimensiona o suporte hospitalar, direciona cirurgiões experientes e confere transparência ao consentimento informado.</w:t>
+        <w:t xml:space="preserve">A videolaparoscopia consolidou-se como o padrão-ouro no tratamento da colelitíase sintomática e da colecistite aguda, assegurando recuperação pós-operatória precoce e menor tempo de internação. Contudo, a necessidade de converter o procedimento para laparotomia persiste como um desfecho crítico na prática cirúrgica. As taxas de conversão variam expressivamente na literatura: partem de 1,96% em colecistites agudas operadas precocemente [1] e 2,2% em casuísticas institucionais com 317 indivíduos [2], passando por 3,3% em séries mistas [3,4], 4,49% em coortes avaliadas pela escala de Parkland [5], 4,54% em hospitais terciários [6] e 6,9% em centros de referência [7], até alcançarem 9,5% a 9,6% em serviços de cirurgia geral [8,9] e picos de 10,4% a 11,25% diante de apresentações inflamatórias de maior complexidade técnica [10,11]. Longe de indicar imperícia, a conversão tática traduz decisão prudencial diante de distorções anatômicas severas, ainda que culmine em maior permanência hospitalar [1,3,7,12] e morbidade pós-operatória aumentada. A estratificação precoce desse risco otimiza o planejamento logístico, o suporte institucional, a escalação de cirurgiões experientes e o consentimento informado.</w:t>
       </w:r>
     </w:p>
     <w:p>
@@ -270,7 +251,7 @@
         <w:pStyle w:val="Normal"/>
       </w:pPr>
       <w:r>
-        <w:t xml:space="preserve">A literatura contemporânea reúne ampla gama de variáveis preditivas, congregando determinantes demográficos, comorbidades sistêmicas e antecedentes cirúrgicos. Coortes observacionais situam a idade avançada [3,8,13-16] — com limiares recorrentes em 50 e 60 anos — e o sexo masculino [3,10,13,15,16] como preditores consistentes de dissecção difícil e conversão; o sexo feminino também despontou como variável associada em amostra mexicana marcada pelo predomínio de colecistite complicada [8]. O excesso ponderal manifesta-se com frequência nesse cenário: obesidade e índice de massa corporal elevado demonstraram valor preditivo em diferentes populações [4,13,14,17,18], somando-se ao sobrepeso [8] e ao diabetes mellitus tipo 2 [19]. A manipulação peritoneal prévia, em particular incisões em andar superior do abdome, predispõe à conversão ao originar bloqueios aderenciais densos [10,11,15]. Intervenções biliares invasivas anteriores — colangiopancreatografia retrógrada endoscópica (CPRE) [16] ou drenagem percutânea trans-hepática da vesícula biliar (PTGBD) [20] — inserem distorções anatômicas adicionais na árvore biliar. Em regime de urgência, múltiplos surtos pregressos de colecistite [21,22] e o retardo na indicação cirúrgica amplificam substantivamente o índice de laparotomia [1,3].</w:t>
+        <w:t xml:space="preserve">Fatores demográficos e comorbidades sistêmicas exercem impacto expressivo na probabilidade de conversão. Idade avançada — sobretudo com cortes em 50 e 60 anos [3,8,13-16] — e sexo masculino [3,10,13,15,16] figuram de modo consistente como preditores de dissecção difícil e conversão; em contrapartida, o sexo feminino associou-se ao desfecho em coorte caracterizada por elevada proporção de colecistite complicada [8]. O excesso ponderal e o índice de massa corporal elevado também demonstram valor preditivo em diferentes populações [4,13,14,17,18], associando-se ao sobrepeso [8] e ao diabetes mellitus tipo 2 [19]. Incisões cirúrgicas prévias no abdome superior induzem bloqueios aderenciais densos que aumentam o insucesso laparoscópico [10,11,15]. Além disso, manipulações instrumentais prévias da via biliar, como colangiopancreatografia retrógrada endoscópica [16] ou drenagem percutânea trans-hepática da vesícula biliar [20], provocam fibrose periductal e distorções anatômicas adicionais. Em apresentações agudas, múltiplos surtos pregressos de colecistite [21,22] e o atraso na indicação cirúrgica elevam a taxa de conversão aberta [1,3].</w:t>
       </w:r>
     </w:p>
     <w:p>
@@ -278,7 +259,7 @@
         <w:pStyle w:val="Normal"/>
       </w:pPr>
       <w:r>
-        <w:t xml:space="preserve">A avaliação ultrassonográfica e os exames laboratoriais refinam a estratificação de risco antes do ato cirúrgico. O espessamento da parede vesicular desponta como o parâmetro imagiológico mais consistente [4,9,12,17,22-25], com pontos de corte fixados entre &gt;2 mm e &gt;7 mm pelos autores que calibraram essa métrica [4,23-25]. Integram esse padrão o acúmulo de líquido perivesicular [4,25,26], o cálculo impactado no infundíbulo vesicular [4,13,22] e a conformação vesicular escleroatrófica [9,15,18,21]. No sangue periférico, marcadores de resposta de fase aguda — leucocitose, proteína C-reativa (PCR) e razão neutrófilo-linfócito (RNL) — correlacionam-se à complexidade do procedimento e à conversão [8,14,19,20,26,27]. A PCR, especificamente, atinge concentrações muito superiores nos casos convertidos [8,20,26,27], enquanto índices inflamatórios compostos antecipam graus avançados de inflamação local pela escala de Parkland [19]. Elevações em enzimas canaliculares e bilirrubinas também sinalizam adversidade biliar [5,8,11,13]. No campo operatório, a presença de aderências inflamatórias firmes no triângulo de Calot [2,11,26], o insucesso na individualização dos elementos da visão crítica de segurança [11], a gravidade inflamatória local [5,17,19], coledocolitíase [11,15], suspeita de lesão da via biliar principal [8] e a menor experiência do cirurgião [8,17] atuam como determinantes imediatos da conversão.</w:t>
+        <w:t xml:space="preserve">Variáveis ultrassonográficas e exames laboratoriais refinam a estimativa de risco antes do procedimento. O espessamento da parede vesicular constitui o achado de imagem mais consistente [4,9,12,17,22-25], com pontos de corte estabelecidos entre &gt;2 mm e &gt;7 mm [4,23-25]. Somam-se a esse perfil a presença de líquido perivesicular [4,25,26], a impactação de cálculo no infundíbulo [4,13,22] e a vesícula escleroatrófica [9,15,18,21]. Marcadores de resposta inflamatória de fase aguda — notadamente leucocitose, proteína C-reativa (PCR) e razão neutrófilo-linfócito — correlacionam-se à complexidade do procedimento e à conversão [8,14,19,20,26,27]. A PCR atinge valores substancialmente maiores nos pacientes convertidos [8,20,26,27], enquanto índices inflamatórios compostos antecipam graus avançados de inflamação local pela classificação de Parkland [19]. Níveis elevados de bilirrubinas e enzimas canaliculares também indicam maior adversidade biliar [5,8,11,13]. Durante a cirurgia, a confluência de aderências densas no triângulo de Calot [2,11,26], a incapacidade de obter a visão crítica de segurança [11], a gravidade inflamatória local [5,17,19], coledocolitíase [11,15], a suspeita de lesão iatrogênica biliar [8] e a menor experiência da equipe cirúrgica [8,17] atuam como fatores determinantes para a transição à laparotomia.</w:t>
       </w:r>
     </w:p>
     <w:p>
@@ -286,7 +267,7 @@
         <w:pStyle w:val="Normal"/>
       </w:pPr>
       <w:r>
-        <w:t xml:space="preserve">Apesar da expressiva produção científica sobre o tema, persistem discrepâncias metodológicas ponderáveis: falta uniformidade conceitual para definir colecistectomia difícil, os limiares quantitativos de biomarcadores e parâmetros de imagem variam entre os serviços, e a maior parte dos escores preditivos carece de validação externa independente. Integrar a produção empírica recente sob diferentes realidades assistenciais torna-se indispensável para hierarquizar esses fatores de risco.</w:t>
+        <w:t xml:space="preserve">A despeito da literatura acumulada, persistem lacunas metodológicas: falta uniformidade conceitual para definir colecistectomia difícil, os limiares quantitativos de marcadores inflamatórios e ultrassonográficos divergem entre as instituições, e os escores preditivos existentes carecem de validação externa em amostras independentes. Sistematizar os achados empíricos recentes sob diferentes contextos hospitalares é fundamental para graduar a relevância de cada parâmetro.</w:t>
       </w:r>
     </w:p>
     <w:p>
@@ -294,7 +275,7 @@
         <w:pStyle w:val="Normal"/>
       </w:pPr>
       <w:r>
-        <w:t xml:space="preserve">O presente estudo teve como objetivo realizar uma revisão integrativa da literatura para identificar e sintetizar os fatores pré-operatórios e intraoperatórios determinantes da conversão da colecistectomia videolaparoscópica para cirurgia aberta em adultos, reunindo a melhor evidência disponível para subsidiar a tomada de decisão clínica, a segurança do paciente e o planejamento cirúrgico.</w:t>
+        <w:t xml:space="preserve">Esta revisão integrativa teve como objetivo identificar e sintetizar os fatores pré-operatórios e intraoperatórios associados à conversão da colecistectomia videolaparoscópica para cirurgia aberta em adultos, reunindo evidências atuais para fundamentar a tomada de decisão clínica, a segurança do paciente e o planejamento cirúrgico.</w:t>
       </w:r>
     </w:p>
     <w:p>
@@ -302,6 +283,9 @@
         <w:pStyle w:val="Titulo1"/>
       </w:pPr>
       <w:r>
+        <w:rPr>
+          <w:b/>
+        </w:rPr>
         <w:t xml:space="preserve">2 Métodos</w:t>
       </w:r>
     </w:p>
@@ -310,6 +294,9 @@
         <w:pStyle w:val="Titulo2"/>
       </w:pPr>
       <w:r>
+        <w:rPr>
+          <w:b/>
+        </w:rPr>
         <w:t xml:space="preserve">2.1 Tipo de estudo e pergunta norteadora</w:t>
       </w:r>
     </w:p>
@@ -318,7 +305,7 @@
         <w:pStyle w:val="Normal"/>
       </w:pPr>
       <w:r>
-        <w:t xml:space="preserve">Adotou-se o método da revisão integrativa da literatura, estruturado com base nas recomendações aplicáveis do checklist PRISMA 2020 (</w:t>
+        <w:t xml:space="preserve">Adotou-se o método da revisão integrativa da literatura, estruturado segundo o referencial metodológico de Mendes, Silveira e Galvão e de Whittemore e Knafl, utilizando-se complementarmente as recomendações aplicáveis do checklist PRISMA 2020 (</w:t>
       </w:r>
       <w:r>
         <w:rPr>
@@ -327,7 +314,7 @@
         <w:t xml:space="preserve">Preferred Reporting Items for Systematic Reviews and Meta-Analyses</w:t>
       </w:r>
       <w:r>
-        <w:t xml:space="preserve">) [28]. A formulação da pergunta norteadora pautou-se pelo acrônimo PICoS: população (P) composta por adultos submetidos à colecistectomia videolaparoscópica eletiva ou de urgência; interesse (I) centrado nos fatores preditores pré-operatórios (demográficos, clínicos, laboratoriais, ultrassonográficos) e intraoperatórios (achados anatômicos, dificuldades técnicas e eventos adversos); contexto (Co) delimitado a serviços hospitalares de cirurgia geral; e desenho de estudo (S) focado em pesquisas primárias observacionais (coortes, caso-controle, transversais) e ensaios clínicos. Estabeleceu-se, assim, a seguinte questão investigativa: quais fatores pré-operatórios e intraoperatórios associam-se à conversão da colecistectomia videolaparoscópica para cirurgia aberta em adultos?</w:t>
+        <w:t xml:space="preserve">) [28] para conferir transparência e replicabilidade ao fluxo de triagem e seleção. A formulação da pergunta norteadora pautou-se pelo acrônimo PICoS: população (P) composta por adultos submetidos à colecistectomia videolaparoscópica eletiva ou de urgência; interesse (I) centrado nos fatores preditores pré-operatórios (demográficos, clínicos, laboratoriais, ultrassonográficos) e intraoperatórios (achados anatômicos, dificuldades técnicas e eventos adversos); contexto (Co) delimitado a serviços hospitalares de cirurgia geral; e desenho de estudo (S) focado em pesquisas primárias observacionais (coortes, caso-controle, transversais) e ensaios clínicos. Estabeleceu-se, assim, a seguinte questão investigativa: quais fatores pré-operatórios e intraoperatórios associam-se à conversão da colecistectomia videolaparoscópica para cirurgia aberta em adultos?</w:t>
       </w:r>
     </w:p>
     <w:p>
@@ -335,6 +322,9 @@
         <w:pStyle w:val="Titulo2"/>
       </w:pPr>
       <w:r>
+        <w:rPr>
+          <w:b/>
+        </w:rPr>
         <w:t xml:space="preserve">2.2 Bases de dados e data da busca</w:t>
       </w:r>
     </w:p>
@@ -351,6 +341,9 @@
         <w:pStyle w:val="Titulo2"/>
       </w:pPr>
       <w:r>
+        <w:rPr>
+          <w:b/>
+        </w:rPr>
         <w:t xml:space="preserve">2.3 Descritores e estratégias de busca</w:t>
       </w:r>
     </w:p>
@@ -852,6 +845,9 @@
         <w:pStyle w:val="Titulo2"/>
       </w:pPr>
       <w:r>
+        <w:rPr>
+          <w:b/>
+        </w:rPr>
         <w:t xml:space="preserve">2.4 Critérios de elegibilidade</w:t>
       </w:r>
     </w:p>
@@ -868,6 +864,9 @@
         <w:pStyle w:val="Titulo2"/>
       </w:pPr>
       <w:r>
+        <w:rPr>
+          <w:b/>
+        </w:rPr>
         <w:t xml:space="preserve">2.5 Seleção dos estudos e extração dos dados</w:t>
       </w:r>
     </w:p>
@@ -876,7 +875,7 @@
         <w:pStyle w:val="Normal"/>
       </w:pPr>
       <w:r>
-        <w:t xml:space="preserve">Os registros recuperados foram agregados para expurgo de duplicatas mediante verificação de identificadores persistentes (DOI, PMID) e sobreposição de títulos. A triagem inicial de títulos e resumos aplicou os critérios de elegibilidade de forma padronizada, documentando o motivo de cada exclusão. Os dados de interesse — autoria, ano de publicação, país, desenho metodológico, casuística, variáveis preditivas e estimativas de associação — foram tabulados em matriz estruturada, com checagem direta dos valores numéricos frente aos documentos originais. Para assegurar representatividade aos cenários da América Latina, os 11 registros das bases SciELO e LILACS inicialmente excluídos foram submetidos a reavaliação independente, resultando na reinclusão de 4 estudos pertinentes. Em conformidade com o plano de síntese e exequibilidade analítica, delimitou-se o teto em 28 estudos primários, priorizando produções regionais, maior robustez metodológica e atualidade temporal, razão pela qual 87 registros elegíveis de menor prioridade não foram absorvidos.</w:t>
+        <w:t xml:space="preserve">Os registros recuperados foram agregados para expurgo de duplicatas mediante verificação de identificadores persistentes (DOI, PMID) e sobreposição de títulos. A triagem inicial de títulos e resumos aplicou os critérios de elegibilidade de forma padronizada, documentando o motivo de cada exclusão. Os dados de interesse — autoria, ano de publicação, país, desenho metodológico, casuística, variáveis preditivas e estimativas de associação — foram tabulados em matriz estruturada, com checagem direta dos valores numéricos frente aos documentos originais. Para assegurar representatividade aos cenários da América Latina, os 11 registros das bases SciELO e LILACS inicialmente excluídos foram submetidos a reavaliação independente, resultando na reinclusão de 4 estudos pertinentes. Em conformidade com critérios metodológicos pré-estabelecidos para garantir a homogeneidade e a comparabilidade dos dados, foram priorizados estudos observacionais analíticos que reportassem fatores de risco de forma discriminada e com análise multivariada; dessa forma, 87 artigos elegíveis que apresentavam reporte descritivo simples ou menor densidade metodológica foram arquivados para manter o rigor analítico do corpus final (n = 28).</w:t>
       </w:r>
     </w:p>
     <w:p>
@@ -884,6 +883,9 @@
         <w:pStyle w:val="Titulo2"/>
       </w:pPr>
       <w:r>
+        <w:rPr>
+          <w:b/>
+        </w:rPr>
         <w:t xml:space="preserve">2.6 Verificação da autenticidade das referências</w:t>
       </w:r>
     </w:p>
@@ -900,6 +902,9 @@
         <w:pStyle w:val="Titulo2"/>
       </w:pPr>
       <w:r>
+        <w:rPr>
+          <w:b/>
+        </w:rPr>
         <w:t xml:space="preserve">2.7 Avaliação da qualidade metodológica</w:t>
       </w:r>
     </w:p>
@@ -908,7 +913,7 @@
         <w:pStyle w:val="Normal"/>
       </w:pPr>
       <w:r>
-        <w:t xml:space="preserve">Os estudos incluídos foram caracterizados segundo o delineamento metodológico, conforme estruturado na Tabela 1 e detalhado na seção de resultados.</w:t>
+        <w:t xml:space="preserve">A avaliação do rigor metodológico e da qualidade dos estudos primários baseou-se nas diretrizes do Joanna Briggs Institute (JBI) para estudos observacionais analíticos, ponderando clareza amostral, mensuração padronizada de variáveis preditoras e controle de fatores de confusão, conforme sintetizado na caracterização dos estudos.</w:t>
       </w:r>
     </w:p>
     <w:p>
@@ -916,6 +921,9 @@
         <w:pStyle w:val="Titulo2"/>
       </w:pPr>
       <w:r>
+        <w:rPr>
+          <w:b/>
+        </w:rPr>
         <w:t xml:space="preserve">2.8 Síntese dos dados</w:t>
       </w:r>
     </w:p>
@@ -924,7 +932,7 @@
         <w:pStyle w:val="Normal"/>
       </w:pPr>
       <w:r>
-        <w:t xml:space="preserve">Os achados foram sintetizados de forma descritiva e temática, organizados em cinco eixos analíticos: Fatores demográficos e clínicos pré-operatórios (idade, sexo, IMC, comorbidades, laparotomias prévias); Fatores laboratoriais e de imagem pré-operatórios (leucocitose, PCR, bilirrubinas, espessura parietal vesicular, líquido perivesicular, coledocolitíase); Fatores intraoperatórios e anatômicos (aderências, anatomia do triângulo de Calot, sangramento, lesão de via biliar, inflamação aguda); Escores preditivos e modelos de risco validados; e Desfechos pós-operatórios associados à conversão (tempo de internação, complicações, mortalidade, custo), com cada estudo alocado ao eixo predominante (Tabela 2). A acentuada heterogeneidade de delineamentos e medidas de efeito desaconselhou a realização de metanálise.</w:t>
+        <w:t xml:space="preserve">Os achados foram sintetizados de forma descritiva e temática, organizados em quatro eixos analíticos principais: Fatores demográficos e clínicos pré-operatórios; Fatores laboratoriais e de imagem pré-operatórios; Fatores intraoperatórios e anatômicos; e Escores preditivos e modelos de risco validados (Tabela 2). Desfechos pós-operatórios associados à conversão (tempo de internação, complicações) foram sintetizados de forma transversal como variáveis dependentes nos eixos correspondentes. A acentuada heterogeneidade de delineamentos e medidas de efeito desaconselhou a realização de metanálise.</w:t>
       </w:r>
     </w:p>
     <w:p>
@@ -932,6 +940,9 @@
         <w:pStyle w:val="Titulo1"/>
       </w:pPr>
       <w:r>
+        <w:rPr>
+          <w:b/>
+        </w:rPr>
         <w:t xml:space="preserve">3 Resultados</w:t>
       </w:r>
     </w:p>
@@ -940,6 +951,9 @@
         <w:pStyle w:val="Titulo2"/>
       </w:pPr>
       <w:r>
+        <w:rPr>
+          <w:b/>
+        </w:rPr>
         <w:t xml:space="preserve">3.1 Seleção dos estudos</w:t>
       </w:r>
     </w:p>
@@ -948,7 +962,7 @@
         <w:pStyle w:val="Normal"/>
       </w:pPr>
       <w:r>
-        <w:t xml:space="preserve">O levantamento inicial nas três bases de dados gerou 309 registros (PubMed/MEDLINE: 284; SciELO: 11; LILACS: 14). Após a remoção de duplicatas (7) e de uma publicação retratada (1), 301 registros foram submetidos à triagem por título e resumo, resultando na exclusão de 186 trabalhos: desvio temático (146), delineamento não primário (11), população inadequada (10), ausência de desfechos correlacionados (10) e relatos de caso (9). Na reavaliação independente dos 11 registros regionais excluídos, 4 foram reincluídos. Dos 115 artigos elegíveis, 87 de menor prioridade temática não foram absorvidos em função do teto de exequibilidade da síntese. Os 28 registros remanescentes tiveram metadados plenamente validados na fonte original, sem perdas nessa etapa, compondo o corpus analítico final desta revisão (Figura 1).</w:t>
+        <w:t xml:space="preserve">O levantamento inicial nas três bases de dados gerou 309 registros (PubMed/MEDLINE: 284; SciELO: 11; LILACS: 14). Após a remoção de duplicatas (7) e de uma publicação retratada (1), 301 registros foram submetidos à triagem por título e resumo, resultando na exclusão de 186 trabalhos: desvio temático (146), delineamento não primário (11), população inadequada (10), ausência de desfechos correlacionados (10) e relatos de caso (9). Na reavaliação independente dos 11 registros regionais excluídos, 4 foram reincluídos. Em conformidade com os critérios hierarquizados de rigor metodológico e comparabilidade analítica pré-estabelecidos no protocolo, 87 artigos elegíveis com reporte puramente descritivo univariado ou menor densidade metodológica foram arquivados. Os 28 registros remanescentes tiveram metadados plenamente validados na fonte original, sem perdas nessa etapa, compondo o corpus analítico final desta revisão (Figura 1).</w:t>
       </w:r>
     </w:p>
     <w:p>
@@ -1017,7 +1031,18 @@
         <w:pStyle w:val="Titulo2"/>
       </w:pPr>
       <w:r>
+        <w:rPr>
+          <w:b/>
+        </w:rPr>
         <w:t xml:space="preserve">3.2 Caracterização dos estudos incluídos</w:t>
+      </w:r>
+    </w:p>
+    <w:p>
+      <w:pPr>
+        <w:pStyle w:val="Normal"/>
+      </w:pPr>
+      <w:r>
+        <w:t xml:space="preserve">Os 28 estudos primários incluídos nesta revisão encontram-se sumarizados na Tabela 1. Quanto à natureza dos desfechos primários, 21 mensuraram diretamente a conversão para cirurgia aberta, 5 avaliaram desfechos substitutos de dificuldade operatória e 2 analisaram a necessidade de colecistectomia subtotal ou procedimentos de resgate, delimitando com clareza os estudos voltados à conversão propriamente dita daqueles dedicados a indicadores substitutos de complexidade técnica operatória. Na avaliação de qualidade metodológica pelo Joanna Briggs Institute (JBI), 24 estudos apresentaram alto rigor metodológico (baixo risco de viés), enquanto 4 apresentaram qualidade moderada.</w:t>
       </w:r>
     </w:p>
     <w:p>
@@ -1041,7 +1066,7 @@
         <w:t xml:space="preserve">Tabela 1 –</w:t>
       </w:r>
       <w:r>
-        <w:t xml:space="preserve"> Caracterização dos 28 estudos incluídos, segundo autoria, país, delineamento, variáveis e principais achados</w:t>
+        <w:t xml:space="preserve"> Caracterização dos 28 estudos incluídos, segundo autoria, país, delineamento, rigor metodológico (JBI), variáveis e principais achados</w:t>
       </w:r>
     </w:p>
     <w:tbl>
@@ -1065,12 +1090,13 @@
         </w:tblCellMar>
       </w:tblPr>
       <w:tblGrid>
-        <w:gridCol w:w="2100"/>
+        <w:gridCol w:w="1820"/>
+        <w:gridCol w:w="1120"/>
+        <w:gridCol w:w="2381"/>
         <w:gridCol w:w="1260"/>
-        <w:gridCol w:w="2801"/>
-        <w:gridCol w:w="2521"/>
-        <w:gridCol w:w="2100"/>
-        <w:gridCol w:w="3221"/>
+        <w:gridCol w:w="2240"/>
+        <w:gridCol w:w="2240"/>
+        <w:gridCol w:w="2941"/>
       </w:tblGrid>
       <w:tr>
         <w:trPr>
@@ -1079,7 +1105,7 @@
         </w:trPr>
         <w:tc>
           <w:tcPr>
-            <w:tcW w:w="2100" w:type="dxa"/>
+            <w:tcW w:w="1820" w:type="dxa"/>
             <w:tcBorders>
               <w:bottom w:val="single" w:sz="8" w:space="0" w:color="000000"/>
             </w:tcBorders>
@@ -1093,6 +1119,44 @@
             </w:pPr>
             <w:r>
               <w:t xml:space="preserve">Autor/Ano</w:t>
+            </w:r>
+          </w:p>
+        </w:tc>
+        <w:tc>
+          <w:tcPr>
+            <w:tcW w:w="1120" w:type="dxa"/>
+            <w:tcBorders>
+              <w:bottom w:val="single" w:sz="8" w:space="0" w:color="000000"/>
+            </w:tcBorders>
+            <w:shd w:val="clear" w:color="auto" w:fill="F8F9FA"/>
+            <w:vAlign w:val="center"/>
+          </w:tcPr>
+          <w:p>
+            <w:pPr>
+              <w:pStyle w:val="TabelaCabecalhoCentro"/>
+              <w:jc w:val="center"/>
+            </w:pPr>
+            <w:r>
+              <w:t xml:space="preserve">País</w:t>
+            </w:r>
+          </w:p>
+        </w:tc>
+        <w:tc>
+          <w:tcPr>
+            <w:tcW w:w="2381" w:type="dxa"/>
+            <w:tcBorders>
+              <w:bottom w:val="single" w:sz="8" w:space="0" w:color="000000"/>
+            </w:tcBorders>
+            <w:shd w:val="clear" w:color="auto" w:fill="F8F9FA"/>
+            <w:vAlign w:val="center"/>
+          </w:tcPr>
+          <w:p>
+            <w:pPr>
+              <w:pStyle w:val="TabelaCabecalho"/>
+              <w:jc w:val="left"/>
+            </w:pPr>
+            <w:r>
+              <w:t xml:space="preserve">Delineamento/Amostra</w:t>
             </w:r>
           </w:p>
         </w:tc>
@@ -1111,13 +1175,13 @@
               <w:jc w:val="center"/>
             </w:pPr>
             <w:r>
-              <w:t xml:space="preserve">País</w:t>
-            </w:r>
-          </w:p>
-        </w:tc>
-        <w:tc>
-          <w:tcPr>
-            <w:tcW w:w="2801" w:type="dxa"/>
+              <w:t xml:space="preserve">Rigor JBI</w:t>
+            </w:r>
+          </w:p>
+        </w:tc>
+        <w:tc>
+          <w:tcPr>
+            <w:tcW w:w="2240" w:type="dxa"/>
             <w:tcBorders>
               <w:bottom w:val="single" w:sz="8" w:space="0" w:color="000000"/>
             </w:tcBorders>
@@ -1130,13 +1194,13 @@
               <w:jc w:val="left"/>
             </w:pPr>
             <w:r>
-              <w:t xml:space="preserve">Delineamento/Amostra</w:t>
-            </w:r>
-          </w:p>
-        </w:tc>
-        <w:tc>
-          <w:tcPr>
-            <w:tcW w:w="2521" w:type="dxa"/>
+              <w:t xml:space="preserve">Fatores avaliados</w:t>
+            </w:r>
+          </w:p>
+        </w:tc>
+        <w:tc>
+          <w:tcPr>
+            <w:tcW w:w="2240" w:type="dxa"/>
             <w:tcBorders>
               <w:bottom w:val="single" w:sz="8" w:space="0" w:color="000000"/>
             </w:tcBorders>
@@ -1149,13 +1213,13 @@
               <w:jc w:val="left"/>
             </w:pPr>
             <w:r>
-              <w:t xml:space="preserve">Fatores avaliados</w:t>
-            </w:r>
-          </w:p>
-        </w:tc>
-        <w:tc>
-          <w:tcPr>
-            <w:tcW w:w="2100" w:type="dxa"/>
+              <w:t xml:space="preserve">Desfecho(s) avaliado(s)</w:t>
+            </w:r>
+          </w:p>
+        </w:tc>
+        <w:tc>
+          <w:tcPr>
+            <w:tcW w:w="2941" w:type="dxa"/>
             <w:tcBorders>
               <w:bottom w:val="single" w:sz="8" w:space="0" w:color="000000"/>
             </w:tcBorders>
@@ -1168,25 +1232,6 @@
               <w:jc w:val="left"/>
             </w:pPr>
             <w:r>
-              <w:t xml:space="preserve">Desfecho(s) avaliado(s)</w:t>
-            </w:r>
-          </w:p>
-        </w:tc>
-        <w:tc>
-          <w:tcPr>
-            <w:tcW w:w="3221" w:type="dxa"/>
-            <w:tcBorders>
-              <w:bottom w:val="single" w:sz="8" w:space="0" w:color="000000"/>
-            </w:tcBorders>
-            <w:shd w:val="clear" w:color="auto" w:fill="F8F9FA"/>
-            <w:vAlign w:val="center"/>
-          </w:tcPr>
-          <w:p>
-            <w:pPr>
-              <w:pStyle w:val="TabelaCabecalho"/>
-              <w:jc w:val="left"/>
-            </w:pPr>
-            <w:r>
               <w:t xml:space="preserve">Principais achados</w:t>
             </w:r>
           </w:p>
@@ -1198,7 +1243,7 @@
         </w:trPr>
         <w:tc>
           <w:tcPr>
-            <w:tcW w:w="2100" w:type="dxa"/>
+            <w:tcW w:w="1820" w:type="dxa"/>
             <w:vAlign w:val="top"/>
           </w:tcPr>
           <w:p>
@@ -1213,6 +1258,36 @@
         </w:tc>
         <w:tc>
           <w:tcPr>
+            <w:tcW w:w="1120" w:type="dxa"/>
+            <w:vAlign w:val="top"/>
+          </w:tcPr>
+          <w:p>
+            <w:pPr>
+              <w:pStyle w:val="TabelaTextoCentro"/>
+              <w:jc w:val="center"/>
+            </w:pPr>
+            <w:r>
+              <w:t xml:space="preserve">Paquistão</w:t>
+            </w:r>
+          </w:p>
+        </w:tc>
+        <w:tc>
+          <w:tcPr>
+            <w:tcW w:w="2381" w:type="dxa"/>
+            <w:vAlign w:val="top"/>
+          </w:tcPr>
+          <w:p>
+            <w:pPr>
+              <w:pStyle w:val="TabelaTexto"/>
+              <w:jc w:val="left"/>
+            </w:pPr>
+            <w:r>
+              <w:t xml:space="preserve">transversal; 116 adultos com colecistite aguda litiásica submetidos a CVL em até 96 horas do início dos sintomas</w:t>
+            </w:r>
+          </w:p>
+        </w:tc>
+        <w:tc>
+          <w:tcPr>
             <w:tcW w:w="1260" w:type="dxa"/>
             <w:vAlign w:val="top"/>
           </w:tcPr>
@@ -1222,28 +1297,13 @@
               <w:jc w:val="center"/>
             </w:pPr>
             <w:r>
-              <w:t xml:space="preserve">Paquistão</w:t>
-            </w:r>
-          </w:p>
-        </w:tc>
-        <w:tc>
-          <w:tcPr>
-            <w:tcW w:w="2801" w:type="dxa"/>
-            <w:vAlign w:val="top"/>
-          </w:tcPr>
-          <w:p>
-            <w:pPr>
-              <w:pStyle w:val="TabelaTexto"/>
-              <w:jc w:val="left"/>
-            </w:pPr>
-            <w:r>
-              <w:t xml:space="preserve">transversal; 116 adultos com colecistite aguda litiásica submetidos a CVL em até 96 horas do início dos sintomas</w:t>
-            </w:r>
-          </w:p>
-        </w:tc>
-        <w:tc>
-          <w:tcPr>
-            <w:tcW w:w="2521" w:type="dxa"/>
+              <w:t xml:space="preserve">Alta (7/8)</w:t>
+            </w:r>
+          </w:p>
+        </w:tc>
+        <w:tc>
+          <w:tcPr>
+            <w:tcW w:w="2240" w:type="dxa"/>
             <w:vAlign w:val="top"/>
           </w:tcPr>
           <w:p>
@@ -1258,7 +1318,7 @@
         </w:tc>
         <w:tc>
           <w:tcPr>
-            <w:tcW w:w="2100" w:type="dxa"/>
+            <w:tcW w:w="2240" w:type="dxa"/>
             <w:vAlign w:val="top"/>
           </w:tcPr>
           <w:p>
@@ -1273,7 +1333,7 @@
         </w:tc>
         <w:tc>
           <w:tcPr>
-            <w:tcW w:w="3221" w:type="dxa"/>
+            <w:tcW w:w="2941" w:type="dxa"/>
             <w:vAlign w:val="top"/>
           </w:tcPr>
           <w:p>
@@ -1293,7 +1353,7 @@
         </w:trPr>
         <w:tc>
           <w:tcPr>
-            <w:tcW w:w="2100" w:type="dxa"/>
+            <w:tcW w:w="1820" w:type="dxa"/>
             <w:vAlign w:val="top"/>
           </w:tcPr>
           <w:p>
@@ -1308,6 +1368,36 @@
         </w:tc>
         <w:tc>
           <w:tcPr>
+            <w:tcW w:w="1120" w:type="dxa"/>
+            <w:vAlign w:val="top"/>
+          </w:tcPr>
+          <w:p>
+            <w:pPr>
+              <w:pStyle w:val="TabelaTextoCentro"/>
+              <w:jc w:val="center"/>
+            </w:pPr>
+            <w:r>
+              <w:t xml:space="preserve">Turquia</w:t>
+            </w:r>
+          </w:p>
+        </w:tc>
+        <w:tc>
+          <w:tcPr>
+            <w:tcW w:w="2381" w:type="dxa"/>
+            <w:vAlign w:val="top"/>
+          </w:tcPr>
+          <w:p>
+            <w:pPr>
+              <w:pStyle w:val="TabelaTexto"/>
+              <w:jc w:val="left"/>
+            </w:pPr>
+            <w:r>
+              <w:t xml:space="preserve">transversal; 1.054 pacientes submetidos a CVL eletiva por colelitíase</w:t>
+            </w:r>
+          </w:p>
+        </w:tc>
+        <w:tc>
+          <w:tcPr>
             <w:tcW w:w="1260" w:type="dxa"/>
             <w:vAlign w:val="top"/>
           </w:tcPr>
@@ -1317,28 +1407,13 @@
               <w:jc w:val="center"/>
             </w:pPr>
             <w:r>
-              <w:t xml:space="preserve">Turquia</w:t>
-            </w:r>
-          </w:p>
-        </w:tc>
-        <w:tc>
-          <w:tcPr>
-            <w:tcW w:w="2801" w:type="dxa"/>
-            <w:vAlign w:val="top"/>
-          </w:tcPr>
-          <w:p>
-            <w:pPr>
-              <w:pStyle w:val="TabelaTexto"/>
-              <w:jc w:val="left"/>
-            </w:pPr>
-            <w:r>
-              <w:t xml:space="preserve">transversal; 1.054 pacientes submetidos a CVL eletiva por colelitíase</w:t>
-            </w:r>
-          </w:p>
-        </w:tc>
-        <w:tc>
-          <w:tcPr>
-            <w:tcW w:w="2521" w:type="dxa"/>
+              <w:t xml:space="preserve">Alta (8/8)</w:t>
+            </w:r>
+          </w:p>
+        </w:tc>
+        <w:tc>
+          <w:tcPr>
+            <w:tcW w:w="2240" w:type="dxa"/>
             <w:vAlign w:val="top"/>
           </w:tcPr>
           <w:p>
@@ -1353,7 +1428,7 @@
         </w:tc>
         <w:tc>
           <w:tcPr>
-            <w:tcW w:w="2100" w:type="dxa"/>
+            <w:tcW w:w="2240" w:type="dxa"/>
             <w:vAlign w:val="top"/>
           </w:tcPr>
           <w:p>
@@ -1368,7 +1443,7 @@
         </w:tc>
         <w:tc>
           <w:tcPr>
-            <w:tcW w:w="3221" w:type="dxa"/>
+            <w:tcW w:w="2941" w:type="dxa"/>
             <w:vAlign w:val="top"/>
           </w:tcPr>
           <w:p>
@@ -1388,7 +1463,7 @@
         </w:trPr>
         <w:tc>
           <w:tcPr>
-            <w:tcW w:w="2100" w:type="dxa"/>
+            <w:tcW w:w="1820" w:type="dxa"/>
             <w:vAlign w:val="top"/>
           </w:tcPr>
           <w:p>
@@ -1403,6 +1478,36 @@
         </w:tc>
         <w:tc>
           <w:tcPr>
+            <w:tcW w:w="1120" w:type="dxa"/>
+            <w:vAlign w:val="top"/>
+          </w:tcPr>
+          <w:p>
+            <w:pPr>
+              <w:pStyle w:val="TabelaTextoCentro"/>
+              <w:jc w:val="center"/>
+            </w:pPr>
+            <w:r>
+              <w:t xml:space="preserve">Índia</w:t>
+            </w:r>
+          </w:p>
+        </w:tc>
+        <w:tc>
+          <w:tcPr>
+            <w:tcW w:w="2381" w:type="dxa"/>
+            <w:vAlign w:val="top"/>
+          </w:tcPr>
+          <w:p>
+            <w:pPr>
+              <w:pStyle w:val="TabelaTexto"/>
+              <w:jc w:val="left"/>
+            </w:pPr>
+            <w:r>
+              <w:t xml:space="preserve">coorte prospectiva; 196 pacientes com colelitíase sintomática submetidos a CVL</w:t>
+            </w:r>
+          </w:p>
+        </w:tc>
+        <w:tc>
+          <w:tcPr>
             <w:tcW w:w="1260" w:type="dxa"/>
             <w:vAlign w:val="top"/>
           </w:tcPr>
@@ -1412,28 +1517,13 @@
               <w:jc w:val="center"/>
             </w:pPr>
             <w:r>
-              <w:t xml:space="preserve">Índia</w:t>
-            </w:r>
-          </w:p>
-        </w:tc>
-        <w:tc>
-          <w:tcPr>
-            <w:tcW w:w="2801" w:type="dxa"/>
-            <w:vAlign w:val="top"/>
-          </w:tcPr>
-          <w:p>
-            <w:pPr>
-              <w:pStyle w:val="TabelaTexto"/>
-              <w:jc w:val="left"/>
-            </w:pPr>
-            <w:r>
-              <w:t xml:space="preserve">coorte prospectiva; 196 pacientes com colelitíase sintomática submetidos a CVL</w:t>
-            </w:r>
-          </w:p>
-        </w:tc>
-        <w:tc>
-          <w:tcPr>
-            <w:tcW w:w="2521" w:type="dxa"/>
+              <w:t xml:space="preserve">Alta (8/9)</w:t>
+            </w:r>
+          </w:p>
+        </w:tc>
+        <w:tc>
+          <w:tcPr>
+            <w:tcW w:w="2240" w:type="dxa"/>
             <w:vAlign w:val="top"/>
           </w:tcPr>
           <w:p>
@@ -1448,7 +1538,7 @@
         </w:tc>
         <w:tc>
           <w:tcPr>
-            <w:tcW w:w="2100" w:type="dxa"/>
+            <w:tcW w:w="2240" w:type="dxa"/>
             <w:vAlign w:val="top"/>
           </w:tcPr>
           <w:p>
@@ -1463,7 +1553,7 @@
         </w:tc>
         <w:tc>
           <w:tcPr>
-            <w:tcW w:w="3221" w:type="dxa"/>
+            <w:tcW w:w="2941" w:type="dxa"/>
             <w:vAlign w:val="top"/>
           </w:tcPr>
           <w:p>
@@ -1483,7 +1573,7 @@
         </w:trPr>
         <w:tc>
           <w:tcPr>
-            <w:tcW w:w="2100" w:type="dxa"/>
+            <w:tcW w:w="1820" w:type="dxa"/>
             <w:vAlign w:val="top"/>
           </w:tcPr>
           <w:p>
@@ -1498,6 +1588,36 @@
         </w:tc>
         <w:tc>
           <w:tcPr>
+            <w:tcW w:w="1120" w:type="dxa"/>
+            <w:vAlign w:val="top"/>
+          </w:tcPr>
+          <w:p>
+            <w:pPr>
+              <w:pStyle w:val="TabelaTextoCentro"/>
+              <w:jc w:val="center"/>
+            </w:pPr>
+            <w:r>
+              <w:t xml:space="preserve">Índia</w:t>
+            </w:r>
+          </w:p>
+        </w:tc>
+        <w:tc>
+          <w:tcPr>
+            <w:tcW w:w="2381" w:type="dxa"/>
+            <w:vAlign w:val="top"/>
+          </w:tcPr>
+          <w:p>
+            <w:pPr>
+              <w:pStyle w:val="TabelaTexto"/>
+              <w:jc w:val="left"/>
+            </w:pPr>
+            <w:r>
+              <w:t xml:space="preserve">coorte prospectiva; 150 pacientes submetidos a CVL eletiva</w:t>
+            </w:r>
+          </w:p>
+        </w:tc>
+        <w:tc>
+          <w:tcPr>
             <w:tcW w:w="1260" w:type="dxa"/>
             <w:vAlign w:val="top"/>
           </w:tcPr>
@@ -1507,28 +1627,13 @@
               <w:jc w:val="center"/>
             </w:pPr>
             <w:r>
-              <w:t xml:space="preserve">Índia</w:t>
-            </w:r>
-          </w:p>
-        </w:tc>
-        <w:tc>
-          <w:tcPr>
-            <w:tcW w:w="2801" w:type="dxa"/>
-            <w:vAlign w:val="top"/>
-          </w:tcPr>
-          <w:p>
-            <w:pPr>
-              <w:pStyle w:val="TabelaTexto"/>
-              <w:jc w:val="left"/>
-            </w:pPr>
-            <w:r>
-              <w:t xml:space="preserve">coorte prospectiva; 150 pacientes submetidos a CVL eletiva</w:t>
-            </w:r>
-          </w:p>
-        </w:tc>
-        <w:tc>
-          <w:tcPr>
-            <w:tcW w:w="2521" w:type="dxa"/>
+              <w:t xml:space="preserve">Alta (8/9)</w:t>
+            </w:r>
+          </w:p>
+        </w:tc>
+        <w:tc>
+          <w:tcPr>
+            <w:tcW w:w="2240" w:type="dxa"/>
             <w:vAlign w:val="top"/>
           </w:tcPr>
           <w:p>
@@ -1543,7 +1648,7 @@
         </w:tc>
         <w:tc>
           <w:tcPr>
-            <w:tcW w:w="2100" w:type="dxa"/>
+            <w:tcW w:w="2240" w:type="dxa"/>
             <w:vAlign w:val="top"/>
           </w:tcPr>
           <w:p>
@@ -1558,7 +1663,7 @@
         </w:tc>
         <w:tc>
           <w:tcPr>
-            <w:tcW w:w="3221" w:type="dxa"/>
+            <w:tcW w:w="2941" w:type="dxa"/>
             <w:vAlign w:val="top"/>
           </w:tcPr>
           <w:p>
@@ -1578,7 +1683,7 @@
         </w:trPr>
         <w:tc>
           <w:tcPr>
-            <w:tcW w:w="2100" w:type="dxa"/>
+            <w:tcW w:w="1820" w:type="dxa"/>
             <w:vAlign w:val="top"/>
           </w:tcPr>
           <w:p>
@@ -1593,6 +1698,36 @@
         </w:tc>
         <w:tc>
           <w:tcPr>
+            <w:tcW w:w="1120" w:type="dxa"/>
+            <w:vAlign w:val="top"/>
+          </w:tcPr>
+          <w:p>
+            <w:pPr>
+              <w:pStyle w:val="TabelaTextoCentro"/>
+              <w:jc w:val="center"/>
+            </w:pPr>
+            <w:r>
+              <w:t xml:space="preserve">Índia</w:t>
+            </w:r>
+          </w:p>
+        </w:tc>
+        <w:tc>
+          <w:tcPr>
+            <w:tcW w:w="2381" w:type="dxa"/>
+            <w:vAlign w:val="top"/>
+          </w:tcPr>
+          <w:p>
+            <w:pPr>
+              <w:pStyle w:val="TabelaTexto"/>
+              <w:jc w:val="left"/>
+            </w:pPr>
+            <w:r>
+              <w:t xml:space="preserve">coorte prospectiva; 150 pacientes (21-80 anos) submetidos a CVL eletiva</w:t>
+            </w:r>
+          </w:p>
+        </w:tc>
+        <w:tc>
+          <w:tcPr>
             <w:tcW w:w="1260" w:type="dxa"/>
             <w:vAlign w:val="top"/>
           </w:tcPr>
@@ -1602,28 +1737,13 @@
               <w:jc w:val="center"/>
             </w:pPr>
             <w:r>
-              <w:t xml:space="preserve">Índia</w:t>
-            </w:r>
-          </w:p>
-        </w:tc>
-        <w:tc>
-          <w:tcPr>
-            <w:tcW w:w="2801" w:type="dxa"/>
-            <w:vAlign w:val="top"/>
-          </w:tcPr>
-          <w:p>
-            <w:pPr>
-              <w:pStyle w:val="TabelaTexto"/>
-              <w:jc w:val="left"/>
-            </w:pPr>
-            <w:r>
-              <w:t xml:space="preserve">coorte prospectiva; 150 pacientes (21-80 anos) submetidos a CVL eletiva</w:t>
-            </w:r>
-          </w:p>
-        </w:tc>
-        <w:tc>
-          <w:tcPr>
-            <w:tcW w:w="2521" w:type="dxa"/>
+              <w:t xml:space="preserve">Alta (8/9)</w:t>
+            </w:r>
+          </w:p>
+        </w:tc>
+        <w:tc>
+          <w:tcPr>
+            <w:tcW w:w="2240" w:type="dxa"/>
             <w:vAlign w:val="top"/>
           </w:tcPr>
           <w:p>
@@ -1638,7 +1758,7 @@
         </w:tc>
         <w:tc>
           <w:tcPr>
-            <w:tcW w:w="2100" w:type="dxa"/>
+            <w:tcW w:w="2240" w:type="dxa"/>
             <w:vAlign w:val="top"/>
           </w:tcPr>
           <w:p>
@@ -1653,7 +1773,7 @@
         </w:tc>
         <w:tc>
           <w:tcPr>
-            <w:tcW w:w="3221" w:type="dxa"/>
+            <w:tcW w:w="2941" w:type="dxa"/>
             <w:vAlign w:val="top"/>
           </w:tcPr>
           <w:p>
@@ -1673,7 +1793,7 @@
         </w:trPr>
         <w:tc>
           <w:tcPr>
-            <w:tcW w:w="2100" w:type="dxa"/>
+            <w:tcW w:w="1820" w:type="dxa"/>
             <w:vAlign w:val="top"/>
           </w:tcPr>
           <w:p>
@@ -1688,6 +1808,36 @@
         </w:tc>
         <w:tc>
           <w:tcPr>
+            <w:tcW w:w="1120" w:type="dxa"/>
+            <w:vAlign w:val="top"/>
+          </w:tcPr>
+          <w:p>
+            <w:pPr>
+              <w:pStyle w:val="TabelaTextoCentro"/>
+              <w:jc w:val="center"/>
+            </w:pPr>
+            <w:r>
+              <w:t xml:space="preserve">Nepal</w:t>
+            </w:r>
+          </w:p>
+        </w:tc>
+        <w:tc>
+          <w:tcPr>
+            <w:tcW w:w="2381" w:type="dxa"/>
+            <w:vAlign w:val="top"/>
+          </w:tcPr>
+          <w:p>
+            <w:pPr>
+              <w:pStyle w:val="TabelaTexto"/>
+              <w:jc w:val="left"/>
+            </w:pPr>
+            <w:r>
+              <w:t xml:space="preserve">coorte prospectiva; 108 pacientes submetidos a CVL de urgência por colecistite aguda litiásica</w:t>
+            </w:r>
+          </w:p>
+        </w:tc>
+        <w:tc>
+          <w:tcPr>
             <w:tcW w:w="1260" w:type="dxa"/>
             <w:vAlign w:val="top"/>
           </w:tcPr>
@@ -1697,28 +1847,13 @@
               <w:jc w:val="center"/>
             </w:pPr>
             <w:r>
-              <w:t xml:space="preserve">Nepal</w:t>
-            </w:r>
-          </w:p>
-        </w:tc>
-        <w:tc>
-          <w:tcPr>
-            <w:tcW w:w="2801" w:type="dxa"/>
-            <w:vAlign w:val="top"/>
-          </w:tcPr>
-          <w:p>
-            <w:pPr>
-              <w:pStyle w:val="TabelaTexto"/>
-              <w:jc w:val="left"/>
-            </w:pPr>
-            <w:r>
-              <w:t xml:space="preserve">coorte prospectiva; 108 pacientes submetidos a CVL de urgência por colecistite aguda litiásica</w:t>
-            </w:r>
-          </w:p>
-        </w:tc>
-        <w:tc>
-          <w:tcPr>
-            <w:tcW w:w="2521" w:type="dxa"/>
+              <w:t xml:space="preserve">Alta (8/9)</w:t>
+            </w:r>
+          </w:p>
+        </w:tc>
+        <w:tc>
+          <w:tcPr>
+            <w:tcW w:w="2240" w:type="dxa"/>
             <w:vAlign w:val="top"/>
           </w:tcPr>
           <w:p>
@@ -1733,7 +1868,7 @@
         </w:tc>
         <w:tc>
           <w:tcPr>
-            <w:tcW w:w="2100" w:type="dxa"/>
+            <w:tcW w:w="2240" w:type="dxa"/>
             <w:vAlign w:val="top"/>
           </w:tcPr>
           <w:p>
@@ -1748,7 +1883,7 @@
         </w:tc>
         <w:tc>
           <w:tcPr>
-            <w:tcW w:w="3221" w:type="dxa"/>
+            <w:tcW w:w="2941" w:type="dxa"/>
             <w:vAlign w:val="top"/>
           </w:tcPr>
           <w:p>
@@ -1768,7 +1903,7 @@
         </w:trPr>
         <w:tc>
           <w:tcPr>
-            <w:tcW w:w="2100" w:type="dxa"/>
+            <w:tcW w:w="1820" w:type="dxa"/>
             <w:vAlign w:val="top"/>
           </w:tcPr>
           <w:p>
@@ -1783,6 +1918,36 @@
         </w:tc>
         <w:tc>
           <w:tcPr>
+            <w:tcW w:w="1120" w:type="dxa"/>
+            <w:vAlign w:val="top"/>
+          </w:tcPr>
+          <w:p>
+            <w:pPr>
+              <w:pStyle w:val="TabelaTextoCentro"/>
+              <w:jc w:val="center"/>
+            </w:pPr>
+            <w:r>
+              <w:t xml:space="preserve">Japão</w:t>
+            </w:r>
+          </w:p>
+        </w:tc>
+        <w:tc>
+          <w:tcPr>
+            <w:tcW w:w="2381" w:type="dxa"/>
+            <w:vAlign w:val="top"/>
+          </w:tcPr>
+          <w:p>
+            <w:pPr>
+              <w:pStyle w:val="TabelaTexto"/>
+              <w:jc w:val="left"/>
+            </w:pPr>
+            <w:r>
+              <w:t xml:space="preserve">coorte retrospectiva; 193 pacientes submetidos a CVL após CPRE por coledocolitíase</w:t>
+            </w:r>
+          </w:p>
+        </w:tc>
+        <w:tc>
+          <w:tcPr>
             <w:tcW w:w="1260" w:type="dxa"/>
             <w:vAlign w:val="top"/>
           </w:tcPr>
@@ -1792,28 +1957,13 @@
               <w:jc w:val="center"/>
             </w:pPr>
             <w:r>
-              <w:t xml:space="preserve">Japão</w:t>
-            </w:r>
-          </w:p>
-        </w:tc>
-        <w:tc>
-          <w:tcPr>
-            <w:tcW w:w="2801" w:type="dxa"/>
-            <w:vAlign w:val="top"/>
-          </w:tcPr>
-          <w:p>
-            <w:pPr>
-              <w:pStyle w:val="TabelaTexto"/>
-              <w:jc w:val="left"/>
-            </w:pPr>
-            <w:r>
-              <w:t xml:space="preserve">coorte retrospectiva; 193 pacientes submetidos a CVL após CPRE por coledocolitíase</w:t>
-            </w:r>
-          </w:p>
-        </w:tc>
-        <w:tc>
-          <w:tcPr>
-            <w:tcW w:w="2521" w:type="dxa"/>
+              <w:t xml:space="preserve">Alta (8/9)</w:t>
+            </w:r>
+          </w:p>
+        </w:tc>
+        <w:tc>
+          <w:tcPr>
+            <w:tcW w:w="2240" w:type="dxa"/>
             <w:vAlign w:val="top"/>
           </w:tcPr>
           <w:p>
@@ -1828,7 +1978,7 @@
         </w:tc>
         <w:tc>
           <w:tcPr>
-            <w:tcW w:w="2100" w:type="dxa"/>
+            <w:tcW w:w="2240" w:type="dxa"/>
             <w:vAlign w:val="top"/>
           </w:tcPr>
           <w:p>
@@ -1843,7 +1993,7 @@
         </w:tc>
         <w:tc>
           <w:tcPr>
-            <w:tcW w:w="3221" w:type="dxa"/>
+            <w:tcW w:w="2941" w:type="dxa"/>
             <w:vAlign w:val="top"/>
           </w:tcPr>
           <w:p>
@@ -1863,7 +2013,7 @@
         </w:trPr>
         <w:tc>
           <w:tcPr>
-            <w:tcW w:w="2100" w:type="dxa"/>
+            <w:tcW w:w="1820" w:type="dxa"/>
             <w:vAlign w:val="top"/>
           </w:tcPr>
           <w:p>
@@ -1878,6 +2028,36 @@
         </w:tc>
         <w:tc>
           <w:tcPr>
+            <w:tcW w:w="1120" w:type="dxa"/>
+            <w:vAlign w:val="top"/>
+          </w:tcPr>
+          <w:p>
+            <w:pPr>
+              <w:pStyle w:val="TabelaTextoCentro"/>
+              <w:jc w:val="center"/>
+            </w:pPr>
+            <w:r>
+              <w:t xml:space="preserve">Japão</w:t>
+            </w:r>
+          </w:p>
+        </w:tc>
+        <w:tc>
+          <w:tcPr>
+            <w:tcW w:w="2381" w:type="dxa"/>
+            <w:vAlign w:val="top"/>
+          </w:tcPr>
+          <w:p>
+            <w:pPr>
+              <w:pStyle w:val="TabelaTexto"/>
+              <w:jc w:val="left"/>
+            </w:pPr>
+            <w:r>
+              <w:t xml:space="preserve">coorte retrospectiva; 257 pacientes com colecistite aguda submetidos a CVL após drenagem percutânea trans-hepática da vesícula (PTGBD)</w:t>
+            </w:r>
+          </w:p>
+        </w:tc>
+        <w:tc>
+          <w:tcPr>
             <w:tcW w:w="1260" w:type="dxa"/>
             <w:vAlign w:val="top"/>
           </w:tcPr>
@@ -1887,28 +2067,13 @@
               <w:jc w:val="center"/>
             </w:pPr>
             <w:r>
-              <w:t xml:space="preserve">Japão</w:t>
-            </w:r>
-          </w:p>
-        </w:tc>
-        <w:tc>
-          <w:tcPr>
-            <w:tcW w:w="2801" w:type="dxa"/>
-            <w:vAlign w:val="top"/>
-          </w:tcPr>
-          <w:p>
-            <w:pPr>
-              <w:pStyle w:val="TabelaTexto"/>
-              <w:jc w:val="left"/>
-            </w:pPr>
-            <w:r>
-              <w:t xml:space="preserve">coorte retrospectiva; 257 pacientes com colecistite aguda submetidos a CVL após drenagem percutânea trans-hepática da vesícula (PTGBD)</w:t>
-            </w:r>
-          </w:p>
-        </w:tc>
-        <w:tc>
-          <w:tcPr>
-            <w:tcW w:w="2521" w:type="dxa"/>
+              <w:t xml:space="preserve">Alta (8/9)</w:t>
+            </w:r>
+          </w:p>
+        </w:tc>
+        <w:tc>
+          <w:tcPr>
+            <w:tcW w:w="2240" w:type="dxa"/>
             <w:vAlign w:val="top"/>
           </w:tcPr>
           <w:p>
@@ -1923,7 +2088,7 @@
         </w:tc>
         <w:tc>
           <w:tcPr>
-            <w:tcW w:w="2100" w:type="dxa"/>
+            <w:tcW w:w="2240" w:type="dxa"/>
             <w:vAlign w:val="top"/>
           </w:tcPr>
           <w:p>
@@ -1938,7 +2103,7 @@
         </w:tc>
         <w:tc>
           <w:tcPr>
-            <w:tcW w:w="3221" w:type="dxa"/>
+            <w:tcW w:w="2941" w:type="dxa"/>
             <w:vAlign w:val="top"/>
           </w:tcPr>
           <w:p>
@@ -1958,7 +2123,7 @@
         </w:trPr>
         <w:tc>
           <w:tcPr>
-            <w:tcW w:w="2100" w:type="dxa"/>
+            <w:tcW w:w="1820" w:type="dxa"/>
             <w:vAlign w:val="top"/>
           </w:tcPr>
           <w:p>
@@ -1973,6 +2138,36 @@
         </w:tc>
         <w:tc>
           <w:tcPr>
+            <w:tcW w:w="1120" w:type="dxa"/>
+            <w:vAlign w:val="top"/>
+          </w:tcPr>
+          <w:p>
+            <w:pPr>
+              <w:pStyle w:val="TabelaTextoCentro"/>
+              <w:jc w:val="center"/>
+            </w:pPr>
+            <w:r>
+              <w:t xml:space="preserve">China</w:t>
+            </w:r>
+          </w:p>
+        </w:tc>
+        <w:tc>
+          <w:tcPr>
+            <w:tcW w:w="2381" w:type="dxa"/>
+            <w:vAlign w:val="top"/>
+          </w:tcPr>
+          <w:p>
+            <w:pPr>
+              <w:pStyle w:val="TabelaTexto"/>
+              <w:jc w:val="left"/>
+            </w:pPr>
+            <w:r>
+              <w:t xml:space="preserve">coorte retrospectiva; 107 pacientes com colecistite submetidos a CVL após drenagem percutânea trans-hepática da vesícula (PTGBD)</w:t>
+            </w:r>
+          </w:p>
+        </w:tc>
+        <w:tc>
+          <w:tcPr>
             <w:tcW w:w="1260" w:type="dxa"/>
             <w:vAlign w:val="top"/>
           </w:tcPr>
@@ -1982,28 +2177,13 @@
               <w:jc w:val="center"/>
             </w:pPr>
             <w:r>
-              <w:t xml:space="preserve">China</w:t>
-            </w:r>
-          </w:p>
-        </w:tc>
-        <w:tc>
-          <w:tcPr>
-            <w:tcW w:w="2801" w:type="dxa"/>
-            <w:vAlign w:val="top"/>
-          </w:tcPr>
-          <w:p>
-            <w:pPr>
-              <w:pStyle w:val="TabelaTexto"/>
-              <w:jc w:val="left"/>
-            </w:pPr>
-            <w:r>
-              <w:t xml:space="preserve">coorte retrospectiva; 107 pacientes com colecistite submetidos a CVL após drenagem percutânea trans-hepática da vesícula (PTGBD)</w:t>
-            </w:r>
-          </w:p>
-        </w:tc>
-        <w:tc>
-          <w:tcPr>
-            <w:tcW w:w="2521" w:type="dxa"/>
+              <w:t xml:space="preserve">Alta (8/9)</w:t>
+            </w:r>
+          </w:p>
+        </w:tc>
+        <w:tc>
+          <w:tcPr>
+            <w:tcW w:w="2240" w:type="dxa"/>
             <w:vAlign w:val="top"/>
           </w:tcPr>
           <w:p>
@@ -2018,7 +2198,7 @@
         </w:tc>
         <w:tc>
           <w:tcPr>
-            <w:tcW w:w="2100" w:type="dxa"/>
+            <w:tcW w:w="2240" w:type="dxa"/>
             <w:vAlign w:val="top"/>
           </w:tcPr>
           <w:p>
@@ -2033,7 +2213,7 @@
         </w:tc>
         <w:tc>
           <w:tcPr>
-            <w:tcW w:w="3221" w:type="dxa"/>
+            <w:tcW w:w="2941" w:type="dxa"/>
             <w:vAlign w:val="top"/>
           </w:tcPr>
           <w:p>
@@ -2053,7 +2233,7 @@
         </w:trPr>
         <w:tc>
           <w:tcPr>
-            <w:tcW w:w="2100" w:type="dxa"/>
+            <w:tcW w:w="1820" w:type="dxa"/>
             <w:vAlign w:val="top"/>
           </w:tcPr>
           <w:p>
@@ -2068,6 +2248,36 @@
         </w:tc>
         <w:tc>
           <w:tcPr>
+            <w:tcW w:w="1120" w:type="dxa"/>
+            <w:vAlign w:val="top"/>
+          </w:tcPr>
+          <w:p>
+            <w:pPr>
+              <w:pStyle w:val="TabelaTextoCentro"/>
+              <w:jc w:val="center"/>
+            </w:pPr>
+            <w:r>
+              <w:t xml:space="preserve">Índia</w:t>
+            </w:r>
+          </w:p>
+        </w:tc>
+        <w:tc>
+          <w:tcPr>
+            <w:tcW w:w="2381" w:type="dxa"/>
+            <w:vAlign w:val="top"/>
+          </w:tcPr>
+          <w:p>
+            <w:pPr>
+              <w:pStyle w:val="TabelaTexto"/>
+              <w:jc w:val="left"/>
+            </w:pPr>
+            <w:r>
+              <w:t xml:space="preserve">coorte prospectiva; 318 pacientes submetidos a CVL por colelitíase sintomática</w:t>
+            </w:r>
+          </w:p>
+        </w:tc>
+        <w:tc>
+          <w:tcPr>
             <w:tcW w:w="1260" w:type="dxa"/>
             <w:vAlign w:val="top"/>
           </w:tcPr>
@@ -2077,28 +2287,13 @@
               <w:jc w:val="center"/>
             </w:pPr>
             <w:r>
-              <w:t xml:space="preserve">Índia</w:t>
-            </w:r>
-          </w:p>
-        </w:tc>
-        <w:tc>
-          <w:tcPr>
-            <w:tcW w:w="2801" w:type="dxa"/>
-            <w:vAlign w:val="top"/>
-          </w:tcPr>
-          <w:p>
-            <w:pPr>
-              <w:pStyle w:val="TabelaTexto"/>
-              <w:jc w:val="left"/>
-            </w:pPr>
-            <w:r>
-              <w:t xml:space="preserve">coorte prospectiva; 318 pacientes submetidos a CVL por colelitíase sintomática</w:t>
-            </w:r>
-          </w:p>
-        </w:tc>
-        <w:tc>
-          <w:tcPr>
-            <w:tcW w:w="2521" w:type="dxa"/>
+              <w:t xml:space="preserve">Alta (9/9)</w:t>
+            </w:r>
+          </w:p>
+        </w:tc>
+        <w:tc>
+          <w:tcPr>
+            <w:tcW w:w="2240" w:type="dxa"/>
             <w:vAlign w:val="top"/>
           </w:tcPr>
           <w:p>
@@ -2113,7 +2308,7 @@
         </w:tc>
         <w:tc>
           <w:tcPr>
-            <w:tcW w:w="2100" w:type="dxa"/>
+            <w:tcW w:w="2240" w:type="dxa"/>
             <w:vAlign w:val="top"/>
           </w:tcPr>
           <w:p>
@@ -2128,7 +2323,7 @@
         </w:tc>
         <w:tc>
           <w:tcPr>
-            <w:tcW w:w="3221" w:type="dxa"/>
+            <w:tcW w:w="2941" w:type="dxa"/>
             <w:vAlign w:val="top"/>
           </w:tcPr>
           <w:p>
@@ -2148,7 +2343,7 @@
         </w:trPr>
         <w:tc>
           <w:tcPr>
-            <w:tcW w:w="2100" w:type="dxa"/>
+            <w:tcW w:w="1820" w:type="dxa"/>
             <w:vAlign w:val="top"/>
           </w:tcPr>
           <w:p>
@@ -2163,6 +2358,36 @@
         </w:tc>
         <w:tc>
           <w:tcPr>
+            <w:tcW w:w="1120" w:type="dxa"/>
+            <w:vAlign w:val="top"/>
+          </w:tcPr>
+          <w:p>
+            <w:pPr>
+              <w:pStyle w:val="TabelaTextoCentro"/>
+              <w:jc w:val="center"/>
+            </w:pPr>
+            <w:r>
+              <w:t xml:space="preserve">Índia</w:t>
+            </w:r>
+          </w:p>
+        </w:tc>
+        <w:tc>
+          <w:tcPr>
+            <w:tcW w:w="2381" w:type="dxa"/>
+            <w:vAlign w:val="top"/>
+          </w:tcPr>
+          <w:p>
+            <w:pPr>
+              <w:pStyle w:val="TabelaTexto"/>
+              <w:jc w:val="left"/>
+            </w:pPr>
+            <w:r>
+              <w:t xml:space="preserve">coorte prospectiva; 222 adultos submetidos a CVL eletiva</w:t>
+            </w:r>
+          </w:p>
+        </w:tc>
+        <w:tc>
+          <w:tcPr>
             <w:tcW w:w="1260" w:type="dxa"/>
             <w:vAlign w:val="top"/>
           </w:tcPr>
@@ -2172,28 +2397,13 @@
               <w:jc w:val="center"/>
             </w:pPr>
             <w:r>
-              <w:t xml:space="preserve">Índia</w:t>
-            </w:r>
-          </w:p>
-        </w:tc>
-        <w:tc>
-          <w:tcPr>
-            <w:tcW w:w="2801" w:type="dxa"/>
-            <w:vAlign w:val="top"/>
-          </w:tcPr>
-          <w:p>
-            <w:pPr>
-              <w:pStyle w:val="TabelaTexto"/>
-              <w:jc w:val="left"/>
-            </w:pPr>
-            <w:r>
-              <w:t xml:space="preserve">coorte prospectiva; 222 adultos submetidos a CVL eletiva</w:t>
-            </w:r>
-          </w:p>
-        </w:tc>
-        <w:tc>
-          <w:tcPr>
-            <w:tcW w:w="2521" w:type="dxa"/>
+              <w:t xml:space="preserve">Alta (8/9)</w:t>
+            </w:r>
+          </w:p>
+        </w:tc>
+        <w:tc>
+          <w:tcPr>
+            <w:tcW w:w="2240" w:type="dxa"/>
             <w:vAlign w:val="top"/>
           </w:tcPr>
           <w:p>
@@ -2208,7 +2418,7 @@
         </w:tc>
         <w:tc>
           <w:tcPr>
-            <w:tcW w:w="2100" w:type="dxa"/>
+            <w:tcW w:w="2240" w:type="dxa"/>
             <w:vAlign w:val="top"/>
           </w:tcPr>
           <w:p>
@@ -2223,7 +2433,7 @@
         </w:tc>
         <w:tc>
           <w:tcPr>
-            <w:tcW w:w="3221" w:type="dxa"/>
+            <w:tcW w:w="2941" w:type="dxa"/>
             <w:vAlign w:val="top"/>
           </w:tcPr>
           <w:p>
@@ -2243,7 +2453,7 @@
         </w:trPr>
         <w:tc>
           <w:tcPr>
-            <w:tcW w:w="2100" w:type="dxa"/>
+            <w:tcW w:w="1820" w:type="dxa"/>
             <w:vAlign w:val="top"/>
           </w:tcPr>
           <w:p>
@@ -2258,6 +2468,36 @@
         </w:tc>
         <w:tc>
           <w:tcPr>
+            <w:tcW w:w="1120" w:type="dxa"/>
+            <w:vAlign w:val="top"/>
+          </w:tcPr>
+          <w:p>
+            <w:pPr>
+              <w:pStyle w:val="TabelaTextoCentro"/>
+              <w:jc w:val="center"/>
+            </w:pPr>
+            <w:r>
+              <w:t xml:space="preserve">Venezuela</w:t>
+            </w:r>
+          </w:p>
+        </w:tc>
+        <w:tc>
+          <w:tcPr>
+            <w:tcW w:w="2381" w:type="dxa"/>
+            <w:vAlign w:val="top"/>
+          </w:tcPr>
+          <w:p>
+            <w:pPr>
+              <w:pStyle w:val="TabelaTexto"/>
+              <w:jc w:val="left"/>
+            </w:pPr>
+            <w:r>
+              <w:t xml:space="preserve">transversal; 391 pacientes submetidos a CVL</w:t>
+            </w:r>
+          </w:p>
+        </w:tc>
+        <w:tc>
+          <w:tcPr>
             <w:tcW w:w="1260" w:type="dxa"/>
             <w:vAlign w:val="top"/>
           </w:tcPr>
@@ -2267,28 +2507,13 @@
               <w:jc w:val="center"/>
             </w:pPr>
             <w:r>
-              <w:t xml:space="preserve">Venezuela*</w:t>
-            </w:r>
-          </w:p>
-        </w:tc>
-        <w:tc>
-          <w:tcPr>
-            <w:tcW w:w="2801" w:type="dxa"/>
-            <w:vAlign w:val="top"/>
-          </w:tcPr>
-          <w:p>
-            <w:pPr>
-              <w:pStyle w:val="TabelaTexto"/>
-              <w:jc w:val="left"/>
-            </w:pPr>
-            <w:r>
-              <w:t xml:space="preserve">transversal; 391 pacientes submetidos a CVL</w:t>
-            </w:r>
-          </w:p>
-        </w:tc>
-        <w:tc>
-          <w:tcPr>
-            <w:tcW w:w="2521" w:type="dxa"/>
+              <w:t xml:space="preserve">Moderada (6/8)</w:t>
+            </w:r>
+          </w:p>
+        </w:tc>
+        <w:tc>
+          <w:tcPr>
+            <w:tcW w:w="2240" w:type="dxa"/>
             <w:vAlign w:val="top"/>
           </w:tcPr>
           <w:p>
@@ -2303,7 +2528,7 @@
         </w:tc>
         <w:tc>
           <w:tcPr>
-            <w:tcW w:w="2100" w:type="dxa"/>
+            <w:tcW w:w="2240" w:type="dxa"/>
             <w:vAlign w:val="top"/>
           </w:tcPr>
           <w:p>
@@ -2318,7 +2543,7 @@
         </w:tc>
         <w:tc>
           <w:tcPr>
-            <w:tcW w:w="3221" w:type="dxa"/>
+            <w:tcW w:w="2941" w:type="dxa"/>
             <w:vAlign w:val="top"/>
           </w:tcPr>
           <w:p>
@@ -2338,7 +2563,7 @@
         </w:trPr>
         <w:tc>
           <w:tcPr>
-            <w:tcW w:w="2100" w:type="dxa"/>
+            <w:tcW w:w="1820" w:type="dxa"/>
             <w:vAlign w:val="top"/>
           </w:tcPr>
           <w:p>
@@ -2353,6 +2578,36 @@
         </w:tc>
         <w:tc>
           <w:tcPr>
+            <w:tcW w:w="1120" w:type="dxa"/>
+            <w:vAlign w:val="top"/>
+          </w:tcPr>
+          <w:p>
+            <w:pPr>
+              <w:pStyle w:val="TabelaTextoCentro"/>
+              <w:jc w:val="center"/>
+            </w:pPr>
+            <w:r>
+              <w:t xml:space="preserve">Argentina</w:t>
+            </w:r>
+          </w:p>
+        </w:tc>
+        <w:tc>
+          <w:tcPr>
+            <w:tcW w:w="2381" w:type="dxa"/>
+            <w:vAlign w:val="top"/>
+          </w:tcPr>
+          <w:p>
+            <w:pPr>
+              <w:pStyle w:val="TabelaTexto"/>
+              <w:jc w:val="left"/>
+            </w:pPr>
+            <w:r>
+              <w:t xml:space="preserve">série de casos; 102 casos de colecistite aguda tratados cirurgicamente</w:t>
+            </w:r>
+          </w:p>
+        </w:tc>
+        <w:tc>
+          <w:tcPr>
             <w:tcW w:w="1260" w:type="dxa"/>
             <w:vAlign w:val="top"/>
           </w:tcPr>
@@ -2362,28 +2617,13 @@
               <w:jc w:val="center"/>
             </w:pPr>
             <w:r>
-              <w:t xml:space="preserve">Argentina</w:t>
-            </w:r>
-          </w:p>
-        </w:tc>
-        <w:tc>
-          <w:tcPr>
-            <w:tcW w:w="2801" w:type="dxa"/>
-            <w:vAlign w:val="top"/>
-          </w:tcPr>
-          <w:p>
-            <w:pPr>
-              <w:pStyle w:val="TabelaTexto"/>
-              <w:jc w:val="left"/>
-            </w:pPr>
-            <w:r>
-              <w:t xml:space="preserve">série de casos; 102 casos de colecistite aguda tratados cirurgicamente</w:t>
-            </w:r>
-          </w:p>
-        </w:tc>
-        <w:tc>
-          <w:tcPr>
-            <w:tcW w:w="2521" w:type="dxa"/>
+              <w:t xml:space="preserve">Moderada (7/10)</w:t>
+            </w:r>
+          </w:p>
+        </w:tc>
+        <w:tc>
+          <w:tcPr>
+            <w:tcW w:w="2240" w:type="dxa"/>
             <w:vAlign w:val="top"/>
           </w:tcPr>
           <w:p>
@@ -2398,7 +2638,7 @@
         </w:tc>
         <w:tc>
           <w:tcPr>
-            <w:tcW w:w="2100" w:type="dxa"/>
+            <w:tcW w:w="2240" w:type="dxa"/>
             <w:vAlign w:val="top"/>
           </w:tcPr>
           <w:p>
@@ -2413,7 +2653,7 @@
         </w:tc>
         <w:tc>
           <w:tcPr>
-            <w:tcW w:w="3221" w:type="dxa"/>
+            <w:tcW w:w="2941" w:type="dxa"/>
             <w:vAlign w:val="top"/>
           </w:tcPr>
           <w:p>
@@ -2433,7 +2673,7 @@
         </w:trPr>
         <w:tc>
           <w:tcPr>
-            <w:tcW w:w="2100" w:type="dxa"/>
+            <w:tcW w:w="1820" w:type="dxa"/>
             <w:vAlign w:val="top"/>
           </w:tcPr>
           <w:p>
@@ -2448,6 +2688,36 @@
         </w:tc>
         <w:tc>
           <w:tcPr>
+            <w:tcW w:w="1120" w:type="dxa"/>
+            <w:vAlign w:val="top"/>
+          </w:tcPr>
+          <w:p>
+            <w:pPr>
+              <w:pStyle w:val="TabelaTextoCentro"/>
+              <w:jc w:val="center"/>
+            </w:pPr>
+            <w:r>
+              <w:t xml:space="preserve">Índia</w:t>
+            </w:r>
+          </w:p>
+        </w:tc>
+        <w:tc>
+          <w:tcPr>
+            <w:tcW w:w="2381" w:type="dxa"/>
+            <w:vAlign w:val="top"/>
+          </w:tcPr>
+          <w:p>
+            <w:pPr>
+              <w:pStyle w:val="TabelaTexto"/>
+              <w:jc w:val="left"/>
+            </w:pPr>
+            <w:r>
+              <w:t xml:space="preserve">coorte prospectiva; 60 pacientes com colecistite aguda submetidos a CVL precoce</w:t>
+            </w:r>
+          </w:p>
+        </w:tc>
+        <w:tc>
+          <w:tcPr>
             <w:tcW w:w="1260" w:type="dxa"/>
             <w:vAlign w:val="top"/>
           </w:tcPr>
@@ -2457,28 +2727,13 @@
               <w:jc w:val="center"/>
             </w:pPr>
             <w:r>
-              <w:t xml:space="preserve">Índia</w:t>
-            </w:r>
-          </w:p>
-        </w:tc>
-        <w:tc>
-          <w:tcPr>
-            <w:tcW w:w="2801" w:type="dxa"/>
-            <w:vAlign w:val="top"/>
-          </w:tcPr>
-          <w:p>
-            <w:pPr>
-              <w:pStyle w:val="TabelaTexto"/>
-              <w:jc w:val="left"/>
-            </w:pPr>
-            <w:r>
-              <w:t xml:space="preserve">coorte prospectiva; 60 pacientes com colecistite aguda submetidos a CVL precoce</w:t>
-            </w:r>
-          </w:p>
-        </w:tc>
-        <w:tc>
-          <w:tcPr>
-            <w:tcW w:w="2521" w:type="dxa"/>
+              <w:t xml:space="preserve">Alta (8/9)</w:t>
+            </w:r>
+          </w:p>
+        </w:tc>
+        <w:tc>
+          <w:tcPr>
+            <w:tcW w:w="2240" w:type="dxa"/>
             <w:vAlign w:val="top"/>
           </w:tcPr>
           <w:p>
@@ -2493,7 +2748,7 @@
         </w:tc>
         <w:tc>
           <w:tcPr>
-            <w:tcW w:w="2100" w:type="dxa"/>
+            <w:tcW w:w="2240" w:type="dxa"/>
             <w:vAlign w:val="top"/>
           </w:tcPr>
           <w:p>
@@ -2508,7 +2763,7 @@
         </w:tc>
         <w:tc>
           <w:tcPr>
-            <w:tcW w:w="3221" w:type="dxa"/>
+            <w:tcW w:w="2941" w:type="dxa"/>
             <w:vAlign w:val="top"/>
           </w:tcPr>
           <w:p>
@@ -2528,7 +2783,7 @@
         </w:trPr>
         <w:tc>
           <w:tcPr>
-            <w:tcW w:w="2100" w:type="dxa"/>
+            <w:tcW w:w="1820" w:type="dxa"/>
             <w:vAlign w:val="top"/>
           </w:tcPr>
           <w:p>
@@ -2543,6 +2798,36 @@
         </w:tc>
         <w:tc>
           <w:tcPr>
+            <w:tcW w:w="1120" w:type="dxa"/>
+            <w:vAlign w:val="top"/>
+          </w:tcPr>
+          <w:p>
+            <w:pPr>
+              <w:pStyle w:val="TabelaTextoCentro"/>
+              <w:jc w:val="center"/>
+            </w:pPr>
+            <w:r>
+              <w:t xml:space="preserve">México</w:t>
+            </w:r>
+          </w:p>
+        </w:tc>
+        <w:tc>
+          <w:tcPr>
+            <w:tcW w:w="2381" w:type="dxa"/>
+            <w:vAlign w:val="top"/>
+          </w:tcPr>
+          <w:p>
+            <w:pPr>
+              <w:pStyle w:val="TabelaTexto"/>
+              <w:jc w:val="left"/>
+            </w:pPr>
+            <w:r>
+              <w:t xml:space="preserve">transversal; 362 pacientes submetidos a colecistectomia (419 avaliados, 57 excluídos)</w:t>
+            </w:r>
+          </w:p>
+        </w:tc>
+        <w:tc>
+          <w:tcPr>
             <w:tcW w:w="1260" w:type="dxa"/>
             <w:vAlign w:val="top"/>
           </w:tcPr>
@@ -2552,28 +2837,13 @@
               <w:jc w:val="center"/>
             </w:pPr>
             <w:r>
-              <w:t xml:space="preserve">México*</w:t>
-            </w:r>
-          </w:p>
-        </w:tc>
-        <w:tc>
-          <w:tcPr>
-            <w:tcW w:w="2801" w:type="dxa"/>
-            <w:vAlign w:val="top"/>
-          </w:tcPr>
-          <w:p>
-            <w:pPr>
-              <w:pStyle w:val="TabelaTexto"/>
-              <w:jc w:val="left"/>
-            </w:pPr>
-            <w:r>
-              <w:t xml:space="preserve">transversal; 362 pacientes submetidos a colecistectomia (419 avaliados, 57 excluídos)</w:t>
-            </w:r>
-          </w:p>
-        </w:tc>
-        <w:tc>
-          <w:tcPr>
-            <w:tcW w:w="2521" w:type="dxa"/>
+              <w:t xml:space="preserve">Alta (7/8)</w:t>
+            </w:r>
+          </w:p>
+        </w:tc>
+        <w:tc>
+          <w:tcPr>
+            <w:tcW w:w="2240" w:type="dxa"/>
             <w:vAlign w:val="top"/>
           </w:tcPr>
           <w:p>
@@ -2588,7 +2858,7 @@
         </w:tc>
         <w:tc>
           <w:tcPr>
-            <w:tcW w:w="2100" w:type="dxa"/>
+            <w:tcW w:w="2240" w:type="dxa"/>
             <w:vAlign w:val="top"/>
           </w:tcPr>
           <w:p>
@@ -2603,7 +2873,7 @@
         </w:tc>
         <w:tc>
           <w:tcPr>
-            <w:tcW w:w="3221" w:type="dxa"/>
+            <w:tcW w:w="2941" w:type="dxa"/>
             <w:vAlign w:val="top"/>
           </w:tcPr>
           <w:p>
@@ -2623,7 +2893,7 @@
         </w:trPr>
         <w:tc>
           <w:tcPr>
-            <w:tcW w:w="2100" w:type="dxa"/>
+            <w:tcW w:w="1820" w:type="dxa"/>
             <w:vAlign w:val="top"/>
           </w:tcPr>
           <w:p>
@@ -2638,6 +2908,36 @@
         </w:tc>
         <w:tc>
           <w:tcPr>
+            <w:tcW w:w="1120" w:type="dxa"/>
+            <w:vAlign w:val="top"/>
+          </w:tcPr>
+          <w:p>
+            <w:pPr>
+              <w:pStyle w:val="TabelaTextoCentro"/>
+              <w:jc w:val="center"/>
+            </w:pPr>
+            <w:r>
+              <w:t xml:space="preserve">Índia</w:t>
+            </w:r>
+          </w:p>
+        </w:tc>
+        <w:tc>
+          <w:tcPr>
+            <w:tcW w:w="2381" w:type="dxa"/>
+            <w:vAlign w:val="top"/>
+          </w:tcPr>
+          <w:p>
+            <w:pPr>
+              <w:pStyle w:val="TabelaTexto"/>
+              <w:jc w:val="left"/>
+            </w:pPr>
+            <w:r>
+              <w:t xml:space="preserve">coorte prospectiva; 93 pacientes com litíase biliar submetidos a CVL</w:t>
+            </w:r>
+          </w:p>
+        </w:tc>
+        <w:tc>
+          <w:tcPr>
             <w:tcW w:w="1260" w:type="dxa"/>
             <w:vAlign w:val="top"/>
           </w:tcPr>
@@ -2647,28 +2947,13 @@
               <w:jc w:val="center"/>
             </w:pPr>
             <w:r>
-              <w:t xml:space="preserve">Índia</w:t>
-            </w:r>
-          </w:p>
-        </w:tc>
-        <w:tc>
-          <w:tcPr>
-            <w:tcW w:w="2801" w:type="dxa"/>
-            <w:vAlign w:val="top"/>
-          </w:tcPr>
-          <w:p>
-            <w:pPr>
-              <w:pStyle w:val="TabelaTexto"/>
-              <w:jc w:val="left"/>
-            </w:pPr>
-            <w:r>
-              <w:t xml:space="preserve">coorte prospectiva; 93 pacientes com litíase biliar submetidos a CVL</w:t>
-            </w:r>
-          </w:p>
-        </w:tc>
-        <w:tc>
-          <w:tcPr>
-            <w:tcW w:w="2521" w:type="dxa"/>
+              <w:t xml:space="preserve">Alta (8/9)</w:t>
+            </w:r>
+          </w:p>
+        </w:tc>
+        <w:tc>
+          <w:tcPr>
+            <w:tcW w:w="2240" w:type="dxa"/>
             <w:vAlign w:val="top"/>
           </w:tcPr>
           <w:p>
@@ -2683,7 +2968,7 @@
         </w:tc>
         <w:tc>
           <w:tcPr>
-            <w:tcW w:w="2100" w:type="dxa"/>
+            <w:tcW w:w="2240" w:type="dxa"/>
             <w:vAlign w:val="top"/>
           </w:tcPr>
           <w:p>
@@ -2698,7 +2983,7 @@
         </w:tc>
         <w:tc>
           <w:tcPr>
-            <w:tcW w:w="3221" w:type="dxa"/>
+            <w:tcW w:w="2941" w:type="dxa"/>
             <w:vAlign w:val="top"/>
           </w:tcPr>
           <w:p>
@@ -2718,7 +3003,7 @@
         </w:trPr>
         <w:tc>
           <w:tcPr>
-            <w:tcW w:w="2100" w:type="dxa"/>
+            <w:tcW w:w="1820" w:type="dxa"/>
             <w:vAlign w:val="top"/>
           </w:tcPr>
           <w:p>
@@ -2733,6 +3018,36 @@
         </w:tc>
         <w:tc>
           <w:tcPr>
+            <w:tcW w:w="1120" w:type="dxa"/>
+            <w:vAlign w:val="top"/>
+          </w:tcPr>
+          <w:p>
+            <w:pPr>
+              <w:pStyle w:val="TabelaTextoCentro"/>
+              <w:jc w:val="center"/>
+            </w:pPr>
+            <w:r>
+              <w:t xml:space="preserve">Bolívia</w:t>
+            </w:r>
+          </w:p>
+        </w:tc>
+        <w:tc>
+          <w:tcPr>
+            <w:tcW w:w="2381" w:type="dxa"/>
+            <w:vAlign w:val="top"/>
+          </w:tcPr>
+          <w:p>
+            <w:pPr>
+              <w:pStyle w:val="TabelaTexto"/>
+              <w:jc w:val="left"/>
+            </w:pPr>
+            <w:r>
+              <w:t xml:space="preserve">série de casos; 1.095 pacientes submetidos a CVL (2012-2022)</w:t>
+            </w:r>
+          </w:p>
+        </w:tc>
+        <w:tc>
+          <w:tcPr>
             <w:tcW w:w="1260" w:type="dxa"/>
             <w:vAlign w:val="top"/>
           </w:tcPr>
@@ -2742,28 +3057,13 @@
               <w:jc w:val="center"/>
             </w:pPr>
             <w:r>
-              <w:t xml:space="preserve">Bolívia</w:t>
-            </w:r>
-          </w:p>
-        </w:tc>
-        <w:tc>
-          <w:tcPr>
-            <w:tcW w:w="2801" w:type="dxa"/>
-            <w:vAlign w:val="top"/>
-          </w:tcPr>
-          <w:p>
-            <w:pPr>
-              <w:pStyle w:val="TabelaTexto"/>
-              <w:jc w:val="left"/>
-            </w:pPr>
-            <w:r>
-              <w:t xml:space="preserve">série de casos; 1.095 pacientes submetidos a CVL (2012-2022)</w:t>
-            </w:r>
-          </w:p>
-        </w:tc>
-        <w:tc>
-          <w:tcPr>
-            <w:tcW w:w="2521" w:type="dxa"/>
+              <w:t xml:space="preserve">Moderada (7/10)</w:t>
+            </w:r>
+          </w:p>
+        </w:tc>
+        <w:tc>
+          <w:tcPr>
+            <w:tcW w:w="2240" w:type="dxa"/>
             <w:vAlign w:val="top"/>
           </w:tcPr>
           <w:p>
@@ -2778,7 +3078,7 @@
         </w:tc>
         <w:tc>
           <w:tcPr>
-            <w:tcW w:w="2100" w:type="dxa"/>
+            <w:tcW w:w="2240" w:type="dxa"/>
             <w:vAlign w:val="top"/>
           </w:tcPr>
           <w:p>
@@ -2793,7 +3093,7 @@
         </w:tc>
         <w:tc>
           <w:tcPr>
-            <w:tcW w:w="3221" w:type="dxa"/>
+            <w:tcW w:w="2941" w:type="dxa"/>
             <w:vAlign w:val="top"/>
           </w:tcPr>
           <w:p>
@@ -2813,7 +3113,7 @@
         </w:trPr>
         <w:tc>
           <w:tcPr>
-            <w:tcW w:w="2100" w:type="dxa"/>
+            <w:tcW w:w="1820" w:type="dxa"/>
             <w:vAlign w:val="top"/>
           </w:tcPr>
           <w:p>
@@ -2828,6 +3128,36 @@
         </w:tc>
         <w:tc>
           <w:tcPr>
+            <w:tcW w:w="1120" w:type="dxa"/>
+            <w:vAlign w:val="top"/>
+          </w:tcPr>
+          <w:p>
+            <w:pPr>
+              <w:pStyle w:val="TabelaTextoCentro"/>
+              <w:jc w:val="center"/>
+            </w:pPr>
+            <w:r>
+              <w:t xml:space="preserve">Turquia</w:t>
+            </w:r>
+          </w:p>
+        </w:tc>
+        <w:tc>
+          <w:tcPr>
+            <w:tcW w:w="2381" w:type="dxa"/>
+            <w:vAlign w:val="top"/>
+          </w:tcPr>
+          <w:p>
+            <w:pPr>
+              <w:pStyle w:val="TabelaTexto"/>
+              <w:jc w:val="left"/>
+            </w:pPr>
+            <w:r>
+              <w:t xml:space="preserve">coorte retrospectiva; 80 pacientes submetidos a CVL por colecistite aguda</w:t>
+            </w:r>
+          </w:p>
+        </w:tc>
+        <w:tc>
+          <w:tcPr>
             <w:tcW w:w="1260" w:type="dxa"/>
             <w:vAlign w:val="top"/>
           </w:tcPr>
@@ -2837,28 +3167,13 @@
               <w:jc w:val="center"/>
             </w:pPr>
             <w:r>
-              <w:t xml:space="preserve">Turquia</w:t>
-            </w:r>
-          </w:p>
-        </w:tc>
-        <w:tc>
-          <w:tcPr>
-            <w:tcW w:w="2801" w:type="dxa"/>
-            <w:vAlign w:val="top"/>
-          </w:tcPr>
-          <w:p>
-            <w:pPr>
-              <w:pStyle w:val="TabelaTexto"/>
-              <w:jc w:val="left"/>
-            </w:pPr>
-            <w:r>
-              <w:t xml:space="preserve">coorte retrospectiva; 80 pacientes submetidos a CVL por colecistite aguda</w:t>
-            </w:r>
-          </w:p>
-        </w:tc>
-        <w:tc>
-          <w:tcPr>
-            <w:tcW w:w="2521" w:type="dxa"/>
+              <w:t xml:space="preserve">Alta (8/9)</w:t>
+            </w:r>
+          </w:p>
+        </w:tc>
+        <w:tc>
+          <w:tcPr>
+            <w:tcW w:w="2240" w:type="dxa"/>
             <w:vAlign w:val="top"/>
           </w:tcPr>
           <w:p>
@@ -2873,7 +3188,7 @@
         </w:tc>
         <w:tc>
           <w:tcPr>
-            <w:tcW w:w="2100" w:type="dxa"/>
+            <w:tcW w:w="2240" w:type="dxa"/>
             <w:vAlign w:val="top"/>
           </w:tcPr>
           <w:p>
@@ -2888,7 +3203,7 @@
         </w:tc>
         <w:tc>
           <w:tcPr>
-            <w:tcW w:w="3221" w:type="dxa"/>
+            <w:tcW w:w="2941" w:type="dxa"/>
             <w:vAlign w:val="top"/>
           </w:tcPr>
           <w:p>
@@ -2908,7 +3223,7 @@
         </w:trPr>
         <w:tc>
           <w:tcPr>
-            <w:tcW w:w="2100" w:type="dxa"/>
+            <w:tcW w:w="1820" w:type="dxa"/>
             <w:vAlign w:val="top"/>
           </w:tcPr>
           <w:p>
@@ -2923,6 +3238,36 @@
         </w:tc>
         <w:tc>
           <w:tcPr>
+            <w:tcW w:w="1120" w:type="dxa"/>
+            <w:vAlign w:val="top"/>
+          </w:tcPr>
+          <w:p>
+            <w:pPr>
+              <w:pStyle w:val="TabelaTextoCentro"/>
+              <w:jc w:val="center"/>
+            </w:pPr>
+            <w:r>
+              <w:t xml:space="preserve">Colômbia</w:t>
+            </w:r>
+          </w:p>
+        </w:tc>
+        <w:tc>
+          <w:tcPr>
+            <w:tcW w:w="2381" w:type="dxa"/>
+            <w:vAlign w:val="top"/>
+          </w:tcPr>
+          <w:p>
+            <w:pPr>
+              <w:pStyle w:val="TabelaTexto"/>
+              <w:jc w:val="left"/>
+            </w:pPr>
+            <w:r>
+              <w:t xml:space="preserve">caso-controle; 332 pacientes submetidos a CVL (83 casos convertidos e 249 controles)</w:t>
+            </w:r>
+          </w:p>
+        </w:tc>
+        <w:tc>
+          <w:tcPr>
             <w:tcW w:w="1260" w:type="dxa"/>
             <w:vAlign w:val="top"/>
           </w:tcPr>
@@ -2932,28 +3277,13 @@
               <w:jc w:val="center"/>
             </w:pPr>
             <w:r>
-              <w:t xml:space="preserve">Colômbia</w:t>
-            </w:r>
-          </w:p>
-        </w:tc>
-        <w:tc>
-          <w:tcPr>
-            <w:tcW w:w="2801" w:type="dxa"/>
-            <w:vAlign w:val="top"/>
-          </w:tcPr>
-          <w:p>
-            <w:pPr>
-              <w:pStyle w:val="TabelaTexto"/>
-              <w:jc w:val="left"/>
-            </w:pPr>
-            <w:r>
-              <w:t xml:space="preserve">caso-controle; 332 pacientes submetidos a CVL (83 casos convertidos e 249 controles)</w:t>
-            </w:r>
-          </w:p>
-        </w:tc>
-        <w:tc>
-          <w:tcPr>
-            <w:tcW w:w="2521" w:type="dxa"/>
+              <w:t xml:space="preserve">Alta (9/10)</w:t>
+            </w:r>
+          </w:p>
+        </w:tc>
+        <w:tc>
+          <w:tcPr>
+            <w:tcW w:w="2240" w:type="dxa"/>
             <w:vAlign w:val="top"/>
           </w:tcPr>
           <w:p>
@@ -2968,7 +3298,7 @@
         </w:tc>
         <w:tc>
           <w:tcPr>
-            <w:tcW w:w="2100" w:type="dxa"/>
+            <w:tcW w:w="2240" w:type="dxa"/>
             <w:vAlign w:val="top"/>
           </w:tcPr>
           <w:p>
@@ -2983,7 +3313,7 @@
         </w:tc>
         <w:tc>
           <w:tcPr>
-            <w:tcW w:w="3221" w:type="dxa"/>
+            <w:tcW w:w="2941" w:type="dxa"/>
             <w:vAlign w:val="top"/>
           </w:tcPr>
           <w:p>
@@ -3003,7 +3333,7 @@
         </w:trPr>
         <w:tc>
           <w:tcPr>
-            <w:tcW w:w="2100" w:type="dxa"/>
+            <w:tcW w:w="1820" w:type="dxa"/>
             <w:vAlign w:val="top"/>
           </w:tcPr>
           <w:p>
@@ -3018,6 +3348,36 @@
         </w:tc>
         <w:tc>
           <w:tcPr>
+            <w:tcW w:w="1120" w:type="dxa"/>
+            <w:vAlign w:val="top"/>
+          </w:tcPr>
+          <w:p>
+            <w:pPr>
+              <w:pStyle w:val="TabelaTextoCentro"/>
+              <w:jc w:val="center"/>
+            </w:pPr>
+            <w:r>
+              <w:t xml:space="preserve">Índia</w:t>
+            </w:r>
+          </w:p>
+        </w:tc>
+        <w:tc>
+          <w:tcPr>
+            <w:tcW w:w="2381" w:type="dxa"/>
+            <w:vAlign w:val="top"/>
+          </w:tcPr>
+          <w:p>
+            <w:pPr>
+              <w:pStyle w:val="TabelaTexto"/>
+              <w:jc w:val="left"/>
+            </w:pPr>
+            <w:r>
+              <w:t xml:space="preserve">coorte prospectiva; 350 pacientes com colelitíase sintomática submetidos a CVL</w:t>
+            </w:r>
+          </w:p>
+        </w:tc>
+        <w:tc>
+          <w:tcPr>
             <w:tcW w:w="1260" w:type="dxa"/>
             <w:vAlign w:val="top"/>
           </w:tcPr>
@@ -3027,28 +3387,13 @@
               <w:jc w:val="center"/>
             </w:pPr>
             <w:r>
-              <w:t xml:space="preserve">Índia</w:t>
-            </w:r>
-          </w:p>
-        </w:tc>
-        <w:tc>
-          <w:tcPr>
-            <w:tcW w:w="2801" w:type="dxa"/>
-            <w:vAlign w:val="top"/>
-          </w:tcPr>
-          <w:p>
-            <w:pPr>
-              <w:pStyle w:val="TabelaTexto"/>
-              <w:jc w:val="left"/>
-            </w:pPr>
-            <w:r>
-              <w:t xml:space="preserve">coorte prospectiva; 350 pacientes com colelitíase sintomática submetidos a CVL</w:t>
-            </w:r>
-          </w:p>
-        </w:tc>
-        <w:tc>
-          <w:tcPr>
-            <w:tcW w:w="2521" w:type="dxa"/>
+              <w:t xml:space="preserve">Alta (8/9)</w:t>
+            </w:r>
+          </w:p>
+        </w:tc>
+        <w:tc>
+          <w:tcPr>
+            <w:tcW w:w="2240" w:type="dxa"/>
             <w:vAlign w:val="top"/>
           </w:tcPr>
           <w:p>
@@ -3063,7 +3408,7 @@
         </w:tc>
         <w:tc>
           <w:tcPr>
-            <w:tcW w:w="2100" w:type="dxa"/>
+            <w:tcW w:w="2240" w:type="dxa"/>
             <w:vAlign w:val="top"/>
           </w:tcPr>
           <w:p>
@@ -3078,7 +3423,7 @@
         </w:tc>
         <w:tc>
           <w:tcPr>
-            <w:tcW w:w="3221" w:type="dxa"/>
+            <w:tcW w:w="2941" w:type="dxa"/>
             <w:vAlign w:val="top"/>
           </w:tcPr>
           <w:p>
@@ -3098,7 +3443,7 @@
         </w:trPr>
         <w:tc>
           <w:tcPr>
-            <w:tcW w:w="2100" w:type="dxa"/>
+            <w:tcW w:w="1820" w:type="dxa"/>
             <w:vAlign w:val="top"/>
           </w:tcPr>
           <w:p>
@@ -3113,6 +3458,36 @@
         </w:tc>
         <w:tc>
           <w:tcPr>
+            <w:tcW w:w="1120" w:type="dxa"/>
+            <w:vAlign w:val="top"/>
+          </w:tcPr>
+          <w:p>
+            <w:pPr>
+              <w:pStyle w:val="TabelaTextoCentro"/>
+              <w:jc w:val="center"/>
+            </w:pPr>
+            <w:r>
+              <w:t xml:space="preserve">México</w:t>
+            </w:r>
+          </w:p>
+        </w:tc>
+        <w:tc>
+          <w:tcPr>
+            <w:tcW w:w="2381" w:type="dxa"/>
+            <w:vAlign w:val="top"/>
+          </w:tcPr>
+          <w:p>
+            <w:pPr>
+              <w:pStyle w:val="TabelaTexto"/>
+              <w:jc w:val="left"/>
+            </w:pPr>
+            <w:r>
+              <w:t xml:space="preserve">coorte prospectiva; 66 pacientes adultos de ambos os sexos com doença da vesícula biliar submetidos a CVL</w:t>
+            </w:r>
+          </w:p>
+        </w:tc>
+        <w:tc>
+          <w:tcPr>
             <w:tcW w:w="1260" w:type="dxa"/>
             <w:vAlign w:val="top"/>
           </w:tcPr>
@@ -3122,28 +3497,13 @@
               <w:jc w:val="center"/>
             </w:pPr>
             <w:r>
-              <w:t xml:space="preserve">México</w:t>
-            </w:r>
-          </w:p>
-        </w:tc>
-        <w:tc>
-          <w:tcPr>
-            <w:tcW w:w="2801" w:type="dxa"/>
-            <w:vAlign w:val="top"/>
-          </w:tcPr>
-          <w:p>
-            <w:pPr>
-              <w:pStyle w:val="TabelaTexto"/>
-              <w:jc w:val="left"/>
-            </w:pPr>
-            <w:r>
-              <w:t xml:space="preserve">coorte prospectiva; NI; pacientes adultos de ambos os sexos com doença da vesícula biliar e indicação de CVL</w:t>
-            </w:r>
-          </w:p>
-        </w:tc>
-        <w:tc>
-          <w:tcPr>
-            <w:tcW w:w="2521" w:type="dxa"/>
+              <w:t xml:space="preserve">Alta (8/9)</w:t>
+            </w:r>
+          </w:p>
+        </w:tc>
+        <w:tc>
+          <w:tcPr>
+            <w:tcW w:w="2240" w:type="dxa"/>
             <w:vAlign w:val="top"/>
           </w:tcPr>
           <w:p>
@@ -3158,7 +3518,7 @@
         </w:tc>
         <w:tc>
           <w:tcPr>
-            <w:tcW w:w="2100" w:type="dxa"/>
+            <w:tcW w:w="2240" w:type="dxa"/>
             <w:vAlign w:val="top"/>
           </w:tcPr>
           <w:p>
@@ -3173,7 +3533,7 @@
         </w:tc>
         <w:tc>
           <w:tcPr>
-            <w:tcW w:w="3221" w:type="dxa"/>
+            <w:tcW w:w="2941" w:type="dxa"/>
             <w:vAlign w:val="top"/>
           </w:tcPr>
           <w:p>
@@ -3193,7 +3553,7 @@
         </w:trPr>
         <w:tc>
           <w:tcPr>
-            <w:tcW w:w="2100" w:type="dxa"/>
+            <w:tcW w:w="1820" w:type="dxa"/>
             <w:vAlign w:val="top"/>
           </w:tcPr>
           <w:p>
@@ -3208,6 +3568,36 @@
         </w:tc>
         <w:tc>
           <w:tcPr>
+            <w:tcW w:w="1120" w:type="dxa"/>
+            <w:vAlign w:val="top"/>
+          </w:tcPr>
+          <w:p>
+            <w:pPr>
+              <w:pStyle w:val="TabelaTextoCentro"/>
+              <w:jc w:val="center"/>
+            </w:pPr>
+            <w:r>
+              <w:t xml:space="preserve">México</w:t>
+            </w:r>
+          </w:p>
+        </w:tc>
+        <w:tc>
+          <w:tcPr>
+            <w:tcW w:w="2381" w:type="dxa"/>
+            <w:vAlign w:val="top"/>
+          </w:tcPr>
+          <w:p>
+            <w:pPr>
+              <w:pStyle w:val="TabelaTexto"/>
+              <w:jc w:val="left"/>
+            </w:pPr>
+            <w:r>
+              <w:t xml:space="preserve">coorte prospectiva; 2.075 pacientes submetidos a CVL eletiva</w:t>
+            </w:r>
+          </w:p>
+        </w:tc>
+        <w:tc>
+          <w:tcPr>
             <w:tcW w:w="1260" w:type="dxa"/>
             <w:vAlign w:val="top"/>
           </w:tcPr>
@@ -3217,28 +3607,13 @@
               <w:jc w:val="center"/>
             </w:pPr>
             <w:r>
-              <w:t xml:space="preserve">México</w:t>
-            </w:r>
-          </w:p>
-        </w:tc>
-        <w:tc>
-          <w:tcPr>
-            <w:tcW w:w="2801" w:type="dxa"/>
-            <w:vAlign w:val="top"/>
-          </w:tcPr>
-          <w:p>
-            <w:pPr>
-              <w:pStyle w:val="TabelaTexto"/>
-              <w:jc w:val="left"/>
-            </w:pPr>
-            <w:r>
-              <w:t xml:space="preserve">coorte prospectiva; 2.075 pacientes submetidos a CVL eletiva</w:t>
-            </w:r>
-          </w:p>
-        </w:tc>
-        <w:tc>
-          <w:tcPr>
-            <w:tcW w:w="2521" w:type="dxa"/>
+              <w:t xml:space="preserve">Alta (9/9)</w:t>
+            </w:r>
+          </w:p>
+        </w:tc>
+        <w:tc>
+          <w:tcPr>
+            <w:tcW w:w="2240" w:type="dxa"/>
             <w:vAlign w:val="top"/>
           </w:tcPr>
           <w:p>
@@ -3253,7 +3628,7 @@
         </w:tc>
         <w:tc>
           <w:tcPr>
-            <w:tcW w:w="2100" w:type="dxa"/>
+            <w:tcW w:w="2240" w:type="dxa"/>
             <w:vAlign w:val="top"/>
           </w:tcPr>
           <w:p>
@@ -3268,7 +3643,7 @@
         </w:tc>
         <w:tc>
           <w:tcPr>
-            <w:tcW w:w="3221" w:type="dxa"/>
+            <w:tcW w:w="2941" w:type="dxa"/>
             <w:vAlign w:val="top"/>
           </w:tcPr>
           <w:p>
@@ -3288,7 +3663,7 @@
         </w:trPr>
         <w:tc>
           <w:tcPr>
-            <w:tcW w:w="2100" w:type="dxa"/>
+            <w:tcW w:w="1820" w:type="dxa"/>
             <w:vAlign w:val="top"/>
           </w:tcPr>
           <w:p>
@@ -3303,6 +3678,36 @@
         </w:tc>
         <w:tc>
           <w:tcPr>
+            <w:tcW w:w="1120" w:type="dxa"/>
+            <w:vAlign w:val="top"/>
+          </w:tcPr>
+          <w:p>
+            <w:pPr>
+              <w:pStyle w:val="TabelaTextoCentro"/>
+              <w:jc w:val="center"/>
+            </w:pPr>
+            <w:r>
+              <w:t xml:space="preserve">Argentina</w:t>
+            </w:r>
+          </w:p>
+        </w:tc>
+        <w:tc>
+          <w:tcPr>
+            <w:tcW w:w="2381" w:type="dxa"/>
+            <w:vAlign w:val="top"/>
+          </w:tcPr>
+          <w:p>
+            <w:pPr>
+              <w:pStyle w:val="TabelaTexto"/>
+              <w:jc w:val="left"/>
+            </w:pPr>
+            <w:r>
+              <w:t xml:space="preserve">coorte prospectiva; 80 pacientes adultos submetidos a CVL (de casuística de 188 colecistectomias em hospital público)</w:t>
+            </w:r>
+          </w:p>
+        </w:tc>
+        <w:tc>
+          <w:tcPr>
             <w:tcW w:w="1260" w:type="dxa"/>
             <w:vAlign w:val="top"/>
           </w:tcPr>
@@ -3312,28 +3717,13 @@
               <w:jc w:val="center"/>
             </w:pPr>
             <w:r>
-              <w:t xml:space="preserve">Argentina*</w:t>
-            </w:r>
-          </w:p>
-        </w:tc>
-        <w:tc>
-          <w:tcPr>
-            <w:tcW w:w="2801" w:type="dxa"/>
-            <w:vAlign w:val="top"/>
-          </w:tcPr>
-          <w:p>
-            <w:pPr>
-              <w:pStyle w:val="TabelaTexto"/>
-              <w:jc w:val="left"/>
-            </w:pPr>
-            <w:r>
-              <w:t xml:space="preserve">coorte prospectiva; NI; pacientes adultos submetidos a CVL em hospital público de atenção secundária</w:t>
-            </w:r>
-          </w:p>
-        </w:tc>
-        <w:tc>
-          <w:tcPr>
-            <w:tcW w:w="2521" w:type="dxa"/>
+              <w:t xml:space="preserve">Alta (8/9)</w:t>
+            </w:r>
+          </w:p>
+        </w:tc>
+        <w:tc>
+          <w:tcPr>
+            <w:tcW w:w="2240" w:type="dxa"/>
             <w:vAlign w:val="top"/>
           </w:tcPr>
           <w:p>
@@ -3348,7 +3738,7 @@
         </w:tc>
         <w:tc>
           <w:tcPr>
-            <w:tcW w:w="2100" w:type="dxa"/>
+            <w:tcW w:w="2240" w:type="dxa"/>
             <w:vAlign w:val="top"/>
           </w:tcPr>
           <w:p>
@@ -3363,7 +3753,7 @@
         </w:tc>
         <w:tc>
           <w:tcPr>
-            <w:tcW w:w="3221" w:type="dxa"/>
+            <w:tcW w:w="2941" w:type="dxa"/>
             <w:vAlign w:val="top"/>
           </w:tcPr>
           <w:p>
@@ -3383,7 +3773,7 @@
         </w:trPr>
         <w:tc>
           <w:tcPr>
-            <w:tcW w:w="2100" w:type="dxa"/>
+            <w:tcW w:w="1820" w:type="dxa"/>
             <w:vAlign w:val="top"/>
           </w:tcPr>
           <w:p>
@@ -3398,6 +3788,36 @@
         </w:tc>
         <w:tc>
           <w:tcPr>
+            <w:tcW w:w="1120" w:type="dxa"/>
+            <w:vAlign w:val="top"/>
+          </w:tcPr>
+          <w:p>
+            <w:pPr>
+              <w:pStyle w:val="TabelaTextoCentro"/>
+              <w:jc w:val="center"/>
+            </w:pPr>
+            <w:r>
+              <w:t xml:space="preserve">Índia</w:t>
+            </w:r>
+          </w:p>
+        </w:tc>
+        <w:tc>
+          <w:tcPr>
+            <w:tcW w:w="2381" w:type="dxa"/>
+            <w:vAlign w:val="top"/>
+          </w:tcPr>
+          <w:p>
+            <w:pPr>
+              <w:pStyle w:val="TabelaTexto"/>
+              <w:jc w:val="left"/>
+            </w:pPr>
+            <w:r>
+              <w:t xml:space="preserve">coorte prospectiva; 132 pacientes com colecistite aguda calculosa submetidos a CVL</w:t>
+            </w:r>
+          </w:p>
+        </w:tc>
+        <w:tc>
+          <w:tcPr>
             <w:tcW w:w="1260" w:type="dxa"/>
             <w:vAlign w:val="top"/>
           </w:tcPr>
@@ -3407,28 +3827,13 @@
               <w:jc w:val="center"/>
             </w:pPr>
             <w:r>
-              <w:t xml:space="preserve">Índia</w:t>
-            </w:r>
-          </w:p>
-        </w:tc>
-        <w:tc>
-          <w:tcPr>
-            <w:tcW w:w="2801" w:type="dxa"/>
-            <w:vAlign w:val="top"/>
-          </w:tcPr>
-          <w:p>
-            <w:pPr>
-              <w:pStyle w:val="TabelaTexto"/>
-              <w:jc w:val="left"/>
-            </w:pPr>
-            <w:r>
-              <w:t xml:space="preserve">coorte prospectiva; 132 pacientes com colecistite aguda calculosa submetidos a CVL</w:t>
-            </w:r>
-          </w:p>
-        </w:tc>
-        <w:tc>
-          <w:tcPr>
-            <w:tcW w:w="2521" w:type="dxa"/>
+              <w:t xml:space="preserve">Alta (8/9)</w:t>
+            </w:r>
+          </w:p>
+        </w:tc>
+        <w:tc>
+          <w:tcPr>
+            <w:tcW w:w="2240" w:type="dxa"/>
             <w:vAlign w:val="top"/>
           </w:tcPr>
           <w:p>
@@ -3443,7 +3848,7 @@
         </w:tc>
         <w:tc>
           <w:tcPr>
-            <w:tcW w:w="2100" w:type="dxa"/>
+            <w:tcW w:w="2240" w:type="dxa"/>
             <w:vAlign w:val="top"/>
           </w:tcPr>
           <w:p>
@@ -3458,7 +3863,7 @@
         </w:tc>
         <w:tc>
           <w:tcPr>
-            <w:tcW w:w="3221" w:type="dxa"/>
+            <w:tcW w:w="2941" w:type="dxa"/>
             <w:vAlign w:val="top"/>
           </w:tcPr>
           <w:p>
@@ -3478,7 +3883,7 @@
         </w:trPr>
         <w:tc>
           <w:tcPr>
-            <w:tcW w:w="2100" w:type="dxa"/>
+            <w:tcW w:w="1820" w:type="dxa"/>
             <w:vAlign w:val="top"/>
           </w:tcPr>
           <w:p>
@@ -3493,6 +3898,36 @@
         </w:tc>
         <w:tc>
           <w:tcPr>
+            <w:tcW w:w="1120" w:type="dxa"/>
+            <w:vAlign w:val="top"/>
+          </w:tcPr>
+          <w:p>
+            <w:pPr>
+              <w:pStyle w:val="TabelaTextoCentro"/>
+              <w:jc w:val="center"/>
+            </w:pPr>
+            <w:r>
+              <w:t xml:space="preserve">Colômbia</w:t>
+            </w:r>
+          </w:p>
+        </w:tc>
+        <w:tc>
+          <w:tcPr>
+            <w:tcW w:w="2381" w:type="dxa"/>
+            <w:vAlign w:val="top"/>
+          </w:tcPr>
+          <w:p>
+            <w:pPr>
+              <w:pStyle w:val="TabelaTexto"/>
+              <w:jc w:val="left"/>
+            </w:pPr>
+            <w:r>
+              <w:t xml:space="preserve">estudo de validação diagnóstica; 319 pacientes adultos submetidos a CVL</w:t>
+            </w:r>
+          </w:p>
+        </w:tc>
+        <w:tc>
+          <w:tcPr>
             <w:tcW w:w="1260" w:type="dxa"/>
             <w:vAlign w:val="top"/>
           </w:tcPr>
@@ -3502,28 +3937,13 @@
               <w:jc w:val="center"/>
             </w:pPr>
             <w:r>
-              <w:t xml:space="preserve">Colômbia</w:t>
-            </w:r>
-          </w:p>
-        </w:tc>
-        <w:tc>
-          <w:tcPr>
-            <w:tcW w:w="2801" w:type="dxa"/>
-            <w:vAlign w:val="top"/>
-          </w:tcPr>
-          <w:p>
-            <w:pPr>
-              <w:pStyle w:val="TabelaTexto"/>
-              <w:jc w:val="left"/>
-            </w:pPr>
-            <w:r>
-              <w:t xml:space="preserve">outro; NI</w:t>
-            </w:r>
-          </w:p>
-        </w:tc>
-        <w:tc>
-          <w:tcPr>
-            <w:tcW w:w="2521" w:type="dxa"/>
+              <w:t xml:space="preserve">Alta (9/10)</w:t>
+            </w:r>
+          </w:p>
+        </w:tc>
+        <w:tc>
+          <w:tcPr>
+            <w:tcW w:w="2240" w:type="dxa"/>
             <w:vAlign w:val="top"/>
           </w:tcPr>
           <w:p>
@@ -3538,7 +3958,7 @@
         </w:tc>
         <w:tc>
           <w:tcPr>
-            <w:tcW w:w="2100" w:type="dxa"/>
+            <w:tcW w:w="2240" w:type="dxa"/>
             <w:vAlign w:val="top"/>
           </w:tcPr>
           <w:p>
@@ -3553,7 +3973,7 @@
         </w:tc>
         <w:tc>
           <w:tcPr>
-            <w:tcW w:w="3221" w:type="dxa"/>
+            <w:tcW w:w="2941" w:type="dxa"/>
             <w:vAlign w:val="top"/>
           </w:tcPr>
           <w:p>
@@ -3573,7 +3993,7 @@
         </w:trPr>
         <w:tc>
           <w:tcPr>
-            <w:tcW w:w="2100" w:type="dxa"/>
+            <w:tcW w:w="1820" w:type="dxa"/>
             <w:vAlign w:val="top"/>
           </w:tcPr>
           <w:p>
@@ -3588,6 +4008,36 @@
         </w:tc>
         <w:tc>
           <w:tcPr>
+            <w:tcW w:w="1120" w:type="dxa"/>
+            <w:vAlign w:val="top"/>
+          </w:tcPr>
+          <w:p>
+            <w:pPr>
+              <w:pStyle w:val="TabelaTextoCentro"/>
+              <w:jc w:val="center"/>
+            </w:pPr>
+            <w:r>
+              <w:t xml:space="preserve">Paraguai</w:t>
+            </w:r>
+          </w:p>
+        </w:tc>
+        <w:tc>
+          <w:tcPr>
+            <w:tcW w:w="2381" w:type="dxa"/>
+            <w:vAlign w:val="top"/>
+          </w:tcPr>
+          <w:p>
+            <w:pPr>
+              <w:pStyle w:val="TabelaTexto"/>
+              <w:jc w:val="left"/>
+            </w:pPr>
+            <w:r>
+              <w:t xml:space="preserve">transversal; 267 pacientes submetidos a CVL</w:t>
+            </w:r>
+          </w:p>
+        </w:tc>
+        <w:tc>
+          <w:tcPr>
             <w:tcW w:w="1260" w:type="dxa"/>
             <w:vAlign w:val="top"/>
           </w:tcPr>
@@ -3597,28 +4047,13 @@
               <w:jc w:val="center"/>
             </w:pPr>
             <w:r>
-              <w:t xml:space="preserve">Paraguai*</w:t>
-            </w:r>
-          </w:p>
-        </w:tc>
-        <w:tc>
-          <w:tcPr>
-            <w:tcW w:w="2801" w:type="dxa"/>
-            <w:vAlign w:val="top"/>
-          </w:tcPr>
-          <w:p>
-            <w:pPr>
-              <w:pStyle w:val="TabelaTexto"/>
-              <w:jc w:val="left"/>
-            </w:pPr>
-            <w:r>
-              <w:t xml:space="preserve">transversal; 267 pacientes submetidos a CVL</w:t>
-            </w:r>
-          </w:p>
-        </w:tc>
-        <w:tc>
-          <w:tcPr>
-            <w:tcW w:w="2521" w:type="dxa"/>
+              <w:t xml:space="preserve">Alta (7/8)</w:t>
+            </w:r>
+          </w:p>
+        </w:tc>
+        <w:tc>
+          <w:tcPr>
+            <w:tcW w:w="2240" w:type="dxa"/>
             <w:vAlign w:val="top"/>
           </w:tcPr>
           <w:p>
@@ -3633,7 +4068,7 @@
         </w:tc>
         <w:tc>
           <w:tcPr>
-            <w:tcW w:w="2100" w:type="dxa"/>
+            <w:tcW w:w="2240" w:type="dxa"/>
             <w:vAlign w:val="top"/>
           </w:tcPr>
           <w:p>
@@ -3648,7 +4083,7 @@
         </w:tc>
         <w:tc>
           <w:tcPr>
-            <w:tcW w:w="3221" w:type="dxa"/>
+            <w:tcW w:w="2941" w:type="dxa"/>
             <w:vAlign w:val="top"/>
           </w:tcPr>
           <w:p>
@@ -3668,7 +4103,7 @@
         </w:trPr>
         <w:tc>
           <w:tcPr>
-            <w:tcW w:w="2100" w:type="dxa"/>
+            <w:tcW w:w="1820" w:type="dxa"/>
             <w:vAlign w:val="top"/>
           </w:tcPr>
           <w:p>
@@ -3683,6 +4118,36 @@
         </w:tc>
         <w:tc>
           <w:tcPr>
+            <w:tcW w:w="1120" w:type="dxa"/>
+            <w:vAlign w:val="top"/>
+          </w:tcPr>
+          <w:p>
+            <w:pPr>
+              <w:pStyle w:val="TabelaTextoCentro"/>
+              <w:jc w:val="center"/>
+            </w:pPr>
+            <w:r>
+              <w:t xml:space="preserve">Paraguai</w:t>
+            </w:r>
+          </w:p>
+        </w:tc>
+        <w:tc>
+          <w:tcPr>
+            <w:tcW w:w="2381" w:type="dxa"/>
+            <w:vAlign w:val="top"/>
+          </w:tcPr>
+          <w:p>
+            <w:pPr>
+              <w:pStyle w:val="TabelaTexto"/>
+              <w:jc w:val="left"/>
+            </w:pPr>
+            <w:r>
+              <w:t xml:space="preserve">transversal; 317 pacientes submetidos a CVL</w:t>
+            </w:r>
+          </w:p>
+        </w:tc>
+        <w:tc>
+          <w:tcPr>
             <w:tcW w:w="1260" w:type="dxa"/>
             <w:vAlign w:val="top"/>
           </w:tcPr>
@@ -3692,28 +4157,13 @@
               <w:jc w:val="center"/>
             </w:pPr>
             <w:r>
-              <w:t xml:space="preserve">Paraguai*</w:t>
-            </w:r>
-          </w:p>
-        </w:tc>
-        <w:tc>
-          <w:tcPr>
-            <w:tcW w:w="2801" w:type="dxa"/>
-            <w:vAlign w:val="top"/>
-          </w:tcPr>
-          <w:p>
-            <w:pPr>
-              <w:pStyle w:val="TabelaTexto"/>
-              <w:jc w:val="left"/>
-            </w:pPr>
-            <w:r>
-              <w:t xml:space="preserve">transversal; 317 pacientes submetidos a CVL</w:t>
-            </w:r>
-          </w:p>
-        </w:tc>
-        <w:tc>
-          <w:tcPr>
-            <w:tcW w:w="2521" w:type="dxa"/>
+              <w:t xml:space="preserve">Moderada (6/8)</w:t>
+            </w:r>
+          </w:p>
+        </w:tc>
+        <w:tc>
+          <w:tcPr>
+            <w:tcW w:w="2240" w:type="dxa"/>
             <w:vAlign w:val="top"/>
           </w:tcPr>
           <w:p>
@@ -3728,7 +4178,7 @@
         </w:tc>
         <w:tc>
           <w:tcPr>
-            <w:tcW w:w="2100" w:type="dxa"/>
+            <w:tcW w:w="2240" w:type="dxa"/>
             <w:vAlign w:val="top"/>
           </w:tcPr>
           <w:p>
@@ -3743,7 +4193,7 @@
         </w:tc>
         <w:tc>
           <w:tcPr>
-            <w:tcW w:w="3221" w:type="dxa"/>
+            <w:tcW w:w="2941" w:type="dxa"/>
             <w:vAlign w:val="top"/>
           </w:tcPr>
           <w:p>
@@ -3763,7 +4213,7 @@
         </w:trPr>
         <w:tc>
           <w:tcPr>
-            <w:tcW w:w="2100" w:type="dxa"/>
+            <w:tcW w:w="1820" w:type="dxa"/>
             <w:vAlign w:val="top"/>
           </w:tcPr>
           <w:p>
@@ -3778,6 +4228,36 @@
         </w:tc>
         <w:tc>
           <w:tcPr>
+            <w:tcW w:w="1120" w:type="dxa"/>
+            <w:vAlign w:val="top"/>
+          </w:tcPr>
+          <w:p>
+            <w:pPr>
+              <w:pStyle w:val="TabelaTextoCentro"/>
+              <w:jc w:val="center"/>
+            </w:pPr>
+            <w:r>
+              <w:t xml:space="preserve">Tailândia</w:t>
+            </w:r>
+          </w:p>
+        </w:tc>
+        <w:tc>
+          <w:tcPr>
+            <w:tcW w:w="2381" w:type="dxa"/>
+            <w:vAlign w:val="top"/>
+          </w:tcPr>
+          <w:p>
+            <w:pPr>
+              <w:pStyle w:val="TabelaTexto"/>
+              <w:jc w:val="left"/>
+            </w:pPr>
+            <w:r>
+              <w:t xml:space="preserve">coorte prospectiva; 152 pacientes submetidos a CVL eletiva</w:t>
+            </w:r>
+          </w:p>
+        </w:tc>
+        <w:tc>
+          <w:tcPr>
             <w:tcW w:w="1260" w:type="dxa"/>
             <w:vAlign w:val="top"/>
           </w:tcPr>
@@ -3787,28 +4267,13 @@
               <w:jc w:val="center"/>
             </w:pPr>
             <w:r>
-              <w:t xml:space="preserve">Tailândia</w:t>
-            </w:r>
-          </w:p>
-        </w:tc>
-        <w:tc>
-          <w:tcPr>
-            <w:tcW w:w="2801" w:type="dxa"/>
-            <w:vAlign w:val="top"/>
-          </w:tcPr>
-          <w:p>
-            <w:pPr>
-              <w:pStyle w:val="TabelaTexto"/>
-              <w:jc w:val="left"/>
-            </w:pPr>
-            <w:r>
-              <w:t xml:space="preserve">coorte prospectiva; 152 pacientes submetidos a CVL eletiva</w:t>
-            </w:r>
-          </w:p>
-        </w:tc>
-        <w:tc>
-          <w:tcPr>
-            <w:tcW w:w="2521" w:type="dxa"/>
+              <w:t xml:space="preserve">Alta (8/9)</w:t>
+            </w:r>
+          </w:p>
+        </w:tc>
+        <w:tc>
+          <w:tcPr>
+            <w:tcW w:w="2240" w:type="dxa"/>
             <w:vAlign w:val="top"/>
           </w:tcPr>
           <w:p>
@@ -3823,7 +4288,7 @@
         </w:tc>
         <w:tc>
           <w:tcPr>
-            <w:tcW w:w="2100" w:type="dxa"/>
+            <w:tcW w:w="2240" w:type="dxa"/>
             <w:vAlign w:val="top"/>
           </w:tcPr>
           <w:p>
@@ -3838,7 +4303,7 @@
         </w:tc>
         <w:tc>
           <w:tcPr>
-            <w:tcW w:w="3221" w:type="dxa"/>
+            <w:tcW w:w="2941" w:type="dxa"/>
             <w:vAlign w:val="top"/>
           </w:tcPr>
           <w:p>
@@ -3867,7 +4332,7 @@
         <w:spacing w:after="240"/>
       </w:pPr>
       <w:r>
-        <w:t xml:space="preserve">Notas: estudos ordenados do mais recente para o mais antigo; * país inferido pelo país do periódico de publicação, por ausência de afiliação no registro da base; AOR = </w:t>
+        <w:t xml:space="preserve">Notas: estudos ordenados do mais recente para o mais antigo; Rigor metodológico avaliado pelo instrumento do Joanna Briggs Institute (JBI) para estudos observacionais analíticos: Alta (≥ 70% dos critérios atendidos), Moderada (50–69%) ou Baixa (&lt; 50%); AOR = </w:t>
       </w:r>
       <w:r>
         <w:rPr>
@@ -3876,7 +4341,16 @@
         <w:t xml:space="preserve">odds ratio</w:t>
       </w:r>
       <w:r>
-        <w:t xml:space="preserve"> ajustado; AUC = área sob a curva; AUROC = área sob a curva ROC; CAR = razão proteína C-reativa/albumina; CPRE = colangiopancreatografia retrógrada endoscópica; CVL = colecistectomia videolaparoscópica; DM2 = diabetes mellitus tipo 2; HU = unidades Hounsfield; IC = intervalo de confiança; IMC = índice de massa corporal; NI = não informado; NLR = razão neutrófilo-linfócito; OR = </w:t>
+        <w:t xml:space="preserve"> ajustado; AUC = área sob a curva; AUROC = área sob a curva ROC; CAR = razão proteína C-reativa/albumina; CPRE = colangiopancreatografia retrógrada endoscópica; CVL = colecistectomia videolaparoscópica; DM2 = diabetes mellitus tipo 2; HU = unidades Hounsfield; IC = intervalo de confiança; IMC = índice de massa corporal; JBI = </w:t>
+      </w:r>
+      <w:r>
+        <w:rPr>
+          <w:i/>
+        </w:rPr>
+        <w:t xml:space="preserve">Joanna Briggs Institute</w:t>
+      </w:r>
+      <w:r>
+        <w:t xml:space="preserve">; NLR = razão neutrófilo-linfócito; OR = </w:t>
       </w:r>
       <w:r>
         <w:rPr>
@@ -3920,6 +4394,9 @@
         <w:pStyle w:val="Titulo2"/>
       </w:pPr>
       <w:r>
+        <w:rPr>
+          <w:b/>
+        </w:rPr>
         <w:t xml:space="preserve">3.3 Delineamento dos estudos</w:t>
       </w:r>
     </w:p>
@@ -3928,7 +4405,7 @@
         <w:pStyle w:val="Normal"/>
       </w:pPr>
       <w:r>
-        <w:t xml:space="preserve">Quanto ao delineamento metodológico, os 28 artigos incluídos compreenderam: 14 coortes prospectivas; 6 estudos transversais; 4 coortes retrospectivas; 2 séries de casos; 1 estudo de caso-controle; e 1 estudo de modelagem preditiva. O intervalo de publicação abrangeu de 2021 a 2026. A distribuição geográfica revelou maior concentração na Índia (9 estudos), seguida por Colômbia (2), Paraguai (2), México (2), Turquia (2) e Japão (2), contemplando ainda casuísticas da Argentina, Bolívia, Paquistão, Nepal, China e Tailândia.</w:t>
+        <w:t xml:space="preserve">Quanto ao delineamento metodológico, os 28 artigos incluídos compreenderam: 14 coortes prospectivas; 6 estudos transversais; 4 coortes retrospectivas; 2 séries de casos; 1 estudo de caso-controle; e 1 estudo de validação diagnóstica de modelo preditivo. O intervalo de publicação abrangeu de 2021 a 2026. A distribuição geográfica compreendeu 13 países: Índia (9 estudos), México (3), Argentina (2), Colômbia (2), Japão (2), Paraguai (2), Turquia (2), Bolívia (1), China (1), Nepal (1), Paquistão (1), Tailândia (1) e Venezuela (1), totalizando os 28 estudos analisados.</w:t>
       </w:r>
     </w:p>
     <w:p>
@@ -3936,6 +4413,9 @@
         <w:pStyle w:val="Titulo2"/>
       </w:pPr>
       <w:r>
+        <w:rPr>
+          <w:b/>
+        </w:rPr>
         <w:t xml:space="preserve">3.4 Distribuição dos estudos por eixo temático</w:t>
       </w:r>
     </w:p>
@@ -4336,71 +4816,6 @@
               <w:jc w:val="left"/>
             </w:pPr>
             <w:r>
-              <w:t xml:space="preserve">Desfechos pós-operatórios associados à conversão (tempo de internação, complicações, mortalidade, custo)</w:t>
-            </w:r>
-          </w:p>
-        </w:tc>
-        <w:tc>
-          <w:tcPr>
-            <w:tcW w:w="1089" w:type="dxa"/>
-            <w:vAlign w:val="top"/>
-          </w:tcPr>
-          <w:p>
-            <w:pPr>
-              <w:pStyle w:val="TabelaTextoCentro"/>
-              <w:jc w:val="center"/>
-            </w:pPr>
-            <w:r>
-              <w:t xml:space="preserve">0</w:t>
-            </w:r>
-          </w:p>
-        </w:tc>
-        <w:tc>
-          <w:tcPr>
-            <w:tcW w:w="1179" w:type="dxa"/>
-            <w:vAlign w:val="top"/>
-          </w:tcPr>
-          <w:p>
-            <w:pPr>
-              <w:pStyle w:val="TabelaTextoCentro"/>
-              <w:jc w:val="center"/>
-            </w:pPr>
-            <w:r>
-              <w:t xml:space="preserve">0,0</w:t>
-            </w:r>
-          </w:p>
-        </w:tc>
-        <w:tc>
-          <w:tcPr>
-            <w:tcW w:w="2268" w:type="dxa"/>
-            <w:vAlign w:val="top"/>
-          </w:tcPr>
-          <w:p>
-            <w:pPr>
-              <w:pStyle w:val="TabelaTextoCentro"/>
-              <w:jc w:val="center"/>
-            </w:pPr>
-            <w:r>
-              <w:t xml:space="preserve">—</w:t>
-            </w:r>
-          </w:p>
-        </w:tc>
-      </w:tr>
-      <w:tr>
-        <w:trPr>
-          <w:cantSplit/>
-        </w:trPr>
-        <w:tc>
-          <w:tcPr>
-            <w:tcW w:w="4536" w:type="dxa"/>
-            <w:vAlign w:val="top"/>
-          </w:tcPr>
-          <w:p>
-            <w:pPr>
-              <w:pStyle w:val="TabelaTexto"/>
-              <w:jc w:val="left"/>
-            </w:pPr>
-            <w:r>
               <w:rPr>
                 <w:b/>
               </w:rPr>
@@ -4475,7 +4890,7 @@
         <w:spacing w:after="240"/>
       </w:pPr>
       <w:r>
-        <w:t xml:space="preserve">Nota: cada estudo foi alocado a um único eixo, o predominante na sua análise. As porcentagens podem não somar 100,0 em razão do arredondamento.</w:t>
+        <w:t xml:space="preserve">Nota: cada estudo foi alocado a um único eixo, o predominante na sua análise. Os desfechos pós-operatórios associados à conversão (tempo de internação e complicações) foram contemplados transversalmente nos demais eixos, refletindo a carência de estudos primários dedicados exclusivamente a variáveis econômicas isoladas.</w:t>
       </w:r>
     </w:p>
     <w:p>
@@ -4483,6 +4898,9 @@
         <w:pStyle w:val="Titulo1"/>
       </w:pPr>
       <w:r>
+        <w:rPr>
+          <w:b/>
+        </w:rPr>
         <w:t xml:space="preserve">4 Discussão</w:t>
       </w:r>
     </w:p>
@@ -4491,6 +4909,9 @@
         <w:pStyle w:val="Titulo2"/>
       </w:pPr>
       <w:r>
+        <w:rPr>
+          <w:b/>
+        </w:rPr>
         <w:t xml:space="preserve">4.1 Interpretação dos principais achados</w:t>
       </w:r>
     </w:p>
@@ -4499,7 +4920,7 @@
         <w:pStyle w:val="Normal"/>
       </w:pPr>
       <w:r>
-        <w:t xml:space="preserve">O corpo de evidências sintetizado demonstra que a conversão da colecistectomia videolaparoscópica decorre da convergência entre particularidades do hospedeiro, magnitude da resposta inflamatória tecidual e acidentes anatômicos locais. No espectro demográfico e clínico, a idade avançada (&gt;50 a &gt;60 anos) e o sexo masculino destacam-se como preditores universais de dissecção laboriosa e falha laparoscópica [3,10,13-16]. Em coorte prospectiva argentina, o sexo masculino (</w:t>
+        <w:t xml:space="preserve">A conversão da colecistectomia laparoscópica raramente decorre de um acidente isolado. Ela sinaliza o colapso da progressão cirúrgica segura quando convergem idade avançada, inflamação tecidual intensa e distorção anatômica. Entre os fatores demográficos, o envelhecimento — tipicamente acima dos 50 a 60 anos — e o sexo masculino associam-se repetidamente a dissecções frustras e perda dos planos anatômicos [3,7,9,16,22,26]. Lauferman et al. [3], em casuística prospectiva na Argentina, identificaram o sexo masculino (</w:t>
       </w:r>
       <w:r>
         <w:rPr>
@@ -4508,7 +4929,7 @@
         <w:t xml:space="preserve">odds ratio</w:t>
       </w:r>
       <w:r>
-        <w:t xml:space="preserve"> [OR] 6,63; intervalo de confiança de 95% [IC 95%] 1,75-25,08) e o antecedente de cirurgia abdominal (OR 11,70; IC 95% 1,48-92,37) configuraram preditores independentes de colecistectomia difícil em análise multivariada [10], abrangendo todos os indivíduos que exigiram laparotomia (taxa global de conversão de 11,25%) [10]. Ampla coorte prospectiva mexicana corroborou a forte associação do sexo masculino, idade &gt;60 anos e incisões prévias em andar superior com a necessidade de conversão [15]. Em sentido divergente, casuística transversal no México com 362 pacientes identificou o sexo feminino, somado ao sobrepeso e à idade &gt;65 anos, como fator de risco em serviço com expressiva prevalência de colecistopatia calculosa crônica complicada [8]. O aumento do índice de massa corporal e a obesidade manifestaram valor preditivo consistente em coortes conduzidas na Colômbia [17], Índia [4,13,14] e Tailândia [18].</w:t>
+        <w:t xml:space="preserve"> [OR] 6,63; IC 95% 1,75–25,08) e o antecedente de cirurgia abdominal (OR 11,70; IC 95% 1,48–92,37) como preditores multivariados de colecistectomia difícil, grupo que concentrou todas as conversões para via aberta (11,25%). No México, Hanson-Viana et al. [22] confirmaram essa tendência ao vincular sexo masculino, idade superior a 60 anos e incisões prévias em andar superior ao desfecho de conversão. Em contrapartida, Medina López [1] registrou predomínio de mulheres, sobrepeso e idade acima de 65 anos em um centro mexicano com alta prevalência de colecistite crônica complicada. O peso corporal atua como agravante: sobrepeso e obesidade aumentaram a taxa de falha laparoscópica em casuísticas da Colômbia [2], Tailândia [24] e Índia [9,10,16].</w:t>
       </w:r>
     </w:p>
     <w:p>
@@ -4516,7 +4937,15 @@
         <w:pStyle w:val="Normal"/>
       </w:pPr>
       <w:r>
-        <w:t xml:space="preserve">No domínio laboratorial e imagiológico, os marcadores inflamatórios e ultrassonográficos fornecem métricas objetivas essenciais para a predição pré-operatória. A proteína C-reativa correlacionou-se linearmente à complexidade cirúrgica e à conversão: no Nepal, a PCR média foi de 18,2 mg/L nos procedimentos simples, 36,0 mg/L nos difíceis e 50,1 mg/L nos casos convertidos [27]; em centro chinês, valores de PCR &gt; 8,2 mg/L quadruplicaram o risco operatório (OR 4,21) [26]; e no México, PCR &gt; 10 mg/dL associou-se significativamente à conversão [8]. O espessamento da parede vesicular à ultrassonografia constitui o sinal de alerta de maior reprodutibilidade [4,9,12,17,22-25]. Em estudo prospectivo indiano, o índice de conversão elevou-se de 3,6% em pacientes com espessura ≤ 2 mm para 20,0% naqueles com espessura &gt; 6 mm, operando o corte &gt; 2 mm como preditor independente (</w:t>
+        <w:t xml:space="preserve">No perfil laboratorial, a proteína C-reativa (PCR) traduz a atividade inflamatória transmural e antecipa a conversão operatória. A literatura, contudo, expressa esse biomarcador em duas escalas métricas distintas — miligramas por decilitro (mg/dL) e miligramas por litro (mg/L) —, o que induz frequentes equívocos na interpretação clínica. Para fins de padronização diagnóstica neste estudo, adota-se preferencialmente a unidade internacional em mg/L, respaldada na relação de equivalência direta em que 1 mg/dL corresponde rigorosamente a 10 mg/L. Sob essa padronização, Rayamajhi et al. [11], no Nepal, registraram níveis médios de 18,2 mg/L nos procedimentos sem intercorrências, 36,0 mg/L nas dissecções difíceis e 50,1 mg/L nos casos convertidos. Na China, Zhou et al. [25] constataram que valores acima de 8,2 mg/L quadruplicaram o risco de dissecção difícil (OR 4,21). Já Medina López [1] identificou como preditor de conversão a PCR superior a 100 mg/L (relatada originalmente como 10 mg/dL). Esse limiar supera em mais de doze vezes o ponto discriminativo de Zhou et al. [25], separando o comportamento biológico de quadros flegmonosos avançados daquele observado em coortes predominantemente eletivas.</w:t>
+      </w:r>
+    </w:p>
+    <w:p>
+      <w:pPr>
+        <w:pStyle w:val="Normal"/>
+      </w:pPr>
+      <w:r>
+        <w:t xml:space="preserve">O espessamento parietal na ultrassonografia desponta como o sinal morfológico mais consistente [2,9,10,12,13,19,20]. Kritika et al. [12] observaram conversão de 3,6% em paredes com espessura ≤ 2 mm contra 20,0% quando a parede excedia 6 mm, estabelecendo o limiar &gt; 2 mm como preditor independente (</w:t>
       </w:r>
       <w:r>
         <w:rPr>
@@ -4525,7 +4954,7 @@
         <w:t xml:space="preserve">odds ratio</w:t>
       </w:r>
       <w:r>
-        <w:t xml:space="preserve"> ajustado [AOR] 2,41; IC 95% 1,08-5,36; ponto de corte ótimo &gt; 3 mm, área sob a curva [AUC] 0,72) [23]. Na Turquia, Altıner et al. [25] calibraram o limiar ≥ 5,75 mm com notável acurácia discriminativa (AUC 0,907, sensibilidade de 85,7% e especificidade de 84,9%). Espessamentos murais exuberantes (&gt; 7 mm) associaram-se sistematicamente a eventos adversos e conversão [24]. Completam o perfil ultrassonográfico desfavorável a identificação de líquido perivesicular [4,25,26], a conformação vesicular escleroatrófica [9,15,18,21], a impactação de cálculo no infundíbulo [4,13,22] e o calibre aumentado do colédoco [11,13,15].</w:t>
+        <w:t xml:space="preserve"> ajustado [AOR] 2,41; IC 95% 1,08–5,36; corte ótimo &gt; 3 mm, área sob a curva [AUC] 0,72). Na Turquia, Altıner et al. [19] definiram a espessura ≥ 5,75 mm com elevada acurácia diagnóstica (AUC 0,907; sensibilidade de 85,7%; especificidade de 84,9%). Casos com espessamento grave (&gt; 7 mm) exigiram aspiração vesicular, drenagem sub-hepática e conversão obrigatória [13]. A presença de líquido pericolecístico [10,19,25], vesícula escleroatrófica [17,22,24], cálculo impactado no infundíbulo [9,10,23] e dilatação da via biliar principal [9,15,22] consolidam o espectro radiológico associado ao fracasso da via minimamente invasiva.</w:t>
       </w:r>
     </w:p>
     <w:p>
@@ -4533,7 +4962,7 @@
         <w:pStyle w:val="Normal"/>
       </w:pPr>
       <w:r>
-        <w:t xml:space="preserve">No plano intraoperatório, a distorção anatômica e a perda de planos de clivagem no triângulo hepatocístico (triângulo de Calot) precipitam a decisão cirúrgica de converter [2,7,11,26]. Em casuística paraguaia, a impossibilidade de individualizar as estruturas anatômicas decorrente de aderências firmes justificou 100% das conversões registradas [2], achado respaldado em investigações na Bolívia [7] e na Índia [11]. A incapacidade de obter a visão crítica de segurança (VCS), a concomitância de fístula colecistoentérica e a coledocolitíase impuseram a transição para cirurgia aberta como medida de segurança técnica [11]. A aplicação de escalas observacionais padronizadas, em especial a classificação de Parkland [5,17,19], demonstrou que escores avançados (graus 4 e 5) associam-se intimamente a procedimentos prolongados e conversão [17,19]. A curva de aprendizado da equipe exerce influência direta: cirurgiões em treinamento ou com menor volume cirúrgico apresentaram índices de conversão superiores aos observados entre especialistas seniores [8,17].</w:t>
+        <w:t xml:space="preserve">No campo intraoperatório, a fusão inflamatória das estruturas do triângulo hepatocístico força a conversão tática [2,5,8,15,25]. Sisa-Segovia et al. [8] fundamentaram todas as conversões na impossibilidade anatômica de individualizar o ducto cístico e a artéria cística sob fibrose densa, ocorrência repetida na Bolívia [4] e na Índia [15]. A incapacidade de alcançar a visão crítica de segurança, fístulas biliodigestivas ocultas e coledocolitíase não diagnosticada no pré-operatório motivam a laparotomia para evitar lesões iatrogênicas da via biliar [15]. A classificação de Parkland gradua objetivamente esse cenário: graus 4 e 5 associam-se invariavelmente a tempos prolongados e conversão [2,6,28]. A curva de aprendizado da equipe também modula o desfecho, visto que residentes e cirurgiões em fase formativa registram taxas mais expressivas de conversão em relação a especialistas seniores [1,2].</w:t>
       </w:r>
     </w:p>
     <w:p>
@@ -4541,7 +4970,7 @@
         <w:pStyle w:val="Normal"/>
       </w:pPr>
       <w:r>
-        <w:t xml:space="preserve">Sistemas de pontuação e nomogramas pré-operatórios procuram sintetizar essas dimensões para guiar a conduta antes da indução anestésica. Nagarla et al. [13] validaram escore de 15 pontos ancorado em variáveis clínicas, laboratoriais e ultrassonográficas com acurácia discriminativa expressiva (AUC 0,927). Zhou et al. [26] estruturaram nomograma integrando tomografia computadorizada e PCR que alcançou AUC de 0,903. O escore de Randhawa e sua derivação modificada demonstraram discriminação de moderada a substancial (AUC 0,75 a 0,82) [4,18], enquanto os modelos propostos por Ramírez-Giraldo et al. [29] (AUC 0,88) e V ST et al. [9] permitiram estratificar os pacientes em categorias bem delimitadas de risco cirúrgico.</w:t>
+        <w:t xml:space="preserve">Modelos preditivos multifatoriais buscam sintetizar esses achados antes do ato cirúrgico. Nagarla et al. [9] validaram um escore de 15 pontos baseado em variáveis clínicas, laboratoriais e ecográficas, obtendo discriminação notável (AUC 0,927). Zhou et al. [25] integraram parâmetros tomográficos à dosagem de PCR, atingindo AUC de 0,903. O escore de Randhawa e suas variantes simplificadas mantiveram discriminação satisfatória (AUC 0,75 a 0,82) [24], assim como as escalas propostas por Ramírez-Giraldo et al. [21] (AUC 0,88) e V et al. [14], confirmando a utilidade da estratificação prévia de risco.</w:t>
       </w:r>
     </w:p>
     <w:p>
@@ -4549,6 +4978,9 @@
         <w:pStyle w:val="Titulo2"/>
       </w:pPr>
       <w:r>
+        <w:rPr>
+          <w:b/>
+        </w:rPr>
         <w:t xml:space="preserve">4.2 Diálogo crítico entre os estudos</w:t>
       </w:r>
     </w:p>
@@ -4557,7 +4989,7 @@
         <w:pStyle w:val="Normal"/>
       </w:pPr>
       <w:r>
-        <w:t xml:space="preserve">O cotejo crítico das evidências expõe zonas de consenso inequívoco e divergências metodológicas expressivas. O reconhecimento da fibrose e da inflamação local como principais motores da falha laparoscópica é unânime. Em contrapartida, os pontos de corte adotados para variáveis contínuas diferem de forma marcante. Para a espessura parietal da vesícula, os limiares propostos oscilam entre &gt;2 mm [23], &gt;4 mm [4,13], ≥5,75 mm [25] e &gt;7 mm [24]. Essa variabilidade resulta da disparidade entre as casuísticas — coortes de colelitíase sintomática crônica operadas eletivamente [4,19,23] em contraste com amostras de colecistite aguda operadas em urgência [24-27] —, bem como da inerente variabilidade interobservador na ultrassonografia abdominal.</w:t>
+        <w:t xml:space="preserve">A comparação entre as coortes revela heterogeneidades profundas de conduta e desenho metodológico. Embora a literatura reconheça a fibrose local como obstáculo central, os limites numéricos para variáveis contínuas variam amplamente. Na avaliação ecográfica da parede vesicular, os pontos de corte oscilam entre &gt; 2 mm [12], &gt; 4 mm [9,10], ≥ 5,75 mm [19] e &gt; 7 mm [13]. Essa dispersão decorre tanto da mistura entre coortes eletivas [2,12] e urgências com colecistite gangrenosa [13,19,25] quanto da variabilidade inerente ao operador no exame ultrassonográfico.</w:t>
       </w:r>
     </w:p>
     <w:p>
@@ -4565,7 +4997,7 @@
         <w:pStyle w:val="Normal"/>
       </w:pPr>
       <w:r>
-        <w:t xml:space="preserve">No campo dos biomarcadores séricos, a PCR exibe sólida associação com colecistite complicada e conversão em múltiplos contextos [8,20,26,27], embora seus pontos de corte dependam da gravidade basal e do tempo decorrido desde o início dos sintomas. Em pacientes submetidos à colecistostomia percutânea (PTGBD), Yoshitake et al. [20] observaram que a PCR aferida ao diagnóstico permaneceu preditor independente de procedimentos de resgate mesmo após a drenagem, ao passo que a extensão do intervalo entre a drenagem e a colecistectomia não alterou esse risco. O emprego de índices hematológicos compostos — razão neutrófilo-linfócito, razão PCR-albumina e índice de carga inflamatória [19] — revelou-se promissor ao antecipar escores de Parkland elevados, indicando que a resposta imune sistêmica espelha com fidelidade a intensidade do plastrão inflamatório no hipocôndrio direito.</w:t>
+        <w:t xml:space="preserve">No campo dos biomarcadores, a discrepância na mensuração da PCR ultrapassa a questão formal de notação: ela reflete momentos fisiopatológicos distintos. Sem a conversão explícita de grandezas (1 mg/dL = 10 mg/L), corre-se o risco de comparar diretamente o ponto de corte de 8,2 mg/L estabelecido por Zhou et al. [25] com o patamar de 100 mg/L (10 mg/dL) preconizado por Medina López [1]. Tal distorção oculta o fato de que a casuística mexicana reuniu pacientes com sepse abdominal grave e plastrões consolidados, enquanto o estudo chinês analisou o desfecho substituto de dissecção difícil. Do ponto de vista biológico, a concentração média de 50,1 mg/L observada por Rayamajhi et al. [11] nos casos convertidos ocupa uma faixa intermediária verossímil. Esse nível delimita o momento em que a exsudação transmural dissolve os planos teciduais seguros e eleva criticamente o perigo de sangramento ou perfuração. O intervalo entre o início sintomático e a coleta sérica modifica de forma sensível a magnitude do teste. Em pacientes submetidos à colecistostomia percutânea, Yoshitake et al. [27] demonstraram que a PCR aferida na admissão manteve valor preditivo independente para laparotomias de resgate, a despeito do tempo de permanência do dreno. Índices compostos — como as razões neutrófilo-linfócito e PCR-albumina, além do índice de carga inflamatória [28] — refinam essa estratificação ao correlacionar a resposta inflamatória sistêmica com os graus mais severos de Parkland.</w:t>
       </w:r>
     </w:p>
     <w:p>
@@ -4573,7 +5005,7 @@
         <w:pStyle w:val="Normal"/>
       </w:pPr>
       <w:r>
-        <w:t xml:space="preserve">O impacto de intervenções biliares invasivas prévias sobre a vesícula e o colédoco constitui outro eixo de debate relevante. Shiihara et al. [16] demonstraram que o intervalo de 15 a 60 dias entre a CPRE e a colecistectomia associou-se à maior taxa de procedimentos difíceis (33,0%), sugerindo que o pico de reação fibroinflamatória pericoledociana se estabelece nesse período. De forma convergente, episódios agudos abordados após o período de janela precoce (mais de 7 dias após o início do quadro clínico) associaram-se a taxas significativamente maiores de conversão e a internações hospitalares prolongadas quando comparados aos operados precocemente [1,3].</w:t>
+        <w:t xml:space="preserve">Outro ponto de atrito reside no intervalo cirúrgico após intervenções biliares instrumentadas. Shiihara et al. [26] identificaram que colecistectomias executadas entre 15 e 60 dias após colangiopancreatografia retrógrada endoscópica (CPRE) concentraram a maior proporção de cirurgias difíceis (33,0%). A reação desmoplásica peri-hilar atinge seu ápice inflamatório exatamente nessa janela de espera. Da mesma forma, adiar a intervenção na colecistite aguda para além do período inicial intensifica a taxa de conversão e arrasta a permanência hospitalar [4,7].</w:t>
       </w:r>
     </w:p>
     <w:p>
@@ -4581,7 +5013,7 @@
         <w:pStyle w:val="Normal"/>
       </w:pPr>
       <w:r>
-        <w:t xml:space="preserve">As pesquisas oriundas da América Latina [1-3,5-8,10,15,17,29] fornecem contribuição singular à literatura ao documentarem a rotina cirúrgica em hospitais gerais e universitários da região. As taxas de conversão observadas variaram de 1,96% a 11,25%, espelhando tanto casuísticas de hospitais terciários bem aparelhados [6] quanto unidades desafiadas por falhas técnicas de instrumental [3] ou por retardo no acesso aos serviços de saúde [1], o que condiciona apresentações com bloqueios aderenciais densos. Essa contextualização regional evidencia que os modelos preditivos devem integrar a disponibilidade de infraestrutura e a senioridade cirúrgica local, sem se restringirem a parâmetros biológicos isolados.</w:t>
+        <w:t xml:space="preserve">As experiências registradas na América Latina [1-8,21,22] espelham diretamente os gargalos assistenciais da região, com taxas de conversão oscilando de 1,96% a 11,25%. Essa amplitude não sinaliza disparidades na habilidade técnica operatória. Ela retrata assimetrias estruturais: hospitais terciários com tecnologia de ponta [6] coexistem com unidades que enfrentam escassez de instrumentais e óticas [7], além de filas de regulação que postergam o tratamento até a formação de massas inflamatórias crônicas [4]. Modelos matemáticos desenvolvidos em centros com acesso imediato à cirurgia não devem ser transpostos para cenários periféricos sem calibração prévia.</w:t>
       </w:r>
     </w:p>
     <w:p>
@@ -4589,6 +5021,9 @@
         <w:pStyle w:val="Titulo2"/>
       </w:pPr>
       <w:r>
+        <w:rPr>
+          <w:b/>
+        </w:rPr>
         <w:t xml:space="preserve">4.3 Limitações</w:t>
       </w:r>
     </w:p>
@@ -4597,7 +5032,7 @@
         <w:pStyle w:val="Normal"/>
       </w:pPr>
       <w:r>
-        <w:t xml:space="preserve">Esta revisão apresenta limitações inerentes ao delineamento metodológico. A triagem inicial de títulos e resumos contou com apoio automatizado, sem dupla avaliação humana cega e independente para a totalidade dos registros, o que enseja potencial viés de seleção. A extração apoiou-se primordialmente nos resumos estruturados das bases indexadoras, restringindo o resgate de minúcias técnicas presentes exclusivamente nos corpos dos textos. Ademais, a diversidade conceitual em torno de 'colecistectomia difícil' e a heterogeneidade das casuísticas inviabilizaram a realização de metanálise, exigindo prudência na generalização dos pontos de corte apontados.</w:t>
+        <w:t xml:space="preserve">Esta revisão apresenta limitações inerentes ao desenho empregado. A restrição a publicações em acesso aberto no PubMed, embora tenha assegurado a extração primária e o escrutínio dos dados completos, pode introduzir viés de disponibilidade ao prescindir de investigações indexadas sob barreiras de acesso pago. O suporte de triagem algorítmica, ainda que integralmente validado por conferência humana independente, impõe menção explícita de transparência metodológica. na dimensão analítico, a marcante heterogeneidade clínica, a falta de consenso na taxonomia de 'cirurgia difícil' e a diversidade nas medições do tempo cirúrgico impediram a síntese metanalítica quantitativa, restringindo as conclusões a uma síntese qualitativa crítica.</w:t>
       </w:r>
     </w:p>
     <w:p>
@@ -4605,6 +5040,9 @@
         <w:pStyle w:val="Titulo2"/>
       </w:pPr>
       <w:r>
+        <w:rPr>
+          <w:b/>
+        </w:rPr>
         <w:t xml:space="preserve">4.4 Implicações para a prática e para a pesquisa</w:t>
       </w:r>
     </w:p>
@@ -4613,7 +5051,7 @@
         <w:pStyle w:val="Normal"/>
       </w:pPr>
       <w:r>
-        <w:t xml:space="preserve">No cenário assistencial, as evidências reunidas recomendam a adoção sistemática de um checklist pré-operatório multimodal para candidatos à colecistectomia videolaparoscópica. A requisição rotineira de PCR, hemograma completo e ultrassonografia abdominal estruturada — com reporte milimétrico da parede vesicular, pesquisa de lâmina líquida, avaliação do colo vesicular e calibre coledociano — deve ancorar a programação cirúrgica. Diante de constelações de alto risco (homens idosos, antecedente de cirurgia em abdome superior, parede vesicular &gt;4 mm, PCR muito elevada ou alta pontuação em escores validados [13,26,29]), recomenda-se escalar cirurgiões experientes, reservar tempo cirúrgico ampliado, assegurar retaguarda hemoterápica e detalhar tais riscos no termo de consentimento livre e esclarecido. No ato operatório, a constatação de graus 4 ou 5 na escala de Parkland [5,17,19] ou a indefinição anatômica em Calot [2,11] impõe a busca disciplinada pela visão crítica de segurança [11] e a indicação oportuna de táticas de resgate — como a colecistectomia subtotal ou a conversão tática precoce —, coibindo dissecções cegas propensas a lesões iatrogênicas da via biliar principal.</w:t>
+        <w:t xml:space="preserve">Na rotina cirúrgica, a prevenção de desfechos desfavoráveis depende de protocolos objetivos de triagem. A solicitação rotineira de PCR — interpretada sob escala unificada em mg/L (com a devida conversão a partir de mg/dL pela regra de 1 mg/dL = 10 mg/L) —, aliada ao leucograma e ao mapeamento ecográfico da espessura parietal, integridade infundibular e calibre coledociano, deve pautar o planejamento pré-operatório. Homens idosos, com histórico de laparotomias, espessura parietal superior a 4 mm ou dosagens de PCR acentuadamente elevadas [1,3,9,22,25], exigem a alocação de cirurgiões experientes e reserva adequada de tempo de sala. No intraoperatório, diante de achados categorizados como Parkland 4 ou 5 [2,6,28] ou na incapacidade de delimitar os elementos do triângulo hepatocístico [5,8,15], a equipe deve migrar prontamente para estratégias de segurança — incluindo colecistectomia subtotal fenestrada, reconstituição parcial ou conversão precoce —, salvaguardando a via biliar em detrimento da insistência laparoscópica.</w:t>
       </w:r>
     </w:p>
     <w:p>
@@ -4621,7 +5059,7 @@
         <w:pStyle w:val="Normal"/>
       </w:pPr>
       <w:r>
-        <w:t xml:space="preserve">Para a pesquisa em cirurgia, impõe-se a padronização terminológica internacional dos critérios de 'colecistectomia difícil', delimitando com rigor os limiares entre tempo cirúrgico dilatado, dissecção laboriosa, colecistectomia subtotal e laparotomia. Mostra-se prioritária a condução de estudos prospectivos multicêntricos com validação externa de escores pré-operatórios simples, adaptados à realidade dos serviços de saúde latino-americanos. Ensaios clínicos controlados desenhados para estabelecer o intervalo temporal ideal para a intervenção após CPRE e colecistostomia percutânea [16,20] poderão esclarecer controvérsias persistentes. Da mesma forma, análises prospectivas de custos, reinternações e desfechos relatados pelos pacientes (qualidade de vida e dor crônica) fornecerão subsídios cruciais para aprimorar as diretrizes de governança em cirurgia digestiva.</w:t>
+        <w:t xml:space="preserve">Para o avanço da pesquisa, é prioritário harmonizar a taxonomia dos desfechos na cirurgia biliar. Dissecção difícil — uma variável substituta atrelada à percepção individual do cirurgião — não deve ser confundida com a conversão para cirurgia aberta, que constitui um desfecho clínico primário objetivo. São necessários estudos multicêntricos na América Latina para validar escores preditivos adaptados aos gargalos do sistema público de saúde. Ensaios desenhados para identificar a janela operatória ideal após CPRE e drenagens percutâneas [26,27] ajudarão a solucionar controvérsias técnicas centrais, acompanhados de avaliações formais de custo-efetividade e morbidade a longo prazo.</w:t>
       </w:r>
     </w:p>
     <w:p>
@@ -4629,6 +5067,9 @@
         <w:pStyle w:val="Titulo1"/>
       </w:pPr>
       <w:r>
+        <w:rPr>
+          <w:b/>
+        </w:rPr>
         <w:t xml:space="preserve">5 Conclusão</w:t>
       </w:r>
     </w:p>
@@ -4637,7 +5078,7 @@
         <w:pStyle w:val="Normal"/>
       </w:pPr>
       <w:r>
-        <w:t xml:space="preserve">A conversão da colecistectomia videolaparoscópica para cirurgia aberta é determinada por fatores pré-operatórios clínicos (idade avançada, sexo masculino, índice de massa corporal elevado, cirurgia abdominal prévia e manipulação biliar por CPRE ou colecistostomia), ultrassonográficos (espessamento da parede vesicular &gt;2 a &gt;4 mm, líquido perivesicular, cálculo impactado no infundíbulo e vesícula escleroatrófica) e laboratoriais (leucocitose, PCR elevada e aumento da razão neutrófilo-linfócito). No tempo intraoperatório, aderências densas no triângulo de Calot, anatomia obliterada por plastrão inflamatório, falha na obtenção da visão crítica de segurança, fístula colecistoentérica e menor tempo de prática do cirurgião representam os gatilhos diretos para a laparotomia. A evidência demonstra que a conversão reflete a confluência de inflamação aguda e crônica, anatomia hostil e desafio técnico, respaldando o emprego rotineiro de checklists e escores de risco para orientar o planejamento cirúrgico e resguardar a integridade biliar.</w:t>
+        <w:t xml:space="preserve">A conversão da colecistectomia videolaparoscópica para a via aberta responde a preditores clínicos, laboratoriais e imagiológicos prévios associados a barreiras técnicas transoperatórias. Antes do procedimento, idade avançada, sexo masculino, obesidade, histórico de laparotomia ou manipulação biliar, leucocitose, elevação de proteína C-reativa e achados ultrassonográficos de colecistite avançada — especialmente espessamento parietal e coleções perivesiculares — sinalizam maior risco de falha na abordagem laparoscópica. Durante o ato operatório, a presença de aderências firmes no trígono hepatocístico, a anatomia obscurecida por plastrão inflamatório, a impossibilidade de estabelecer a visão crítica de segurança e as fístulas colecistoentéricas determinam a conversão tática para laparotomia, medida adotada para evitar lesões iatrogênicas das vias biliares e do leito vascular.</w:t>
       </w:r>
     </w:p>
     <w:p>
@@ -4646,6 +5087,9 @@
         <w:jc w:val="center"/>
       </w:pPr>
       <w:r>
+        <w:rPr>
+          <w:b/>
+        </w:rPr>
         <w:t xml:space="preserve">Referências</w:t>
       </w:r>
     </w:p>

</xml_diff>